<commit_message>
Added About page (about.html) – Sufyan
</commit_message>
<xml_diff>
--- a/DF_Assignment_04_Spring_2026.docx
+++ b/DF_Assignment_04_Spring_2026.docx
@@ -1,6 +1,6 @@
 
 <file path=word/document.xml><?xml version="1.0" encoding="utf-8"?>
-<w:document xmlns:wpc="http://schemas.microsoft.com/office/word/2010/wordprocessingCanvas" xmlns:cx="http://schemas.microsoft.com/office/drawing/2014/chartex" xmlns:cx1="http://schemas.microsoft.com/office/drawing/2015/9/8/chartex" xmlns:cx2="http://schemas.microsoft.com/office/drawing/2015/10/21/chartex" xmlns:cx3="http://schemas.microsoft.com/office/drawing/2016/5/9/chartex" xmlns:cx4="http://schemas.microsoft.com/office/drawing/2016/5/10/chartex" xmlns:cx5="http://schemas.microsoft.com/office/drawing/2016/5/11/chartex" xmlns:cx6="http://schemas.microsoft.com/office/drawing/2016/5/12/chartex" xmlns:cx7="http://schemas.microsoft.com/office/drawing/2016/5/13/chartex" xmlns:cx8="http://schemas.microsoft.com/office/drawing/2016/5/14/chartex" xmlns:mc="http://schemas.openxmlformats.org/markup-compatibility/2006" xmlns:aink="http://schemas.microsoft.com/office/drawing/2016/ink" xmlns:am3d="http://schemas.microsoft.com/office/drawing/2017/model3d" xmlns:o="urn:schemas-microsoft-com:office:office" xmlns:oel="http://schemas.microsoft.com/office/2019/extlst" xmlns:r="http://schemas.openxmlformats.org/officeDocument/2006/relationships" xmlns:m="http://schemas.openxmlformats.org/officeDocument/2006/math" xmlns:v="urn:schemas-microsoft-com:vml" xmlns:wp14="http://schemas.microsoft.com/office/word/2010/wordprocessingDrawing" xmlns:wp="http://schemas.openxmlformats.org/drawingml/2006/wordprocessingDrawing" xmlns:w10="urn:schemas-microsoft-com:office:word" xmlns:w="http://schemas.openxmlformats.org/wordprocessingml/2006/main" xmlns:w14="http://schemas.microsoft.com/office/word/2010/wordml" xmlns:w15="http://schemas.microsoft.com/office/word/2012/wordml" xmlns:w16cex="http://schemas.microsoft.com/office/word/2018/wordml/cex" xmlns:w16cid="http://schemas.microsoft.com/office/word/2016/wordml/cid" xmlns:w16="http://schemas.microsoft.com/office/word/2018/wordml" xmlns:w16du="http://schemas.microsoft.com/office/word/2023/wordml/word16du" xmlns:w16sdtdh="http://schemas.microsoft.com/office/word/2020/wordml/sdtdatahash" xmlns:w16sdtfl="http://schemas.microsoft.com/office/word/2024/wordml/sdtformatlock" xmlns:w16se="http://schemas.microsoft.com/office/word/2015/wordml/symex" xmlns:wpg="http://schemas.microsoft.com/office/word/2010/wordprocessingGroup" xmlns:wpi="http://schemas.microsoft.com/office/word/2010/wordprocessingInk" xmlns:wne="http://schemas.microsoft.com/office/word/2006/wordml" xmlns:wps="http://schemas.microsoft.com/office/word/2010/wordprocessingShape" mc:Ignorable="w14 w15 w16se w16cid w16 w16cex w16sdtdh w16sdtfl w16du wp14">
+<w:document xmlns:wpc="http://schemas.microsoft.com/office/word/2010/wordprocessingCanvas" xmlns:cx="http://schemas.microsoft.com/office/drawing/2014/chartex" xmlns:cx1="http://schemas.microsoft.com/office/drawing/2015/9/8/chartex" xmlns:cx2="http://schemas.microsoft.com/office/drawing/2015/10/21/chartex" xmlns:cx3="http://schemas.microsoft.com/office/drawing/2016/5/9/chartex" xmlns:cx4="http://schemas.microsoft.com/office/drawing/2016/5/10/chartex" xmlns:cx5="http://schemas.microsoft.com/office/drawing/2016/5/11/chartex" xmlns:cx6="http://schemas.microsoft.com/office/drawing/2016/5/12/chartex" xmlns:cx7="http://schemas.microsoft.com/office/drawing/2016/5/13/chartex" xmlns:cx8="http://schemas.microsoft.com/office/drawing/2016/5/14/chartex" xmlns:mc="http://schemas.openxmlformats.org/markup-compatibility/2006" xmlns:aink="http://schemas.microsoft.com/office/drawing/2016/ink" xmlns:am3d="http://schemas.microsoft.com/office/drawing/2017/model3d" xmlns:o="urn:schemas-microsoft-com:office:office" xmlns:r="http://schemas.openxmlformats.org/officeDocument/2006/relationships" xmlns:m="http://schemas.openxmlformats.org/officeDocument/2006/math" xmlns:v="urn:schemas-microsoft-com:vml" xmlns:wp14="http://schemas.microsoft.com/office/word/2010/wordprocessingDrawing" xmlns:wp="http://schemas.openxmlformats.org/drawingml/2006/wordprocessingDrawing" xmlns:w10="urn:schemas-microsoft-com:office:word" xmlns:w="http://schemas.openxmlformats.org/wordprocessingml/2006/main" xmlns:w14="http://schemas.microsoft.com/office/word/2010/wordml" xmlns:w15="http://schemas.microsoft.com/office/word/2012/wordml" xmlns:w16cex="http://schemas.microsoft.com/office/word/2018/wordml/cex" xmlns:w16cid="http://schemas.microsoft.com/office/word/2016/wordml/cid" xmlns:w16="http://schemas.microsoft.com/office/word/2018/wordml" xmlns:w16sdtdh="http://schemas.microsoft.com/office/word/2020/wordml/sdtdatahash" xmlns:w16se="http://schemas.microsoft.com/office/word/2015/wordml/symex" xmlns:wpg="http://schemas.microsoft.com/office/word/2010/wordprocessingGroup" xmlns:wpi="http://schemas.microsoft.com/office/word/2010/wordprocessingInk" xmlns:wne="http://schemas.microsoft.com/office/word/2006/wordml" xmlns:wps="http://schemas.microsoft.com/office/word/2010/wordprocessingShape" mc:Ignorable="w14 w15 w16se w16cid w16 w16cex w16sdtdh wp14">
   <w:body>
     <w:p>
       <w:pPr>
@@ -92,7 +92,25 @@
           <w:sz w:val="24"/>
           <w:szCs w:val="24"/>
         </w:rPr>
-        <w:t>Students will design and implement a complete CI/CD pipeline for a containerized web application by integrating a CI workflow (triggered on a Pull Request) with a CD workflow (triggered on a merge/push to the develop branch). The assignment covers creating a fresh GitHub repository, versioning the assignment document, configuring GitHub Environments, managing secrets, and chaining two GitHub Actions workflows.</w:t>
+        <w:t xml:space="preserve">Students will design and implement a complete CI/CD pipeline for a containerized web </w:t>
+      </w:r>
+      <w:r>
+        <w:rPr>
+          <w:rFonts w:ascii="Arial" w:eastAsia="Arial" w:hAnsi="Arial" w:cs="Arial"/>
+          <w:color w:val="000000"/>
+          <w:sz w:val="24"/>
+          <w:szCs w:val="24"/>
+        </w:rPr>
+        <w:t>application by integrating a CI workflow (triggered on a Pull Request) with a CD workflow (triggered on a merge/push to the develop branch). The assignment covers creating a fresh GitHub repository, versioning the assignment document, configuring GitHub En</w:t>
+      </w:r>
+      <w:r>
+        <w:rPr>
+          <w:rFonts w:ascii="Arial" w:eastAsia="Arial" w:hAnsi="Arial" w:cs="Arial"/>
+          <w:color w:val="000000"/>
+          <w:sz w:val="24"/>
+          <w:szCs w:val="24"/>
+        </w:rPr>
+        <w:t>vironments, managing secrets, and chaining two GitHub Actions workflows.</w:t>
       </w:r>
     </w:p>
     <w:p>
@@ -164,7 +182,16 @@
           <w:sz w:val="24"/>
           <w:szCs w:val="24"/>
         </w:rPr>
-        <w:t>Version the assignment question paper inside the GitHub repository.</w:t>
+        <w:t xml:space="preserve">Version the assignment question paper </w:t>
+      </w:r>
+      <w:r>
+        <w:rPr>
+          <w:rFonts w:ascii="Arial" w:eastAsia="Arial" w:hAnsi="Arial" w:cs="Arial"/>
+          <w:color w:val="000000"/>
+          <w:sz w:val="24"/>
+          <w:szCs w:val="24"/>
+        </w:rPr>
+        <w:t>inside the GitHub repository.</w:t>
       </w:r>
     </w:p>
     <w:p>
@@ -251,7 +278,16 @@
           <w:sz w:val="24"/>
           <w:szCs w:val="24"/>
         </w:rPr>
-        <w:t xml:space="preserve">Design and implement a CD workflow triggered by a push event on the </w:t>
+        <w:t>Design and implement a CD workflow triggered by a p</w:t>
+      </w:r>
+      <w:r>
+        <w:rPr>
+          <w:rFonts w:ascii="Arial" w:eastAsia="Arial" w:hAnsi="Arial" w:cs="Arial"/>
+          <w:color w:val="000000"/>
+          <w:sz w:val="24"/>
+          <w:szCs w:val="24"/>
+        </w:rPr>
+        <w:t xml:space="preserve">ush event on the </w:t>
       </w:r>
       <w:r>
         <w:rPr>
@@ -394,7 +430,16 @@
           <w:sz w:val="24"/>
           <w:szCs w:val="24"/>
         </w:rPr>
-        <w:t>New Repository: Students MUST create a brand-new GitHub repository for this assignment. Do NOT reuse or fork any repository from a previous assignment.</w:t>
+        <w:t xml:space="preserve">New Repository: Students MUST create a brand-new GitHub repository for this assignment. Do NOT reuse or fork any </w:t>
+      </w:r>
+      <w:r>
+        <w:rPr>
+          <w:rFonts w:ascii="Arial" w:eastAsia="Arial" w:hAnsi="Arial" w:cs="Arial"/>
+          <w:color w:val="000000"/>
+          <w:sz w:val="24"/>
+          <w:szCs w:val="24"/>
+        </w:rPr>
+        <w:t>repository from a previous assignment.</w:t>
       </w:r>
     </w:p>
     <w:p>
@@ -417,7 +462,16 @@
           <w:sz w:val="24"/>
           <w:szCs w:val="24"/>
         </w:rPr>
-        <w:t>Assignment Document in Repo: The Assignment 04 question paper (this .docx file) must be committed to the root of the repository. Each student must fill in their own details in their respective row in Table 1 (Group Details) directly inside the versioned document.</w:t>
+        <w:t xml:space="preserve">Assignment Document in Repo: The Assignment 04 question paper (this .docx file) must be committed to the root of the repository. Each student must fill in their own details in their respective row in Table 1 </w:t>
+      </w:r>
+      <w:r>
+        <w:rPr>
+          <w:rFonts w:ascii="Arial" w:eastAsia="Arial" w:hAnsi="Arial" w:cs="Arial"/>
+          <w:color w:val="000000"/>
+          <w:sz w:val="24"/>
+          <w:szCs w:val="24"/>
+        </w:rPr>
+        <w:t>(Group Details) directly inside the versioned document.</w:t>
       </w:r>
     </w:p>
     <w:p>
@@ -440,7 +494,16 @@
           <w:sz w:val="24"/>
           <w:szCs w:val="24"/>
         </w:rPr>
-        <w:t>Secrets Ownership: All GitHub secrets (DOCKERHUB_USERNAME, DOCKERHUB_TOKEN, RENDER_DEPLOY_HOOK_URL) must be created by the Team Lead using the TL's own Docker Hub and Render credentials. No team member other than the TL should create or modify secrets.</w:t>
+        <w:t>Secrets Ownership: All GitHub secrets (DOCKERHUB_USERNAME, DOCKERHUB_TOKEN, RENDER_DEPLOY_HOOK_URL) must be created by the Team Lead using the TL's own Docker Hub and Render credentials. No team membe</w:t>
+      </w:r>
+      <w:r>
+        <w:rPr>
+          <w:rFonts w:ascii="Arial" w:eastAsia="Arial" w:hAnsi="Arial" w:cs="Arial"/>
+          <w:color w:val="000000"/>
+          <w:sz w:val="24"/>
+          <w:szCs w:val="24"/>
+        </w:rPr>
+        <w:t>r other than the TL should create or modify secrets.</w:t>
       </w:r>
     </w:p>
     <w:p>
@@ -486,7 +549,16 @@
           <w:sz w:val="24"/>
           <w:szCs w:val="24"/>
         </w:rPr>
-        <w:t>Only the Team Lead will submit the final document to the LMS.</w:t>
+        <w:t xml:space="preserve">Only the Team Lead will submit the final document to the </w:t>
+      </w:r>
+      <w:r>
+        <w:rPr>
+          <w:rFonts w:ascii="Arial" w:eastAsia="Arial" w:hAnsi="Arial" w:cs="Arial"/>
+          <w:color w:val="000000"/>
+          <w:sz w:val="24"/>
+          <w:szCs w:val="24"/>
+        </w:rPr>
+        <w:t>LMS.</w:t>
       </w:r>
     </w:p>
     <w:p>
@@ -614,7 +686,18 @@
           <w:sz w:val="18"/>
           <w:szCs w:val="18"/>
         </w:rPr>
-        <w:t xml:space="preserve"> Each student must fill their own row (including Assigned Page) in the versioned copy inside the repo</w:t>
+        <w:t xml:space="preserve"> Each student must fill their own</w:t>
+      </w:r>
+      <w:r>
+        <w:rPr>
+          <w:rFonts w:ascii="Arial" w:eastAsia="Arial" w:hAnsi="Arial" w:cs="Arial"/>
+          <w:b/>
+          <w:bCs/>
+          <w:color w:val="444444"/>
+          <w:sz w:val="18"/>
+          <w:szCs w:val="18"/>
+        </w:rPr>
+        <w:t xml:space="preserve"> row (including Assigned Page) in the versioned copy inside the repo</w:t>
       </w:r>
     </w:p>
     <w:tbl>
@@ -644,18 +727,12 @@
         <w:gridCol w:w="1653"/>
       </w:tblGrid>
       <w:tr>
-        <w:tblPrEx>
-          <w:tblCellMar>
-            <w:top w:w="0" w:type="dxa"/>
-            <w:bottom w:w="0" w:type="dxa"/>
-          </w:tblCellMar>
-        </w:tblPrEx>
         <w:trPr>
           <w:tblHeader/>
         </w:trPr>
         <w:tc>
           <w:tcPr>
-            <w:tcW w:w="440" w:type="dxa"/>
+            <w:tcW w:w="471" w:type="dxa"/>
             <w:tcBorders>
               <w:top w:val="single" w:sz="6" w:space="0" w:color="ADB9CA"/>
               <w:left w:val="single" w:sz="6" w:space="0" w:color="ADB9CA"/>
@@ -687,7 +764,7 @@
         </w:tc>
         <w:tc>
           <w:tcPr>
-            <w:tcW w:w="1500" w:type="dxa"/>
+            <w:tcW w:w="1424" w:type="dxa"/>
             <w:tcBorders>
               <w:top w:val="single" w:sz="6" w:space="0" w:color="ADB9CA"/>
               <w:left w:val="single" w:sz="6" w:space="0" w:color="ADB9CA"/>
@@ -719,7 +796,7 @@
         </w:tc>
         <w:tc>
           <w:tcPr>
-            <w:tcW w:w="1380" w:type="dxa"/>
+            <w:tcW w:w="1349" w:type="dxa"/>
             <w:tcBorders>
               <w:top w:val="single" w:sz="6" w:space="0" w:color="ADB9CA"/>
               <w:left w:val="single" w:sz="6" w:space="0" w:color="ADB9CA"/>
@@ -751,7 +828,7 @@
         </w:tc>
         <w:tc>
           <w:tcPr>
-            <w:tcW w:w="1300" w:type="dxa"/>
+            <w:tcW w:w="1561" w:type="dxa"/>
             <w:tcBorders>
               <w:top w:val="single" w:sz="6" w:space="0" w:color="ADB9CA"/>
               <w:left w:val="single" w:sz="6" w:space="0" w:color="ADB9CA"/>
@@ -783,7 +860,7 @@
         </w:tc>
         <w:tc>
           <w:tcPr>
-            <w:tcW w:w="1340" w:type="dxa"/>
+            <w:tcW w:w="1306" w:type="dxa"/>
             <w:tcBorders>
               <w:top w:val="single" w:sz="6" w:space="0" w:color="ADB9CA"/>
               <w:left w:val="single" w:sz="6" w:space="0" w:color="ADB9CA"/>
@@ -815,7 +892,7 @@
         </w:tc>
         <w:tc>
           <w:tcPr>
-            <w:tcW w:w="1700" w:type="dxa"/>
+            <w:tcW w:w="1596" w:type="dxa"/>
             <w:tcBorders>
               <w:top w:val="single" w:sz="6" w:space="0" w:color="ADB9CA"/>
               <w:left w:val="single" w:sz="6" w:space="0" w:color="ADB9CA"/>
@@ -847,7 +924,7 @@
         </w:tc>
         <w:tc>
           <w:tcPr>
-            <w:tcW w:w="1700" w:type="dxa"/>
+            <w:tcW w:w="1653" w:type="dxa"/>
             <w:tcBorders>
               <w:top w:val="single" w:sz="6" w:space="0" w:color="ADB9CA"/>
               <w:left w:val="single" w:sz="6" w:space="0" w:color="ADB9CA"/>
@@ -879,15 +956,9 @@
         </w:tc>
       </w:tr>
       <w:tr>
-        <w:tblPrEx>
-          <w:tblCellMar>
-            <w:top w:w="0" w:type="dxa"/>
-            <w:bottom w:w="0" w:type="dxa"/>
-          </w:tblCellMar>
-        </w:tblPrEx>
-        <w:tc>
-          <w:tcPr>
-            <w:tcW w:w="440" w:type="dxa"/>
+        <w:tc>
+          <w:tcPr>
+            <w:tcW w:w="471" w:type="dxa"/>
             <w:tcBorders>
               <w:top w:val="single" w:sz="6" w:space="0" w:color="ADB9CA"/>
               <w:left w:val="single" w:sz="6" w:space="0" w:color="ADB9CA"/>
@@ -917,7 +988,7 @@
         </w:tc>
         <w:tc>
           <w:tcPr>
-            <w:tcW w:w="1500" w:type="dxa"/>
+            <w:tcW w:w="1424" w:type="dxa"/>
             <w:tcBorders>
               <w:top w:val="single" w:sz="6" w:space="0" w:color="ADB9CA"/>
               <w:left w:val="single" w:sz="6" w:space="0" w:color="ADB9CA"/>
@@ -937,7 +1008,7 @@
         </w:tc>
         <w:tc>
           <w:tcPr>
-            <w:tcW w:w="1380" w:type="dxa"/>
+            <w:tcW w:w="1349" w:type="dxa"/>
             <w:tcBorders>
               <w:top w:val="single" w:sz="6" w:space="0" w:color="ADB9CA"/>
               <w:left w:val="single" w:sz="6" w:space="0" w:color="ADB9CA"/>
@@ -957,7 +1028,7 @@
         </w:tc>
         <w:tc>
           <w:tcPr>
-            <w:tcW w:w="1300" w:type="dxa"/>
+            <w:tcW w:w="1561" w:type="dxa"/>
             <w:tcBorders>
               <w:top w:val="single" w:sz="6" w:space="0" w:color="ADB9CA"/>
               <w:left w:val="single" w:sz="6" w:space="0" w:color="ADB9CA"/>
@@ -977,7 +1048,7 @@
         </w:tc>
         <w:tc>
           <w:tcPr>
-            <w:tcW w:w="1340" w:type="dxa"/>
+            <w:tcW w:w="1306" w:type="dxa"/>
             <w:tcBorders>
               <w:top w:val="single" w:sz="6" w:space="0" w:color="ADB9CA"/>
               <w:left w:val="single" w:sz="6" w:space="0" w:color="ADB9CA"/>
@@ -997,7 +1068,7 @@
         </w:tc>
         <w:tc>
           <w:tcPr>
-            <w:tcW w:w="1700" w:type="dxa"/>
+            <w:tcW w:w="1596" w:type="dxa"/>
             <w:tcBorders>
               <w:top w:val="single" w:sz="6" w:space="0" w:color="ADB9CA"/>
               <w:left w:val="single" w:sz="6" w:space="0" w:color="ADB9CA"/>
@@ -1017,7 +1088,7 @@
         </w:tc>
         <w:tc>
           <w:tcPr>
-            <w:tcW w:w="1700" w:type="dxa"/>
+            <w:tcW w:w="1653" w:type="dxa"/>
             <w:tcBorders>
               <w:top w:val="single" w:sz="6" w:space="0" w:color="ADB9CA"/>
               <w:left w:val="single" w:sz="6" w:space="0" w:color="ADB9CA"/>
@@ -1037,15 +1108,9 @@
         </w:tc>
       </w:tr>
       <w:tr>
-        <w:tblPrEx>
-          <w:tblCellMar>
-            <w:top w:w="0" w:type="dxa"/>
-            <w:bottom w:w="0" w:type="dxa"/>
-          </w:tblCellMar>
-        </w:tblPrEx>
-        <w:tc>
-          <w:tcPr>
-            <w:tcW w:w="440" w:type="dxa"/>
+        <w:tc>
+          <w:tcPr>
+            <w:tcW w:w="471" w:type="dxa"/>
             <w:tcBorders>
               <w:top w:val="single" w:sz="6" w:space="0" w:color="ADB9CA"/>
               <w:left w:val="single" w:sz="6" w:space="0" w:color="ADB9CA"/>
@@ -1075,7 +1140,7 @@
         </w:tc>
         <w:tc>
           <w:tcPr>
-            <w:tcW w:w="1500" w:type="dxa"/>
+            <w:tcW w:w="1424" w:type="dxa"/>
             <w:tcBorders>
               <w:top w:val="single" w:sz="6" w:space="0" w:color="ADB9CA"/>
               <w:left w:val="single" w:sz="6" w:space="0" w:color="ADB9CA"/>
@@ -1095,7 +1160,7 @@
         </w:tc>
         <w:tc>
           <w:tcPr>
-            <w:tcW w:w="1380" w:type="dxa"/>
+            <w:tcW w:w="1349" w:type="dxa"/>
             <w:tcBorders>
               <w:top w:val="single" w:sz="6" w:space="0" w:color="ADB9CA"/>
               <w:left w:val="single" w:sz="6" w:space="0" w:color="ADB9CA"/>
@@ -1115,7 +1180,7 @@
         </w:tc>
         <w:tc>
           <w:tcPr>
-            <w:tcW w:w="1300" w:type="dxa"/>
+            <w:tcW w:w="1561" w:type="dxa"/>
             <w:tcBorders>
               <w:top w:val="single" w:sz="6" w:space="0" w:color="ADB9CA"/>
               <w:left w:val="single" w:sz="6" w:space="0" w:color="ADB9CA"/>
@@ -1135,7 +1200,7 @@
         </w:tc>
         <w:tc>
           <w:tcPr>
-            <w:tcW w:w="1340" w:type="dxa"/>
+            <w:tcW w:w="1306" w:type="dxa"/>
             <w:tcBorders>
               <w:top w:val="single" w:sz="6" w:space="0" w:color="ADB9CA"/>
               <w:left w:val="single" w:sz="6" w:space="0" w:color="ADB9CA"/>
@@ -1155,7 +1220,7 @@
         </w:tc>
         <w:tc>
           <w:tcPr>
-            <w:tcW w:w="1700" w:type="dxa"/>
+            <w:tcW w:w="1596" w:type="dxa"/>
             <w:tcBorders>
               <w:top w:val="single" w:sz="6" w:space="0" w:color="ADB9CA"/>
               <w:left w:val="single" w:sz="6" w:space="0" w:color="ADB9CA"/>
@@ -1175,7 +1240,7 @@
         </w:tc>
         <w:tc>
           <w:tcPr>
-            <w:tcW w:w="1700" w:type="dxa"/>
+            <w:tcW w:w="1653" w:type="dxa"/>
             <w:tcBorders>
               <w:top w:val="single" w:sz="6" w:space="0" w:color="ADB9CA"/>
               <w:left w:val="single" w:sz="6" w:space="0" w:color="ADB9CA"/>
@@ -1195,15 +1260,9 @@
         </w:tc>
       </w:tr>
       <w:tr>
-        <w:tblPrEx>
-          <w:tblCellMar>
-            <w:top w:w="0" w:type="dxa"/>
-            <w:bottom w:w="0" w:type="dxa"/>
-          </w:tblCellMar>
-        </w:tblPrEx>
-        <w:tc>
-          <w:tcPr>
-            <w:tcW w:w="440" w:type="dxa"/>
+        <w:tc>
+          <w:tcPr>
+            <w:tcW w:w="471" w:type="dxa"/>
             <w:tcBorders>
               <w:top w:val="single" w:sz="6" w:space="0" w:color="ADB9CA"/>
               <w:left w:val="single" w:sz="6" w:space="0" w:color="ADB9CA"/>
@@ -1233,7 +1292,7 @@
         </w:tc>
         <w:tc>
           <w:tcPr>
-            <w:tcW w:w="1500" w:type="dxa"/>
+            <w:tcW w:w="1424" w:type="dxa"/>
             <w:tcBorders>
               <w:top w:val="single" w:sz="6" w:space="0" w:color="ADB9CA"/>
               <w:left w:val="single" w:sz="6" w:space="0" w:color="ADB9CA"/>
@@ -1253,7 +1312,7 @@
         </w:tc>
         <w:tc>
           <w:tcPr>
-            <w:tcW w:w="1380" w:type="dxa"/>
+            <w:tcW w:w="1349" w:type="dxa"/>
             <w:tcBorders>
               <w:top w:val="single" w:sz="6" w:space="0" w:color="ADB9CA"/>
               <w:left w:val="single" w:sz="6" w:space="0" w:color="ADB9CA"/>
@@ -1273,7 +1332,7 @@
         </w:tc>
         <w:tc>
           <w:tcPr>
-            <w:tcW w:w="1300" w:type="dxa"/>
+            <w:tcW w:w="1561" w:type="dxa"/>
             <w:tcBorders>
               <w:top w:val="single" w:sz="6" w:space="0" w:color="ADB9CA"/>
               <w:left w:val="single" w:sz="6" w:space="0" w:color="ADB9CA"/>
@@ -1293,7 +1352,7 @@
         </w:tc>
         <w:tc>
           <w:tcPr>
-            <w:tcW w:w="1340" w:type="dxa"/>
+            <w:tcW w:w="1306" w:type="dxa"/>
             <w:tcBorders>
               <w:top w:val="single" w:sz="6" w:space="0" w:color="ADB9CA"/>
               <w:left w:val="single" w:sz="6" w:space="0" w:color="ADB9CA"/>
@@ -1313,7 +1372,7 @@
         </w:tc>
         <w:tc>
           <w:tcPr>
-            <w:tcW w:w="1700" w:type="dxa"/>
+            <w:tcW w:w="1596" w:type="dxa"/>
             <w:tcBorders>
               <w:top w:val="single" w:sz="6" w:space="0" w:color="ADB9CA"/>
               <w:left w:val="single" w:sz="6" w:space="0" w:color="ADB9CA"/>
@@ -1333,7 +1392,7 @@
         </w:tc>
         <w:tc>
           <w:tcPr>
-            <w:tcW w:w="1700" w:type="dxa"/>
+            <w:tcW w:w="1653" w:type="dxa"/>
             <w:tcBorders>
               <w:top w:val="single" w:sz="6" w:space="0" w:color="ADB9CA"/>
               <w:left w:val="single" w:sz="6" w:space="0" w:color="ADB9CA"/>
@@ -1353,15 +1412,9 @@
         </w:tc>
       </w:tr>
       <w:tr>
-        <w:tblPrEx>
-          <w:tblCellMar>
-            <w:top w:w="0" w:type="dxa"/>
-            <w:bottom w:w="0" w:type="dxa"/>
-          </w:tblCellMar>
-        </w:tblPrEx>
-        <w:tc>
-          <w:tcPr>
-            <w:tcW w:w="440" w:type="dxa"/>
+        <w:tc>
+          <w:tcPr>
+            <w:tcW w:w="471" w:type="dxa"/>
             <w:tcBorders>
               <w:top w:val="single" w:sz="6" w:space="0" w:color="ADB9CA"/>
               <w:left w:val="single" w:sz="6" w:space="0" w:color="ADB9CA"/>
@@ -1391,7 +1444,7 @@
         </w:tc>
         <w:tc>
           <w:tcPr>
-            <w:tcW w:w="1500" w:type="dxa"/>
+            <w:tcW w:w="1424" w:type="dxa"/>
             <w:tcBorders>
               <w:top w:val="single" w:sz="6" w:space="0" w:color="ADB9CA"/>
               <w:left w:val="single" w:sz="6" w:space="0" w:color="ADB9CA"/>
@@ -1411,7 +1464,7 @@
         </w:tc>
         <w:tc>
           <w:tcPr>
-            <w:tcW w:w="1380" w:type="dxa"/>
+            <w:tcW w:w="1349" w:type="dxa"/>
             <w:tcBorders>
               <w:top w:val="single" w:sz="6" w:space="0" w:color="ADB9CA"/>
               <w:left w:val="single" w:sz="6" w:space="0" w:color="ADB9CA"/>
@@ -1431,7 +1484,7 @@
         </w:tc>
         <w:tc>
           <w:tcPr>
-            <w:tcW w:w="1300" w:type="dxa"/>
+            <w:tcW w:w="1561" w:type="dxa"/>
             <w:tcBorders>
               <w:top w:val="single" w:sz="6" w:space="0" w:color="ADB9CA"/>
               <w:left w:val="single" w:sz="6" w:space="0" w:color="ADB9CA"/>
@@ -1451,7 +1504,7 @@
         </w:tc>
         <w:tc>
           <w:tcPr>
-            <w:tcW w:w="1340" w:type="dxa"/>
+            <w:tcW w:w="1306" w:type="dxa"/>
             <w:tcBorders>
               <w:top w:val="single" w:sz="6" w:space="0" w:color="ADB9CA"/>
               <w:left w:val="single" w:sz="6" w:space="0" w:color="ADB9CA"/>
@@ -1471,7 +1524,7 @@
         </w:tc>
         <w:tc>
           <w:tcPr>
-            <w:tcW w:w="1700" w:type="dxa"/>
+            <w:tcW w:w="1596" w:type="dxa"/>
             <w:tcBorders>
               <w:top w:val="single" w:sz="6" w:space="0" w:color="ADB9CA"/>
               <w:left w:val="single" w:sz="6" w:space="0" w:color="ADB9CA"/>
@@ -1491,7 +1544,7 @@
         </w:tc>
         <w:tc>
           <w:tcPr>
-            <w:tcW w:w="1700" w:type="dxa"/>
+            <w:tcW w:w="1653" w:type="dxa"/>
             <w:tcBorders>
               <w:top w:val="single" w:sz="6" w:space="0" w:color="ADB9CA"/>
               <w:left w:val="single" w:sz="6" w:space="0" w:color="ADB9CA"/>
@@ -1511,15 +1564,9 @@
         </w:tc>
       </w:tr>
       <w:tr>
-        <w:tblPrEx>
-          <w:tblCellMar>
-            <w:top w:w="0" w:type="dxa"/>
-            <w:bottom w:w="0" w:type="dxa"/>
-          </w:tblCellMar>
-        </w:tblPrEx>
-        <w:tc>
-          <w:tcPr>
-            <w:tcW w:w="440" w:type="dxa"/>
+        <w:tc>
+          <w:tcPr>
+            <w:tcW w:w="471" w:type="dxa"/>
             <w:tcBorders>
               <w:top w:val="single" w:sz="6" w:space="0" w:color="ADB9CA"/>
               <w:left w:val="single" w:sz="6" w:space="0" w:color="ADB9CA"/>
@@ -1549,7 +1596,7 @@
         </w:tc>
         <w:tc>
           <w:tcPr>
-            <w:tcW w:w="1500" w:type="dxa"/>
+            <w:tcW w:w="1424" w:type="dxa"/>
             <w:tcBorders>
               <w:top w:val="single" w:sz="6" w:space="0" w:color="ADB9CA"/>
               <w:left w:val="single" w:sz="6" w:space="0" w:color="ADB9CA"/>
@@ -1565,11 +1612,15 @@
             </w:tcMar>
             <w:vAlign w:val="center"/>
           </w:tcPr>
-          <w:p/>
-        </w:tc>
-        <w:tc>
-          <w:tcPr>
-            <w:tcW w:w="1380" w:type="dxa"/>
+          <w:p>
+            <w:r>
+              <w:t>Sufyan</w:t>
+            </w:r>
+          </w:p>
+        </w:tc>
+        <w:tc>
+          <w:tcPr>
+            <w:tcW w:w="1349" w:type="dxa"/>
             <w:tcBorders>
               <w:top w:val="single" w:sz="6" w:space="0" w:color="ADB9CA"/>
               <w:left w:val="single" w:sz="6" w:space="0" w:color="ADB9CA"/>
@@ -1585,11 +1636,15 @@
             </w:tcMar>
             <w:vAlign w:val="center"/>
           </w:tcPr>
-          <w:p/>
-        </w:tc>
-        <w:tc>
-          <w:tcPr>
-            <w:tcW w:w="1300" w:type="dxa"/>
+          <w:p>
+            <w:r>
+              <w:t>sufyan-majeed</w:t>
+            </w:r>
+          </w:p>
+        </w:tc>
+        <w:tc>
+          <w:tcPr>
+            <w:tcW w:w="1561" w:type="dxa"/>
             <w:tcBorders>
               <w:top w:val="single" w:sz="6" w:space="0" w:color="ADB9CA"/>
               <w:left w:val="single" w:sz="6" w:space="0" w:color="ADB9CA"/>
@@ -1605,11 +1660,15 @@
             </w:tcMar>
             <w:vAlign w:val="center"/>
           </w:tcPr>
-          <w:p/>
-        </w:tc>
-        <w:tc>
-          <w:tcPr>
-            <w:tcW w:w="1340" w:type="dxa"/>
+          <w:p>
+            <w:r>
+              <w:t>Member</w:t>
+            </w:r>
+          </w:p>
+        </w:tc>
+        <w:tc>
+          <w:tcPr>
+            <w:tcW w:w="1306" w:type="dxa"/>
             <w:tcBorders>
               <w:top w:val="single" w:sz="6" w:space="0" w:color="ADB9CA"/>
               <w:left w:val="single" w:sz="6" w:space="0" w:color="ADB9CA"/>
@@ -1625,11 +1684,15 @@
             </w:tcMar>
             <w:vAlign w:val="center"/>
           </w:tcPr>
-          <w:p/>
-        </w:tc>
-        <w:tc>
-          <w:tcPr>
-            <w:tcW w:w="1700" w:type="dxa"/>
+          <w:p>
+            <w:r>
+              <w:t>about.html</w:t>
+            </w:r>
+          </w:p>
+        </w:tc>
+        <w:tc>
+          <w:tcPr>
+            <w:tcW w:w="1596" w:type="dxa"/>
             <w:tcBorders>
               <w:top w:val="single" w:sz="6" w:space="0" w:color="ADB9CA"/>
               <w:left w:val="single" w:sz="6" w:space="0" w:color="ADB9CA"/>
@@ -1645,11 +1708,21 @@
             </w:tcMar>
             <w:vAlign w:val="center"/>
           </w:tcPr>
-          <w:p/>
-        </w:tc>
-        <w:tc>
-          <w:tcPr>
-            <w:tcW w:w="1700" w:type="dxa"/>
+          <w:p>
+            <w:r>
+              <w:t>feature/</w:t>
+            </w:r>
+            <w:r>
+              <w:t>sufyan-majeed</w:t>
+            </w:r>
+            <w:r>
+              <w:t>/about</w:t>
+            </w:r>
+          </w:p>
+        </w:tc>
+        <w:tc>
+          <w:tcPr>
+            <w:tcW w:w="1653" w:type="dxa"/>
             <w:tcBorders>
               <w:top w:val="single" w:sz="6" w:space="0" w:color="ADB9CA"/>
               <w:left w:val="single" w:sz="6" w:space="0" w:color="ADB9CA"/>
@@ -1665,7 +1738,11 @@
             </w:tcMar>
             <w:vAlign w:val="center"/>
           </w:tcPr>
-          <w:p/>
+          <w:p>
+            <w:r>
+              <w:t>No</w:t>
+            </w:r>
+          </w:p>
         </w:tc>
       </w:tr>
     </w:tbl>
@@ -1764,7 +1841,14 @@
           <w:rFonts w:ascii="Arial" w:eastAsia="Arial" w:hAnsi="Arial" w:cs="Arial"/>
           <w:color w:val="000000"/>
         </w:rPr>
-        <w:t>Your team is the development crew for TaskFlow, a lightweight task-management web application consisting of five HTML pages. The Team Lead sets up the repository, Dockerfile, shared stylesheet, and the CI/CD pipelines. Each team member is then individually responsible for building one specific page of the application, following the full Git, GitHub, and Docker flow independently.</w:t>
+        <w:t xml:space="preserve">Your team is the development crew for TaskFlow, a lightweight task-management web application consisting of five HTML pages. The Team Lead </w:t>
+      </w:r>
+      <w:r>
+        <w:rPr>
+          <w:rFonts w:ascii="Arial" w:eastAsia="Arial" w:hAnsi="Arial" w:cs="Arial"/>
+          <w:color w:val="000000"/>
+        </w:rPr>
+        <w:t>sets up the repository, Dockerfile, shared stylesheet, and the CI/CD pipelines. Each team member is then individually responsible for building one specific page of the application, following the full Git, GitHub, and Docker flow independently.</w:t>
       </w:r>
     </w:p>
     <w:p>
@@ -1782,7 +1866,14 @@
           <w:rFonts w:ascii="Arial" w:eastAsia="Arial" w:hAnsi="Arial" w:cs="Arial"/>
           <w:color w:val="000000"/>
         </w:rPr>
-        <w:t>The 5 pages of the TaskFlow application and their assignment are defined in Table 3 below. The Team Lead takes Page 1 (Home / Dashboard) in addition to their setup responsibilities.</w:t>
+        <w:t>The 5 pages</w:t>
+      </w:r>
+      <w:r>
+        <w:rPr>
+          <w:rFonts w:ascii="Arial" w:eastAsia="Arial" w:hAnsi="Arial" w:cs="Arial"/>
+          <w:color w:val="000000"/>
+        </w:rPr>
+        <w:t xml:space="preserve"> of the TaskFlow application and their assignment are defined in Table 3 below. The Team Lead takes Page 1 (Home / Dashboard) in addition to their setup responsibilities.</w:t>
       </w:r>
     </w:p>
     <w:p>
@@ -1831,12 +1922,6 @@
         <w:gridCol w:w="4860"/>
       </w:tblGrid>
       <w:tr>
-        <w:tblPrEx>
-          <w:tblCellMar>
-            <w:top w:w="0" w:type="dxa"/>
-            <w:bottom w:w="0" w:type="dxa"/>
-          </w:tblCellMar>
-        </w:tblPrEx>
         <w:trPr>
           <w:tblHeader/>
         </w:trPr>
@@ -1970,12 +2055,6 @@
         </w:tc>
       </w:tr>
       <w:tr>
-        <w:tblPrEx>
-          <w:tblCellMar>
-            <w:top w:w="0" w:type="dxa"/>
-            <w:bottom w:w="0" w:type="dxa"/>
-          </w:tblCellMar>
-        </w:tblPrEx>
         <w:tc>
           <w:tcPr>
             <w:tcW w:w="500" w:type="dxa"/>
@@ -2102,12 +2181,6 @@
         </w:tc>
       </w:tr>
       <w:tr>
-        <w:tblPrEx>
-          <w:tblCellMar>
-            <w:top w:w="0" w:type="dxa"/>
-            <w:bottom w:w="0" w:type="dxa"/>
-          </w:tblCellMar>
-        </w:tblPrEx>
         <w:tc>
           <w:tcPr>
             <w:tcW w:w="500" w:type="dxa"/>
@@ -2252,12 +2325,6 @@
         </w:tc>
       </w:tr>
       <w:tr>
-        <w:tblPrEx>
-          <w:tblCellMar>
-            <w:top w:w="0" w:type="dxa"/>
-            <w:bottom w:w="0" w:type="dxa"/>
-          </w:tblCellMar>
-        </w:tblPrEx>
         <w:tc>
           <w:tcPr>
             <w:tcW w:w="500" w:type="dxa"/>
@@ -2378,18 +2445,21 @@
                 <w:sz w:val="18"/>
                 <w:szCs w:val="18"/>
               </w:rPr>
-              <w:t>A table listing all tasks with columns for title, due date, priority, and status. Includes basic filter buttons (All / Pending / Completed).</w:t>
+              <w:t xml:space="preserve">A table listing all tasks with columns for title, due date, priority, and status. </w:t>
+            </w:r>
+            <w:r>
+              <w:rPr>
+                <w:rFonts w:ascii="Arial" w:eastAsia="Arial" w:hAnsi="Arial" w:cs="Arial"/>
+                <w:color w:val="000000"/>
+                <w:sz w:val="18"/>
+                <w:szCs w:val="18"/>
+              </w:rPr>
+              <w:t>Includes basic filter buttons (All / Pending / Completed).</w:t>
             </w:r>
           </w:p>
         </w:tc>
       </w:tr>
       <w:tr>
-        <w:tblPrEx>
-          <w:tblCellMar>
-            <w:top w:w="0" w:type="dxa"/>
-            <w:bottom w:w="0" w:type="dxa"/>
-          </w:tblCellMar>
-        </w:tblPrEx>
         <w:tc>
           <w:tcPr>
             <w:tcW w:w="500" w:type="dxa"/>
@@ -2516,12 +2586,6 @@
         </w:tc>
       </w:tr>
       <w:tr>
-        <w:tblPrEx>
-          <w:tblCellMar>
-            <w:top w:w="0" w:type="dxa"/>
-            <w:bottom w:w="0" w:type="dxa"/>
-          </w:tblCellMar>
-        </w:tblPrEx>
         <w:tc>
           <w:tcPr>
             <w:tcW w:w="500" w:type="dxa"/>
@@ -2642,7 +2706,16 @@
                 <w:sz w:val="18"/>
                 <w:szCs w:val="18"/>
               </w:rPr>
-              <w:t>A page describing the TaskFlow application, its purpose, and a simple usage guide explaining how to navigate and use the app.</w:t>
+              <w:t xml:space="preserve">A page </w:t>
+            </w:r>
+            <w:r>
+              <w:rPr>
+                <w:rFonts w:ascii="Arial" w:eastAsia="Arial" w:hAnsi="Arial" w:cs="Arial"/>
+                <w:color w:val="000000"/>
+                <w:sz w:val="18"/>
+                <w:szCs w:val="18"/>
+              </w:rPr>
+              <w:t>describing the TaskFlow application, its purpose, and a simple usage guide explaining how to navigate and use the app.</w:t>
             </w:r>
           </w:p>
         </w:tc>
@@ -2665,7 +2738,6 @@
           <w:bCs/>
           <w:color w:val="000000"/>
         </w:rPr>
-        <w:lastRenderedPageBreak/>
         <w:t>Each member's individual workflow:</w:t>
       </w:r>
     </w:p>
@@ -2731,7 +2803,14 @@
           <w:rFonts w:ascii="Arial" w:eastAsia="Arial" w:hAnsi="Arial" w:cs="Arial"/>
           <w:color w:val="000000"/>
         </w:rPr>
-        <w:t>Commit the page file and push the feature branch to GitHub.</w:t>
+        <w:t xml:space="preserve">Commit the page file and push the feature branch to </w:t>
+      </w:r>
+      <w:r>
+        <w:rPr>
+          <w:rFonts w:ascii="Arial" w:eastAsia="Arial" w:hAnsi="Arial" w:cs="Arial"/>
+          <w:color w:val="000000"/>
+        </w:rPr>
+        <w:t>GitHub.</w:t>
       </w:r>
     </w:p>
     <w:p>
@@ -2793,7 +2872,14 @@
           <w:rFonts w:ascii="Arial" w:eastAsia="Arial" w:hAnsi="Arial" w:cs="Arial"/>
           <w:color w:val="000000"/>
         </w:rPr>
-        <w:t>, which triggers the CD workflow and deploys the updated application to Render.</w:t>
+        <w:t>, which triggers the</w:t>
+      </w:r>
+      <w:r>
+        <w:rPr>
+          <w:rFonts w:ascii="Arial" w:eastAsia="Arial" w:hAnsi="Arial" w:cs="Arial"/>
+          <w:color w:val="000000"/>
+        </w:rPr>
+        <w:t xml:space="preserve"> CD workflow and deploys the updated application to Render.</w:t>
       </w:r>
     </w:p>
     <w:p>
@@ -2879,7 +2965,14 @@
           <w:rFonts w:ascii="Arial" w:eastAsia="Arial" w:hAnsi="Arial" w:cs="Arial"/>
           <w:color w:val="000000"/>
         </w:rPr>
-        <w:t>Create a new public GitHub repository named taskflow-cicd (or a name agreed by the team). Do NOT clone or fork any existing repository.</w:t>
+        <w:t xml:space="preserve">Create a new public GitHub repository named </w:t>
+      </w:r>
+      <w:r>
+        <w:rPr>
+          <w:rFonts w:ascii="Arial" w:eastAsia="Arial" w:hAnsi="Arial" w:cs="Arial"/>
+          <w:color w:val="000000"/>
+        </w:rPr>
+        <w:t>taskflow-cicd (or a name agreed by the team). Do NOT clone or fork any existing repository.</w:t>
       </w:r>
     </w:p>
     <w:p>
@@ -2941,7 +3034,14 @@
           <w:rFonts w:ascii="Arial" w:eastAsia="Arial" w:hAnsi="Arial" w:cs="Arial"/>
           <w:color w:val="000000"/>
         </w:rPr>
-        <w:t>: require at least one PR review and require the CI status check to pass before merging.</w:t>
+        <w:t>: require at least one PR review and requi</w:t>
+      </w:r>
+      <w:r>
+        <w:rPr>
+          <w:rFonts w:ascii="Arial" w:eastAsia="Arial" w:hAnsi="Arial" w:cs="Arial"/>
+          <w:color w:val="000000"/>
+        </w:rPr>
+        <w:t>re the CI status check to pass before merging.</w:t>
       </w:r>
     </w:p>
     <w:p>
@@ -2958,7 +3058,14 @@
           <w:rFonts w:ascii="Arial" w:eastAsia="Arial" w:hAnsi="Arial" w:cs="Arial"/>
           <w:color w:val="000000"/>
         </w:rPr>
-        <w:t>Team Lead: Sign up on Render (render.com), create a new Web Service connected to the Docker Hub image repository, and copy the deploy hook URL from the Render service settings. This URL will be stored as the RENDER_DEPLOY_HOOK_URL secret.</w:t>
+        <w:t>Team Lead: Sign up on Render (render.com), create a new Web Service connected to the Docker Hub image repository, and copy the deploy hook URL from the Render service settings. This URL will be stored as the R</w:t>
+      </w:r>
+      <w:r>
+        <w:rPr>
+          <w:rFonts w:ascii="Arial" w:eastAsia="Arial" w:hAnsi="Arial" w:cs="Arial"/>
+          <w:color w:val="000000"/>
+        </w:rPr>
+        <w:t>ENDER_DEPLOY_HOOK_URL secret.</w:t>
       </w:r>
     </w:p>
     <w:p>
@@ -2995,7 +3102,16 @@
           <w:bCs/>
           <w:color w:val="000000"/>
         </w:rPr>
-        <w:t>Required repository structure:</w:t>
+        <w:t>Required repository str</w:t>
+      </w:r>
+      <w:r>
+        <w:rPr>
+          <w:rFonts w:ascii="Arial" w:eastAsia="Arial" w:hAnsi="Arial" w:cs="Arial"/>
+          <w:b/>
+          <w:bCs/>
+          <w:color w:val="000000"/>
+        </w:rPr>
+        <w:t>ucture:</w:t>
       </w:r>
     </w:p>
     <w:p>
@@ -3037,12 +3153,6 @@
         <w:gridCol w:w="6160"/>
       </w:tblGrid>
       <w:tr>
-        <w:tblPrEx>
-          <w:tblCellMar>
-            <w:top w:w="0" w:type="dxa"/>
-            <w:bottom w:w="0" w:type="dxa"/>
-          </w:tblCellMar>
-        </w:tblPrEx>
         <w:trPr>
           <w:tblHeader/>
         </w:trPr>
@@ -3112,12 +3222,6 @@
         </w:tc>
       </w:tr>
       <w:tr>
-        <w:tblPrEx>
-          <w:tblCellMar>
-            <w:top w:w="0" w:type="dxa"/>
-            <w:bottom w:w="0" w:type="dxa"/>
-          </w:tblCellMar>
-        </w:tblPrEx>
         <w:tc>
           <w:tcPr>
             <w:tcW w:w="3200" w:type="dxa"/>
@@ -3200,12 +3304,6 @@
         </w:tc>
       </w:tr>
       <w:tr>
-        <w:tblPrEx>
-          <w:tblCellMar>
-            <w:top w:w="0" w:type="dxa"/>
-            <w:bottom w:w="0" w:type="dxa"/>
-          </w:tblCellMar>
-        </w:tblPrEx>
         <w:tc>
           <w:tcPr>
             <w:tcW w:w="3200" w:type="dxa"/>
@@ -3288,12 +3386,6 @@
         </w:tc>
       </w:tr>
       <w:tr>
-        <w:tblPrEx>
-          <w:tblCellMar>
-            <w:top w:w="0" w:type="dxa"/>
-            <w:bottom w:w="0" w:type="dxa"/>
-          </w:tblCellMar>
-        </w:tblPrEx>
         <w:tc>
           <w:tcPr>
             <w:tcW w:w="3200" w:type="dxa"/>
@@ -3376,12 +3468,6 @@
         </w:tc>
       </w:tr>
       <w:tr>
-        <w:tblPrEx>
-          <w:tblCellMar>
-            <w:top w:w="0" w:type="dxa"/>
-            <w:bottom w:w="0" w:type="dxa"/>
-          </w:tblCellMar>
-        </w:tblPrEx>
         <w:tc>
           <w:tcPr>
             <w:tcW w:w="3200" w:type="dxa"/>
@@ -3464,12 +3550,6 @@
         </w:tc>
       </w:tr>
       <w:tr>
-        <w:tblPrEx>
-          <w:tblCellMar>
-            <w:top w:w="0" w:type="dxa"/>
-            <w:bottom w:w="0" w:type="dxa"/>
-          </w:tblCellMar>
-        </w:tblPrEx>
         <w:tc>
           <w:tcPr>
             <w:tcW w:w="3200" w:type="dxa"/>
@@ -3552,12 +3632,6 @@
         </w:tc>
       </w:tr>
       <w:tr>
-        <w:tblPrEx>
-          <w:tblCellMar>
-            <w:top w:w="0" w:type="dxa"/>
-            <w:bottom w:w="0" w:type="dxa"/>
-          </w:tblCellMar>
-        </w:tblPrEx>
         <w:tc>
           <w:tcPr>
             <w:tcW w:w="3200" w:type="dxa"/>
@@ -3640,12 +3714,6 @@
         </w:tc>
       </w:tr>
       <w:tr>
-        <w:tblPrEx>
-          <w:tblCellMar>
-            <w:top w:w="0" w:type="dxa"/>
-            <w:bottom w:w="0" w:type="dxa"/>
-          </w:tblCellMar>
-        </w:tblPrEx>
         <w:tc>
           <w:tcPr>
             <w:tcW w:w="3200" w:type="dxa"/>
@@ -3710,12 +3778,6 @@
         </w:tc>
       </w:tr>
       <w:tr>
-        <w:tblPrEx>
-          <w:tblCellMar>
-            <w:top w:w="0" w:type="dxa"/>
-            <w:bottom w:w="0" w:type="dxa"/>
-          </w:tblCellMar>
-        </w:tblPrEx>
         <w:tc>
           <w:tcPr>
             <w:tcW w:w="3200" w:type="dxa"/>
@@ -3789,12 +3851,6 @@
         </w:tc>
       </w:tr>
       <w:tr>
-        <w:tblPrEx>
-          <w:tblCellMar>
-            <w:top w:w="0" w:type="dxa"/>
-            <w:bottom w:w="0" w:type="dxa"/>
-          </w:tblCellMar>
-        </w:tblPrEx>
         <w:tc>
           <w:tcPr>
             <w:tcW w:w="3200" w:type="dxa"/>
@@ -3868,12 +3924,6 @@
         </w:tc>
       </w:tr>
       <w:tr>
-        <w:tblPrEx>
-          <w:tblCellMar>
-            <w:top w:w="0" w:type="dxa"/>
-            <w:bottom w:w="0" w:type="dxa"/>
-          </w:tblCellMar>
-        </w:tblPrEx>
         <w:tc>
           <w:tcPr>
             <w:tcW w:w="3200" w:type="dxa"/>
@@ -3959,7 +4009,18 @@
           <w:sz w:val="28"/>
           <w:szCs w:val="28"/>
         </w:rPr>
-        <w:t>GITHUB DEVELOPMENT ENVIRONMENT &amp; SECRETS (MANDATORY)</w:t>
+        <w:t xml:space="preserve">GITHUB </w:t>
+      </w:r>
+      <w:r>
+        <w:rPr>
+          <w:rFonts w:ascii="Arial" w:eastAsia="Arial" w:hAnsi="Arial" w:cs="Arial"/>
+          <w:b/>
+          <w:bCs/>
+          <w:color w:val="1F3864"/>
+          <w:sz w:val="28"/>
+          <w:szCs w:val="28"/>
+        </w:rPr>
+        <w:t>DEVELOPMENT ENVIRONMENT &amp; SECRETS (MANDATORY)</w:t>
       </w:r>
     </w:p>
     <w:p>
@@ -4094,7 +4155,18 @@
           <w:sz w:val="18"/>
           <w:szCs w:val="18"/>
         </w:rPr>
-        <w:t>Table 4: Secrets Configuration Reference</w:t>
+        <w:t xml:space="preserve">Table 4: Secrets </w:t>
+      </w:r>
+      <w:r>
+        <w:rPr>
+          <w:rFonts w:ascii="Arial" w:eastAsia="Arial" w:hAnsi="Arial" w:cs="Arial"/>
+          <w:b/>
+          <w:bCs/>
+          <w:color w:val="444444"/>
+          <w:sz w:val="18"/>
+          <w:szCs w:val="18"/>
+        </w:rPr>
+        <w:t>Configuration Reference</w:t>
       </w:r>
     </w:p>
     <w:tbl>
@@ -4120,12 +4192,6 @@
         <w:gridCol w:w="4420"/>
       </w:tblGrid>
       <w:tr>
-        <w:tblPrEx>
-          <w:tblCellMar>
-            <w:top w:w="0" w:type="dxa"/>
-            <w:bottom w:w="0" w:type="dxa"/>
-          </w:tblCellMar>
-        </w:tblPrEx>
         <w:trPr>
           <w:tblHeader/>
         </w:trPr>
@@ -4227,12 +4293,6 @@
         </w:tc>
       </w:tr>
       <w:tr>
-        <w:tblPrEx>
-          <w:tblCellMar>
-            <w:top w:w="0" w:type="dxa"/>
-            <w:bottom w:w="0" w:type="dxa"/>
-          </w:tblCellMar>
-        </w:tblPrEx>
         <w:trPr>
           <w:trHeight w:val="427"/>
         </w:trPr>
@@ -4336,12 +4396,6 @@
         </w:tc>
       </w:tr>
       <w:tr>
-        <w:tblPrEx>
-          <w:tblCellMar>
-            <w:top w:w="0" w:type="dxa"/>
-            <w:bottom w:w="0" w:type="dxa"/>
-          </w:tblCellMar>
-        </w:tblPrEx>
         <w:tc>
           <w:tcPr>
             <w:tcW w:w="2000" w:type="dxa"/>
@@ -4454,12 +4508,6 @@
         </w:tc>
       </w:tr>
       <w:tr>
-        <w:tblPrEx>
-          <w:tblCellMar>
-            <w:top w:w="0" w:type="dxa"/>
-            <w:bottom w:w="0" w:type="dxa"/>
-          </w:tblCellMar>
-        </w:tblPrEx>
         <w:tc>
           <w:tcPr>
             <w:tcW w:w="2000" w:type="dxa"/>
@@ -4571,7 +4619,7 @@
           <w:sz w:val="18"/>
           <w:szCs w:val="18"/>
         </w:rPr>
-        <w:t xml:space="preserve">All three secrets must be created by the Team Lead, as the TL is the repository admin and the credentials belong to them. DOCKERHUB_USERNAME and DOCKERHUB_TOKEN must be the Team Lead's own Docker Hub credentials, added as repository-level secrets (Settings → Secrets and variables → Actions → Repository secrets). RENDER_DEPLOY_HOOK_URL is obtained from the Render web service set up by the Team Lead and must be added as an environment-level secret inside the </w:t>
+        <w:t>All three secrets must be created by the Team Lead, as the TL is the repository admin and the credentials belong to them. DOCKERHUB_USERNAME and DOCKERHUB_TOKEN must be the Team Lead's own Docker Hub credentials, added as repository-level secrets (Settings</w:t>
       </w:r>
       <w:r>
         <w:rPr>
@@ -4580,7 +4628,7 @@
           <w:sz w:val="18"/>
           <w:szCs w:val="18"/>
         </w:rPr>
-        <w:t>“development”</w:t>
+        <w:t xml:space="preserve"> → Secrets and variables → Actions → Repository secrets). RENDER_DEPLOY_HOOK_URL is obtained from the Render web service set up by the Team Lead and must be added as an environment-level secret inside the </w:t>
       </w:r>
       <w:r>
         <w:rPr>
@@ -4589,7 +4637,25 @@
           <w:sz w:val="18"/>
           <w:szCs w:val="18"/>
         </w:rPr>
-        <w:t xml:space="preserve"> environment (Settings → Environments → development → Add secret).</w:t>
+        <w:t>“development”</w:t>
+      </w:r>
+      <w:r>
+        <w:rPr>
+          <w:rFonts w:ascii="Arial" w:eastAsia="Arial" w:hAnsi="Arial" w:cs="Arial"/>
+          <w:color w:val="555555"/>
+          <w:sz w:val="18"/>
+          <w:szCs w:val="18"/>
+        </w:rPr>
+        <w:t xml:space="preserve"> environment (Settings → Environments </w:t>
+      </w:r>
+      <w:r>
+        <w:rPr>
+          <w:rFonts w:ascii="Arial" w:eastAsia="Arial" w:hAnsi="Arial" w:cs="Arial"/>
+          <w:color w:val="555555"/>
+          <w:sz w:val="18"/>
+          <w:szCs w:val="18"/>
+        </w:rPr>
+        <w:t>→ development → Add secret).</w:t>
       </w:r>
     </w:p>
     <w:p>
@@ -4681,7 +4747,14 @@
           <w:rFonts w:ascii="Arial" w:eastAsia="Arial" w:hAnsi="Arial" w:cs="Arial"/>
           <w:color w:val="000000"/>
         </w:rPr>
-        <w:t>Step 1 – Checkout: Check out the repository code using actions/checkout.</w:t>
+        <w:t xml:space="preserve">Step 1 – </w:t>
+      </w:r>
+      <w:r>
+        <w:rPr>
+          <w:rFonts w:ascii="Arial" w:eastAsia="Arial" w:hAnsi="Arial" w:cs="Arial"/>
+          <w:color w:val="000000"/>
+        </w:rPr>
+        <w:t>Checkout: Check out the repository code using actions/checkout.</w:t>
       </w:r>
     </w:p>
     <w:p>
@@ -4715,7 +4788,14 @@
           <w:rFonts w:ascii="Arial" w:eastAsia="Arial" w:hAnsi="Arial" w:cs="Arial"/>
           <w:color w:val="000000"/>
         </w:rPr>
-        <w:t>Step 3 – Build Image: Build the Docker image from the Dockerfile in the project root.</w:t>
+        <w:t xml:space="preserve">Step 3 – Build Image: Build the Docker image from the </w:t>
+      </w:r>
+      <w:r>
+        <w:rPr>
+          <w:rFonts w:ascii="Arial" w:eastAsia="Arial" w:hAnsi="Arial" w:cs="Arial"/>
+          <w:color w:val="000000"/>
+        </w:rPr>
+        <w:t>Dockerfile in the project root.</w:t>
       </w:r>
     </w:p>
     <w:p>
@@ -4853,7 +4933,18 @@
           <w:sz w:val="28"/>
           <w:szCs w:val="28"/>
         </w:rPr>
-        <w:t>CD PIPELINE REQUIREMENTS  (.github/workflows/cd.yml)</w:t>
+        <w:t>CD PIPELINE R</w:t>
+      </w:r>
+      <w:r>
+        <w:rPr>
+          <w:rFonts w:ascii="Arial" w:eastAsia="Arial" w:hAnsi="Arial" w:cs="Arial"/>
+          <w:b/>
+          <w:bCs/>
+          <w:color w:val="1F3864"/>
+          <w:sz w:val="28"/>
+          <w:szCs w:val="28"/>
+        </w:rPr>
+        <w:t>EQUIREMENTS  (.github/workflows/cd.yml)</w:t>
       </w:r>
     </w:p>
     <w:p>
@@ -4922,7 +5013,14 @@
           <w:rFonts w:ascii="Arial" w:eastAsia="Arial" w:hAnsi="Arial" w:cs="Arial"/>
           <w:color w:val="000000"/>
         </w:rPr>
-        <w:t>The CD workflow must include the following steps in order:</w:t>
+        <w:t>The CD workflow must include the following steps</w:t>
+      </w:r>
+      <w:r>
+        <w:rPr>
+          <w:rFonts w:ascii="Arial" w:eastAsia="Arial" w:hAnsi="Arial" w:cs="Arial"/>
+          <w:color w:val="000000"/>
+        </w:rPr>
+        <w:t xml:space="preserve"> in order:</w:t>
       </w:r>
     </w:p>
     <w:p>
@@ -4973,7 +5071,14 @@
           <w:rFonts w:ascii="Arial" w:eastAsia="Arial" w:hAnsi="Arial" w:cs="Arial"/>
           <w:color w:val="000000"/>
         </w:rPr>
-        <w:t>Step 3 – Deploy: Send an HTTP POST request to the Render deploy hook URL using curl:</w:t>
+        <w:t>Step 3</w:t>
+      </w:r>
+      <w:r>
+        <w:rPr>
+          <w:rFonts w:ascii="Arial" w:eastAsia="Arial" w:hAnsi="Arial" w:cs="Arial"/>
+          <w:color w:val="000000"/>
+        </w:rPr>
+        <w:t xml:space="preserve"> – Deploy: Send an HTTP POST request to the Render deploy hook URL using curl:</w:t>
       </w:r>
     </w:p>
     <w:p>
@@ -5043,7 +5148,14 @@
           <w:rFonts w:ascii="Arial" w:eastAsia="Arial" w:hAnsi="Arial" w:cs="Arial"/>
           <w:color w:val="000000"/>
         </w:rPr>
-        <w:t>The CD workflow file must declare runs-on: ubuntu-latest.</w:t>
+        <w:t>The CD wor</w:t>
+      </w:r>
+      <w:r>
+        <w:rPr>
+          <w:rFonts w:ascii="Arial" w:eastAsia="Arial" w:hAnsi="Arial" w:cs="Arial"/>
+          <w:color w:val="000000"/>
+        </w:rPr>
+        <w:t>kflow file must declare runs-on: ubuntu-latest.</w:t>
       </w:r>
     </w:p>
     <w:p>
@@ -5141,12 +5253,6 @@
         <w:gridCol w:w="4380"/>
       </w:tblGrid>
       <w:tr>
-        <w:tblPrEx>
-          <w:tblCellMar>
-            <w:top w:w="0" w:type="dxa"/>
-            <w:bottom w:w="0" w:type="dxa"/>
-          </w:tblCellMar>
-        </w:tblPrEx>
         <w:trPr>
           <w:tblHeader/>
         </w:trPr>
@@ -5242,18 +5348,23 @@
                 <w:sz w:val="18"/>
                 <w:szCs w:val="18"/>
               </w:rPr>
-              <w:t>Key Steps</w:t>
+              <w:t xml:space="preserve">Key </w:t>
+            </w:r>
+            <w:r>
+              <w:rPr>
+                <w:rFonts w:ascii="Arial" w:eastAsia="Arial" w:hAnsi="Arial" w:cs="Arial"/>
+                <w:b/>
+                <w:bCs/>
+                <w:color w:val="FFFFFF"/>
+                <w:sz w:val="18"/>
+                <w:szCs w:val="18"/>
+              </w:rPr>
+              <w:t>Steps</w:t>
             </w:r>
           </w:p>
         </w:tc>
       </w:tr>
       <w:tr>
-        <w:tblPrEx>
-          <w:tblCellMar>
-            <w:top w:w="0" w:type="dxa"/>
-            <w:bottom w:w="0" w:type="dxa"/>
-          </w:tblCellMar>
-        </w:tblPrEx>
         <w:tc>
           <w:tcPr>
             <w:tcW w:w="1600" w:type="dxa"/>
@@ -5366,12 +5477,6 @@
         </w:tc>
       </w:tr>
       <w:tr>
-        <w:tblPrEx>
-          <w:tblCellMar>
-            <w:top w:w="0" w:type="dxa"/>
-            <w:bottom w:w="0" w:type="dxa"/>
-          </w:tblCellMar>
-        </w:tblPrEx>
         <w:tc>
           <w:tcPr>
             <w:tcW w:w="1600" w:type="dxa"/>
@@ -5602,7 +5707,14 @@
           <w:rFonts w:ascii="Arial" w:eastAsia="Arial" w:hAnsi="Arial" w:cs="Arial"/>
           <w:color w:val="000000"/>
         </w:rPr>
-        <w:t xml:space="preserve">Commit the Assignment 04 question paper (.docx) to the root of the repository. Every team member must fill in their details </w:t>
+        <w:t>Commit the Assignment 04 question paper (.docx) to the root of the repository. Every t</w:t>
+      </w:r>
+      <w:r>
+        <w:rPr>
+          <w:rFonts w:ascii="Arial" w:eastAsia="Arial" w:hAnsi="Arial" w:cs="Arial"/>
+          <w:color w:val="000000"/>
+        </w:rPr>
+        <w:t xml:space="preserve">eam member must fill in their details </w:t>
       </w:r>
       <w:r>
         <w:rPr>
@@ -5706,7 +5818,14 @@
           <w:rFonts w:ascii="Arial" w:eastAsia="Arial" w:hAnsi="Arial" w:cs="Arial"/>
           <w:color w:val="000000"/>
         </w:rPr>
-        <w:t xml:space="preserve">Team Lead: Apply Branch Protection Rules on the </w:t>
+        <w:t>Team Lead: Apply Branch Protection Rules on th</w:t>
+      </w:r>
+      <w:r>
+        <w:rPr>
+          <w:rFonts w:ascii="Arial" w:eastAsia="Arial" w:hAnsi="Arial" w:cs="Arial"/>
+          <w:color w:val="000000"/>
+        </w:rPr>
+        <w:t xml:space="preserve">e </w:t>
       </w:r>
       <w:r>
         <w:rPr>
@@ -5827,7 +5946,14 @@
           <w:rFonts w:ascii="Arial" w:eastAsia="Arial" w:hAnsi="Arial" w:cs="Arial"/>
           <w:color w:val="000000"/>
         </w:rPr>
-        <w:t>Each team member must independently complete the following full DevOps flow for their assigned page (refer to Table 3):</w:t>
+        <w:t>Each team membe</w:t>
+      </w:r>
+      <w:r>
+        <w:rPr>
+          <w:rFonts w:ascii="Arial" w:eastAsia="Arial" w:hAnsi="Arial" w:cs="Arial"/>
+          <w:color w:val="000000"/>
+        </w:rPr>
+        <w:t>r must independently complete the following full DevOps flow for their assigned page (refer to Table 3):</w:t>
       </w:r>
     </w:p>
     <w:p>
@@ -5881,7 +6007,15 @@
           <w:sz w:val="19"/>
           <w:szCs w:val="19"/>
         </w:rPr>
-        <w:t>Commit the page and push the feature branch to GitHub</w:t>
+        <w:t xml:space="preserve">Commit the </w:t>
+      </w:r>
+      <w:r>
+        <w:rPr>
+          <w:rFonts w:ascii="Arial" w:eastAsia="Arial" w:hAnsi="Arial" w:cs="Arial"/>
+          <w:sz w:val="19"/>
+          <w:szCs w:val="19"/>
+        </w:rPr>
+        <w:t>page and push the feature branch to GitHub</w:t>
       </w:r>
     </w:p>
     <w:p>
@@ -5982,7 +6116,14 @@
           <w:rFonts w:ascii="Arial" w:eastAsia="Arial" w:hAnsi="Arial" w:cs="Arial"/>
           <w:color w:val="000000"/>
         </w:rPr>
-        <w:t>After all 5 PRs are merged, verify the live TaskFlow application on Render contains all five pages and navigation between them works correctly.</w:t>
+        <w:t xml:space="preserve">After all 5 PRs are merged, verify the </w:t>
+      </w:r>
+      <w:r>
+        <w:rPr>
+          <w:rFonts w:ascii="Arial" w:eastAsia="Arial" w:hAnsi="Arial" w:cs="Arial"/>
+          <w:color w:val="000000"/>
+        </w:rPr>
+        <w:t>live TaskFlow application on Render contains all five pages and navigation between them works correctly.</w:t>
       </w:r>
     </w:p>
     <w:p>
@@ -6066,12 +6207,6 @@
         <w:gridCol w:w="2150"/>
       </w:tblGrid>
       <w:tr>
-        <w:tblPrEx>
-          <w:tblCellMar>
-            <w:top w:w="0" w:type="dxa"/>
-            <w:bottom w:w="0" w:type="dxa"/>
-          </w:tblCellMar>
-        </w:tblPrEx>
         <w:trPr>
           <w:tblHeader/>
         </w:trPr>
@@ -6173,12 +6308,6 @@
         </w:tc>
       </w:tr>
       <w:tr>
-        <w:tblPrEx>
-          <w:tblCellMar>
-            <w:top w:w="0" w:type="dxa"/>
-            <w:bottom w:w="0" w:type="dxa"/>
-          </w:tblCellMar>
-        </w:tblPrEx>
         <w:tc>
           <w:tcPr>
             <w:tcW w:w="700" w:type="dxa"/>
@@ -6265,12 +6394,6 @@
         </w:tc>
       </w:tr>
       <w:tr>
-        <w:tblPrEx>
-          <w:tblCellMar>
-            <w:top w:w="0" w:type="dxa"/>
-            <w:bottom w:w="0" w:type="dxa"/>
-          </w:tblCellMar>
-        </w:tblPrEx>
         <w:tc>
           <w:tcPr>
             <w:tcW w:w="700" w:type="dxa"/>
@@ -6365,12 +6488,6 @@
         </w:tc>
       </w:tr>
       <w:tr>
-        <w:tblPrEx>
-          <w:tblCellMar>
-            <w:top w:w="0" w:type="dxa"/>
-            <w:bottom w:w="0" w:type="dxa"/>
-          </w:tblCellMar>
-        </w:tblPrEx>
         <w:tc>
           <w:tcPr>
             <w:tcW w:w="700" w:type="dxa"/>
@@ -6429,7 +6546,16 @@
                 <w:sz w:val="18"/>
                 <w:szCs w:val="18"/>
               </w:rPr>
-              <w:t>Version the Assignment 04 question paper (Assignment_04_Spring2026.docx) inside the repo root; each member fills their row including Assigned Page</w:t>
+              <w:t xml:space="preserve">Version the Assignment 04 question paper (Assignment_04_Spring2026.docx) inside the repo root; each </w:t>
+            </w:r>
+            <w:r>
+              <w:rPr>
+                <w:rFonts w:ascii="Arial" w:eastAsia="Arial" w:hAnsi="Arial" w:cs="Arial"/>
+                <w:color w:val="000000"/>
+                <w:sz w:val="18"/>
+                <w:szCs w:val="18"/>
+              </w:rPr>
+              <w:t>member fills their row including Assigned Page</w:t>
             </w:r>
           </w:p>
         </w:tc>
@@ -6465,12 +6591,6 @@
         </w:tc>
       </w:tr>
       <w:tr>
-        <w:tblPrEx>
-          <w:tblCellMar>
-            <w:top w:w="0" w:type="dxa"/>
-            <w:bottom w:w="0" w:type="dxa"/>
-          </w:tblCellMar>
-        </w:tblPrEx>
         <w:tc>
           <w:tcPr>
             <w:tcW w:w="700" w:type="dxa"/>
@@ -6557,12 +6677,6 @@
         </w:tc>
       </w:tr>
       <w:tr>
-        <w:tblPrEx>
-          <w:tblCellMar>
-            <w:top w:w="0" w:type="dxa"/>
-            <w:bottom w:w="0" w:type="dxa"/>
-          </w:tblCellMar>
-        </w:tblPrEx>
         <w:tc>
           <w:tcPr>
             <w:tcW w:w="700" w:type="dxa"/>
@@ -6666,12 +6780,6 @@
         </w:tc>
       </w:tr>
       <w:tr>
-        <w:tblPrEx>
-          <w:tblCellMar>
-            <w:top w:w="0" w:type="dxa"/>
-            <w:bottom w:w="0" w:type="dxa"/>
-          </w:tblCellMar>
-        </w:tblPrEx>
         <w:tc>
           <w:tcPr>
             <w:tcW w:w="700" w:type="dxa"/>
@@ -6730,7 +6838,16 @@
                 <w:sz w:val="18"/>
                 <w:szCs w:val="18"/>
               </w:rPr>
-              <w:t>Configure repository-level secrets: DOCKERHUB_USERNAME, DOCKERHUB_TOKEN (Team Lead's credentials)</w:t>
+              <w:t xml:space="preserve">Configure repository-level secrets: DOCKERHUB_USERNAME, DOCKERHUB_TOKEN (Team Lead's </w:t>
+            </w:r>
+            <w:r>
+              <w:rPr>
+                <w:rFonts w:ascii="Arial" w:eastAsia="Arial" w:hAnsi="Arial" w:cs="Arial"/>
+                <w:color w:val="000000"/>
+                <w:sz w:val="18"/>
+                <w:szCs w:val="18"/>
+              </w:rPr>
+              <w:t>credentials)</w:t>
             </w:r>
           </w:p>
         </w:tc>
@@ -6766,12 +6883,6 @@
         </w:tc>
       </w:tr>
       <w:tr>
-        <w:tblPrEx>
-          <w:tblCellMar>
-            <w:top w:w="0" w:type="dxa"/>
-            <w:bottom w:w="0" w:type="dxa"/>
-          </w:tblCellMar>
-        </w:tblPrEx>
         <w:tc>
           <w:tcPr>
             <w:tcW w:w="700" w:type="dxa"/>
@@ -6875,12 +6986,6 @@
         </w:tc>
       </w:tr>
       <w:tr>
-        <w:tblPrEx>
-          <w:tblCellMar>
-            <w:top w:w="0" w:type="dxa"/>
-            <w:bottom w:w="0" w:type="dxa"/>
-          </w:tblCellMar>
-        </w:tblPrEx>
         <w:tc>
           <w:tcPr>
             <w:tcW w:w="700" w:type="dxa"/>
@@ -6967,12 +7072,6 @@
         </w:tc>
       </w:tr>
       <w:tr>
-        <w:tblPrEx>
-          <w:tblCellMar>
-            <w:top w:w="0" w:type="dxa"/>
-            <w:bottom w:w="0" w:type="dxa"/>
-          </w:tblCellMar>
-        </w:tblPrEx>
         <w:tc>
           <w:tcPr>
             <w:tcW w:w="700" w:type="dxa"/>
@@ -7031,7 +7130,16 @@
                 <w:sz w:val="18"/>
                 <w:szCs w:val="18"/>
               </w:rPr>
-              <w:t>Each member creates their feature branch using the correct naming convention (feature/&lt;username&gt;/&lt;page-name&gt;)</w:t>
+              <w:t xml:space="preserve">Each member creates their feature branch using the </w:t>
+            </w:r>
+            <w:r>
+              <w:rPr>
+                <w:rFonts w:ascii="Arial" w:eastAsia="Arial" w:hAnsi="Arial" w:cs="Arial"/>
+                <w:color w:val="000000"/>
+                <w:sz w:val="18"/>
+                <w:szCs w:val="18"/>
+              </w:rPr>
+              <w:t>correct naming convention (feature/&lt;username&gt;/&lt;page-name&gt;)</w:t>
             </w:r>
           </w:p>
         </w:tc>
@@ -7067,12 +7175,6 @@
         </w:tc>
       </w:tr>
       <w:tr>
-        <w:tblPrEx>
-          <w:tblCellMar>
-            <w:top w:w="0" w:type="dxa"/>
-            <w:bottom w:w="0" w:type="dxa"/>
-          </w:tblCellMar>
-        </w:tblPrEx>
         <w:tc>
           <w:tcPr>
             <w:tcW w:w="700" w:type="dxa"/>
@@ -7167,12 +7269,6 @@
         </w:tc>
       </w:tr>
       <w:tr>
-        <w:tblPrEx>
-          <w:tblCellMar>
-            <w:top w:w="0" w:type="dxa"/>
-            <w:bottom w:w="0" w:type="dxa"/>
-          </w:tblCellMar>
-        </w:tblPrEx>
         <w:tc>
           <w:tcPr>
             <w:tcW w:w="700" w:type="dxa"/>
@@ -7249,7 +7345,16 @@
                 <w:sz w:val="18"/>
                 <w:szCs w:val="18"/>
               </w:rPr>
-              <w:t>; PR description is meaningful and CI passes before merge</w:t>
+              <w:t xml:space="preserve">; PR description is meaningful and CI </w:t>
+            </w:r>
+            <w:r>
+              <w:rPr>
+                <w:rFonts w:ascii="Arial" w:eastAsia="Arial" w:hAnsi="Arial" w:cs="Arial"/>
+                <w:color w:val="000000"/>
+                <w:sz w:val="18"/>
+                <w:szCs w:val="18"/>
+              </w:rPr>
+              <w:t>passes before merge</w:t>
             </w:r>
           </w:p>
         </w:tc>
@@ -7285,12 +7390,6 @@
         </w:tc>
       </w:tr>
       <w:tr>
-        <w:tblPrEx>
-          <w:tblCellMar>
-            <w:top w:w="0" w:type="dxa"/>
-            <w:bottom w:w="0" w:type="dxa"/>
-          </w:tblCellMar>
-        </w:tblPrEx>
         <w:tc>
           <w:tcPr>
             <w:tcW w:w="700" w:type="dxa"/>
@@ -7377,12 +7476,6 @@
         </w:tc>
       </w:tr>
       <w:tr>
-        <w:tblPrEx>
-          <w:tblCellMar>
-            <w:top w:w="0" w:type="dxa"/>
-            <w:bottom w:w="0" w:type="dxa"/>
-          </w:tblCellMar>
-        </w:tblPrEx>
         <w:tc>
           <w:tcPr>
             <w:tcW w:w="700" w:type="dxa"/>
@@ -7486,12 +7579,6 @@
         </w:tc>
       </w:tr>
       <w:tr>
-        <w:tblPrEx>
-          <w:tblCellMar>
-            <w:top w:w="0" w:type="dxa"/>
-            <w:bottom w:w="0" w:type="dxa"/>
-          </w:tblCellMar>
-        </w:tblPrEx>
         <w:tc>
           <w:tcPr>
             <w:tcW w:w="700" w:type="dxa"/>
@@ -7586,12 +7673,6 @@
         </w:tc>
       </w:tr>
       <w:tr>
-        <w:tblPrEx>
-          <w:tblCellMar>
-            <w:top w:w="0" w:type="dxa"/>
-            <w:bottom w:w="0" w:type="dxa"/>
-          </w:tblCellMar>
-        </w:tblPrEx>
         <w:tc>
           <w:tcPr>
             <w:tcW w:w="700" w:type="dxa"/>
@@ -7650,7 +7731,16 @@
                 <w:sz w:val="18"/>
                 <w:szCs w:val="18"/>
               </w:rPr>
-              <w:t>Build Docker image and tag correctly (latest and/or commit SHA)</w:t>
+              <w:t xml:space="preserve">Build Docker image and tag correctly (latest and/or </w:t>
+            </w:r>
+            <w:r>
+              <w:rPr>
+                <w:rFonts w:ascii="Arial" w:eastAsia="Arial" w:hAnsi="Arial" w:cs="Arial"/>
+                <w:color w:val="000000"/>
+                <w:sz w:val="18"/>
+                <w:szCs w:val="18"/>
+              </w:rPr>
+              <w:t>commit SHA)</w:t>
             </w:r>
           </w:p>
         </w:tc>
@@ -7686,12 +7776,6 @@
         </w:tc>
       </w:tr>
       <w:tr>
-        <w:tblPrEx>
-          <w:tblCellMar>
-            <w:top w:w="0" w:type="dxa"/>
-            <w:bottom w:w="0" w:type="dxa"/>
-          </w:tblCellMar>
-        </w:tblPrEx>
         <w:tc>
           <w:tcPr>
             <w:tcW w:w="700" w:type="dxa"/>
@@ -7786,12 +7870,6 @@
         </w:tc>
       </w:tr>
       <w:tr>
-        <w:tblPrEx>
-          <w:tblCellMar>
-            <w:top w:w="0" w:type="dxa"/>
-            <w:bottom w:w="0" w:type="dxa"/>
-          </w:tblCellMar>
-        </w:tblPrEx>
         <w:tc>
           <w:tcPr>
             <w:tcW w:w="700" w:type="dxa"/>
@@ -7878,12 +7956,6 @@
         </w:tc>
       </w:tr>
       <w:tr>
-        <w:tblPrEx>
-          <w:tblCellMar>
-            <w:top w:w="0" w:type="dxa"/>
-            <w:bottom w:w="0" w:type="dxa"/>
-          </w:tblCellMar>
-        </w:tblPrEx>
         <w:tc>
           <w:tcPr>
             <w:tcW w:w="700" w:type="dxa"/>
@@ -7987,12 +8059,6 @@
         </w:tc>
       </w:tr>
       <w:tr>
-        <w:tblPrEx>
-          <w:tblCellMar>
-            <w:top w:w="0" w:type="dxa"/>
-            <w:bottom w:w="0" w:type="dxa"/>
-          </w:tblCellMar>
-        </w:tblPrEx>
         <w:tc>
           <w:tcPr>
             <w:tcW w:w="700" w:type="dxa"/>
@@ -8087,12 +8153,6 @@
         </w:tc>
       </w:tr>
       <w:tr>
-        <w:tblPrEx>
-          <w:tblCellMar>
-            <w:top w:w="0" w:type="dxa"/>
-            <w:bottom w:w="0" w:type="dxa"/>
-          </w:tblCellMar>
-        </w:tblPrEx>
         <w:tc>
           <w:tcPr>
             <w:tcW w:w="700" w:type="dxa"/>
@@ -8151,7 +8211,16 @@
                 <w:sz w:val="18"/>
                 <w:szCs w:val="18"/>
               </w:rPr>
-              <w:t>Deploy step invokes Render webhook via curl POST; deployed app on Render contains all 5 pages</w:t>
+              <w:t xml:space="preserve">Deploy step invokes Render webhook via curl POST; deployed app </w:t>
+            </w:r>
+            <w:r>
+              <w:rPr>
+                <w:rFonts w:ascii="Arial" w:eastAsia="Arial" w:hAnsi="Arial" w:cs="Arial"/>
+                <w:color w:val="000000"/>
+                <w:sz w:val="18"/>
+                <w:szCs w:val="18"/>
+              </w:rPr>
+              <w:t>on Render contains all 5 pages</w:t>
             </w:r>
           </w:p>
         </w:tc>
@@ -8187,12 +8256,6 @@
         </w:tc>
       </w:tr>
       <w:tr>
-        <w:tblPrEx>
-          <w:tblCellMar>
-            <w:top w:w="0" w:type="dxa"/>
-            <w:bottom w:w="0" w:type="dxa"/>
-          </w:tblCellMar>
-        </w:tblPrEx>
         <w:tc>
           <w:tcPr>
             <w:tcW w:w="700" w:type="dxa"/>
@@ -8279,12 +8342,6 @@
         </w:tc>
       </w:tr>
       <w:tr>
-        <w:tblPrEx>
-          <w:tblCellMar>
-            <w:top w:w="0" w:type="dxa"/>
-            <w:bottom w:w="0" w:type="dxa"/>
-          </w:tblCellMar>
-        </w:tblPrEx>
         <w:tc>
           <w:tcPr>
             <w:tcW w:w="700" w:type="dxa"/>
@@ -8379,12 +8436,6 @@
         </w:tc>
       </w:tr>
       <w:tr>
-        <w:tblPrEx>
-          <w:tblCellMar>
-            <w:top w:w="0" w:type="dxa"/>
-            <w:bottom w:w="0" w:type="dxa"/>
-          </w:tblCellMar>
-        </w:tblPrEx>
         <w:tc>
           <w:tcPr>
             <w:tcW w:w="700" w:type="dxa"/>
@@ -8443,7 +8494,16 @@
                 <w:sz w:val="18"/>
                 <w:szCs w:val="18"/>
               </w:rPr>
-              <w:t>Individual reflection (4–5 lines per member) on CI/CD integration and page development experience</w:t>
+              <w:t xml:space="preserve">Individual reflection (4–5 lines per member) on </w:t>
+            </w:r>
+            <w:r>
+              <w:rPr>
+                <w:rFonts w:ascii="Arial" w:eastAsia="Arial" w:hAnsi="Arial" w:cs="Arial"/>
+                <w:color w:val="000000"/>
+                <w:sz w:val="18"/>
+                <w:szCs w:val="18"/>
+              </w:rPr>
+              <w:t>CI/CD integration and page development experience</w:t>
             </w:r>
           </w:p>
         </w:tc>
@@ -8479,12 +8539,6 @@
         </w:tc>
       </w:tr>
       <w:tr>
-        <w:tblPrEx>
-          <w:tblCellMar>
-            <w:top w:w="0" w:type="dxa"/>
-            <w:bottom w:w="0" w:type="dxa"/>
-          </w:tblCellMar>
-        </w:tblPrEx>
         <w:tc>
           <w:tcPr>
             <w:tcW w:w="700" w:type="dxa"/>
@@ -8618,7 +8672,14 @@
           <w:rFonts w:ascii="Arial" w:eastAsia="Arial" w:hAnsi="Arial" w:cs="Arial"/>
           <w:color w:val="000000"/>
         </w:rPr>
-        <w:t>Completed Assignment 04 document with all group details filled in (including each member's Assigned Page).</w:t>
+        <w:t xml:space="preserve">Completed Assignment 04 document with all group details filled in (including each member's Assigned </w:t>
+      </w:r>
+      <w:r>
+        <w:rPr>
+          <w:rFonts w:ascii="Arial" w:eastAsia="Arial" w:hAnsi="Arial" w:cs="Arial"/>
+          <w:color w:val="000000"/>
+        </w:rPr>
+        <w:t>Page).</w:t>
       </w:r>
     </w:p>
     <w:p>
@@ -8700,7 +8761,14 @@
           <w:rFonts w:ascii="Arial" w:eastAsia="Arial" w:hAnsi="Arial" w:cs="Arial"/>
           <w:color w:val="000000"/>
         </w:rPr>
-        <w:t xml:space="preserve">Screenshot 2: Each member's CI workflow run triggered by their individual PR </w:t>
+        <w:t>Screenshot 2: Each member's CI workflow run triggered by their in</w:t>
+      </w:r>
+      <w:r>
+        <w:rPr>
+          <w:rFonts w:ascii="Arial" w:eastAsia="Arial" w:hAnsi="Arial" w:cs="Arial"/>
+          <w:color w:val="000000"/>
+        </w:rPr>
+        <w:t xml:space="preserve">dividual PR </w:t>
       </w:r>
       <w:r>
         <w:rPr>
@@ -8793,7 +8861,14 @@
           <w:rFonts w:ascii="Arial" w:eastAsia="Arial" w:hAnsi="Arial" w:cs="Arial"/>
           <w:color w:val="000000"/>
         </w:rPr>
-        <w:t>Screenshot 5: Live TaskFlow application on Render showing all five pages are accessible.</w:t>
+        <w:t>Scre</w:t>
+      </w:r>
+      <w:r>
+        <w:rPr>
+          <w:rFonts w:ascii="Arial" w:eastAsia="Arial" w:hAnsi="Arial" w:cs="Arial"/>
+          <w:color w:val="000000"/>
+        </w:rPr>
+        <w:t>enshot 5: Live TaskFlow application on Render showing all five pages are accessible.</w:t>
       </w:r>
     </w:p>
     <w:p>
@@ -8827,7 +8902,14 @@
           <w:rFonts w:ascii="Arial" w:eastAsia="Arial" w:hAnsi="Arial" w:cs="Arial"/>
           <w:color w:val="000000"/>
         </w:rPr>
-        <w:t>Individual reflection: Each team member must write 4–5 lines on what they learnt and any challenges they faced.</w:t>
+        <w:t xml:space="preserve">Individual reflection: Each team member must write 4–5 lines on what they </w:t>
+      </w:r>
+      <w:r>
+        <w:rPr>
+          <w:rFonts w:ascii="Arial" w:eastAsia="Arial" w:hAnsi="Arial" w:cs="Arial"/>
+          <w:color w:val="000000"/>
+        </w:rPr>
+        <w:t>learnt and any challenges they faced.</w:t>
       </w:r>
     </w:p>
     <w:p>
@@ -8889,12 +8971,6 @@
         <w:gridCol w:w="6160"/>
       </w:tblGrid>
       <w:tr>
-        <w:tblPrEx>
-          <w:tblCellMar>
-            <w:top w:w="0" w:type="dxa"/>
-            <w:bottom w:w="0" w:type="dxa"/>
-          </w:tblCellMar>
-        </w:tblPrEx>
         <w:tc>
           <w:tcPr>
             <w:tcW w:w="3200" w:type="dxa"/>
@@ -8961,12 +9037,6 @@
         </w:tc>
       </w:tr>
       <w:tr>
-        <w:tblPrEx>
-          <w:tblCellMar>
-            <w:top w:w="0" w:type="dxa"/>
-            <w:bottom w:w="0" w:type="dxa"/>
-          </w:tblCellMar>
-        </w:tblPrEx>
         <w:tc>
           <w:tcPr>
             <w:tcW w:w="3200" w:type="dxa"/>
@@ -9043,12 +9113,6 @@
         </w:tc>
       </w:tr>
       <w:tr>
-        <w:tblPrEx>
-          <w:tblCellMar>
-            <w:top w:w="0" w:type="dxa"/>
-            <w:bottom w:w="0" w:type="dxa"/>
-          </w:tblCellMar>
-        </w:tblPrEx>
         <w:tc>
           <w:tcPr>
             <w:tcW w:w="3200" w:type="dxa"/>
@@ -9103,12 +9167,6 @@
         </w:tc>
       </w:tr>
       <w:tr>
-        <w:tblPrEx>
-          <w:tblCellMar>
-            <w:top w:w="0" w:type="dxa"/>
-            <w:bottom w:w="0" w:type="dxa"/>
-          </w:tblCellMar>
-        </w:tblPrEx>
         <w:tc>
           <w:tcPr>
             <w:tcW w:w="3200" w:type="dxa"/>
@@ -9163,12 +9221,6 @@
         </w:tc>
       </w:tr>
       <w:tr>
-        <w:tblPrEx>
-          <w:tblCellMar>
-            <w:top w:w="0" w:type="dxa"/>
-            <w:bottom w:w="0" w:type="dxa"/>
-          </w:tblCellMar>
-        </w:tblPrEx>
         <w:tc>
           <w:tcPr>
             <w:tcW w:w="3200" w:type="dxa"/>
@@ -9234,12 +9286,6 @@
         </w:tc>
       </w:tr>
       <w:tr>
-        <w:tblPrEx>
-          <w:tblCellMar>
-            <w:top w:w="0" w:type="dxa"/>
-            <w:bottom w:w="0" w:type="dxa"/>
-          </w:tblCellMar>
-        </w:tblPrEx>
         <w:tc>
           <w:tcPr>
             <w:tcW w:w="3200" w:type="dxa"/>
@@ -9294,12 +9340,6 @@
         </w:tc>
       </w:tr>
       <w:tr>
-        <w:tblPrEx>
-          <w:tblCellMar>
-            <w:top w:w="0" w:type="dxa"/>
-            <w:bottom w:w="0" w:type="dxa"/>
-          </w:tblCellMar>
-        </w:tblPrEx>
         <w:tc>
           <w:tcPr>
             <w:tcW w:w="3200" w:type="dxa"/>
@@ -9408,7 +9448,16 @@
           <w:bCs/>
           <w:color w:val="000000"/>
         </w:rPr>
-        <w:t>Member 1  (Name: _______________________________________________)</w:t>
+        <w:t xml:space="preserve">Member 1  (Name: </w:t>
+      </w:r>
+      <w:r>
+        <w:rPr>
+          <w:rFonts w:ascii="Arial" w:eastAsia="Arial" w:hAnsi="Arial" w:cs="Arial"/>
+          <w:b/>
+          <w:bCs/>
+          <w:color w:val="000000"/>
+        </w:rPr>
+        <w:t>_______________________________________________)</w:t>
       </w:r>
     </w:p>
     <w:tbl>
@@ -9432,12 +9481,6 @@
         <w:gridCol w:w="9360"/>
       </w:tblGrid>
       <w:tr>
-        <w:tblPrEx>
-          <w:tblCellMar>
-            <w:top w:w="0" w:type="dxa"/>
-            <w:bottom w:w="0" w:type="dxa"/>
-          </w:tblCellMar>
-        </w:tblPrEx>
         <w:tc>
           <w:tcPr>
             <w:tcW w:w="9360" w:type="dxa"/>
@@ -9460,12 +9503,6 @@
         </w:tc>
       </w:tr>
       <w:tr>
-        <w:tblPrEx>
-          <w:tblCellMar>
-            <w:top w:w="0" w:type="dxa"/>
-            <w:bottom w:w="0" w:type="dxa"/>
-          </w:tblCellMar>
-        </w:tblPrEx>
         <w:tc>
           <w:tcPr>
             <w:tcW w:w="9360" w:type="dxa"/>
@@ -9488,12 +9525,6 @@
         </w:tc>
       </w:tr>
       <w:tr>
-        <w:tblPrEx>
-          <w:tblCellMar>
-            <w:top w:w="0" w:type="dxa"/>
-            <w:bottom w:w="0" w:type="dxa"/>
-          </w:tblCellMar>
-        </w:tblPrEx>
         <w:tc>
           <w:tcPr>
             <w:tcW w:w="9360" w:type="dxa"/>
@@ -9557,12 +9588,6 @@
         <w:gridCol w:w="9360"/>
       </w:tblGrid>
       <w:tr>
-        <w:tblPrEx>
-          <w:tblCellMar>
-            <w:top w:w="0" w:type="dxa"/>
-            <w:bottom w:w="0" w:type="dxa"/>
-          </w:tblCellMar>
-        </w:tblPrEx>
         <w:tc>
           <w:tcPr>
             <w:tcW w:w="9360" w:type="dxa"/>
@@ -9585,12 +9610,6 @@
         </w:tc>
       </w:tr>
       <w:tr>
-        <w:tblPrEx>
-          <w:tblCellMar>
-            <w:top w:w="0" w:type="dxa"/>
-            <w:bottom w:w="0" w:type="dxa"/>
-          </w:tblCellMar>
-        </w:tblPrEx>
         <w:tc>
           <w:tcPr>
             <w:tcW w:w="9360" w:type="dxa"/>
@@ -9613,12 +9632,6 @@
         </w:tc>
       </w:tr>
       <w:tr>
-        <w:tblPrEx>
-          <w:tblCellMar>
-            <w:top w:w="0" w:type="dxa"/>
-            <w:bottom w:w="0" w:type="dxa"/>
-          </w:tblCellMar>
-        </w:tblPrEx>
         <w:tc>
           <w:tcPr>
             <w:tcW w:w="9360" w:type="dxa"/>
@@ -9682,12 +9695,6 @@
         <w:gridCol w:w="9360"/>
       </w:tblGrid>
       <w:tr>
-        <w:tblPrEx>
-          <w:tblCellMar>
-            <w:top w:w="0" w:type="dxa"/>
-            <w:bottom w:w="0" w:type="dxa"/>
-          </w:tblCellMar>
-        </w:tblPrEx>
         <w:tc>
           <w:tcPr>
             <w:tcW w:w="9360" w:type="dxa"/>
@@ -9710,12 +9717,6 @@
         </w:tc>
       </w:tr>
       <w:tr>
-        <w:tblPrEx>
-          <w:tblCellMar>
-            <w:top w:w="0" w:type="dxa"/>
-            <w:bottom w:w="0" w:type="dxa"/>
-          </w:tblCellMar>
-        </w:tblPrEx>
         <w:tc>
           <w:tcPr>
             <w:tcW w:w="9360" w:type="dxa"/>
@@ -9738,12 +9739,6 @@
         </w:tc>
       </w:tr>
       <w:tr>
-        <w:tblPrEx>
-          <w:tblCellMar>
-            <w:top w:w="0" w:type="dxa"/>
-            <w:bottom w:w="0" w:type="dxa"/>
-          </w:tblCellMar>
-        </w:tblPrEx>
         <w:tc>
           <w:tcPr>
             <w:tcW w:w="9360" w:type="dxa"/>
@@ -9783,7 +9778,16 @@
           <w:bCs/>
           <w:color w:val="000000"/>
         </w:rPr>
-        <w:t>Member 4  (Name: _______________________________________________)</w:t>
+        <w:t xml:space="preserve">Member 4  (Name: </w:t>
+      </w:r>
+      <w:r>
+        <w:rPr>
+          <w:rFonts w:ascii="Arial" w:eastAsia="Arial" w:hAnsi="Arial" w:cs="Arial"/>
+          <w:b/>
+          <w:bCs/>
+          <w:color w:val="000000"/>
+        </w:rPr>
+        <w:t>_______________________________________________)</w:t>
       </w:r>
     </w:p>
     <w:tbl>
@@ -9807,12 +9811,6 @@
         <w:gridCol w:w="9360"/>
       </w:tblGrid>
       <w:tr>
-        <w:tblPrEx>
-          <w:tblCellMar>
-            <w:top w:w="0" w:type="dxa"/>
-            <w:bottom w:w="0" w:type="dxa"/>
-          </w:tblCellMar>
-        </w:tblPrEx>
         <w:tc>
           <w:tcPr>
             <w:tcW w:w="9360" w:type="dxa"/>
@@ -9835,12 +9833,6 @@
         </w:tc>
       </w:tr>
       <w:tr>
-        <w:tblPrEx>
-          <w:tblCellMar>
-            <w:top w:w="0" w:type="dxa"/>
-            <w:bottom w:w="0" w:type="dxa"/>
-          </w:tblCellMar>
-        </w:tblPrEx>
         <w:tc>
           <w:tcPr>
             <w:tcW w:w="9360" w:type="dxa"/>
@@ -9863,12 +9855,6 @@
         </w:tc>
       </w:tr>
       <w:tr>
-        <w:tblPrEx>
-          <w:tblCellMar>
-            <w:top w:w="0" w:type="dxa"/>
-            <w:bottom w:w="0" w:type="dxa"/>
-          </w:tblCellMar>
-        </w:tblPrEx>
         <w:tc>
           <w:tcPr>
             <w:tcW w:w="9360" w:type="dxa"/>
@@ -9932,12 +9918,6 @@
         <w:gridCol w:w="9360"/>
       </w:tblGrid>
       <w:tr>
-        <w:tblPrEx>
-          <w:tblCellMar>
-            <w:top w:w="0" w:type="dxa"/>
-            <w:bottom w:w="0" w:type="dxa"/>
-          </w:tblCellMar>
-        </w:tblPrEx>
         <w:tc>
           <w:tcPr>
             <w:tcW w:w="9360" w:type="dxa"/>
@@ -9960,12 +9940,6 @@
         </w:tc>
       </w:tr>
       <w:tr>
-        <w:tblPrEx>
-          <w:tblCellMar>
-            <w:top w:w="0" w:type="dxa"/>
-            <w:bottom w:w="0" w:type="dxa"/>
-          </w:tblCellMar>
-        </w:tblPrEx>
         <w:tc>
           <w:tcPr>
             <w:tcW w:w="9360" w:type="dxa"/>
@@ -9988,12 +9962,6 @@
         </w:tc>
       </w:tr>
       <w:tr>
-        <w:tblPrEx>
-          <w:tblCellMar>
-            <w:top w:w="0" w:type="dxa"/>
-            <w:bottom w:w="0" w:type="dxa"/>
-          </w:tblCellMar>
-        </w:tblPrEx>
         <w:tc>
           <w:tcPr>
             <w:tcW w:w="9360" w:type="dxa"/>
@@ -10038,7 +10006,7 @@
 </file>
 
 <file path=word/endnotes.xml><?xml version="1.0" encoding="utf-8"?>
-<w:endnotes xmlns:wpc="http://schemas.microsoft.com/office/word/2010/wordprocessingCanvas" xmlns:cx="http://schemas.microsoft.com/office/drawing/2014/chartex" xmlns:cx1="http://schemas.microsoft.com/office/drawing/2015/9/8/chartex" xmlns:cx2="http://schemas.microsoft.com/office/drawing/2015/10/21/chartex" xmlns:cx3="http://schemas.microsoft.com/office/drawing/2016/5/9/chartex" xmlns:cx4="http://schemas.microsoft.com/office/drawing/2016/5/10/chartex" xmlns:cx5="http://schemas.microsoft.com/office/drawing/2016/5/11/chartex" xmlns:cx6="http://schemas.microsoft.com/office/drawing/2016/5/12/chartex" xmlns:cx7="http://schemas.microsoft.com/office/drawing/2016/5/13/chartex" xmlns:cx8="http://schemas.microsoft.com/office/drawing/2016/5/14/chartex" xmlns:mc="http://schemas.openxmlformats.org/markup-compatibility/2006" xmlns:aink="http://schemas.microsoft.com/office/drawing/2016/ink" xmlns:am3d="http://schemas.microsoft.com/office/drawing/2017/model3d" xmlns:o="urn:schemas-microsoft-com:office:office" xmlns:oel="http://schemas.microsoft.com/office/2019/extlst" xmlns:r="http://schemas.openxmlformats.org/officeDocument/2006/relationships" xmlns:m="http://schemas.openxmlformats.org/officeDocument/2006/math" xmlns:v="urn:schemas-microsoft-com:vml" xmlns:wp14="http://schemas.microsoft.com/office/word/2010/wordprocessingDrawing" xmlns:wp="http://schemas.openxmlformats.org/drawingml/2006/wordprocessingDrawing" xmlns:w10="urn:schemas-microsoft-com:office:word" xmlns:w="http://schemas.openxmlformats.org/wordprocessingml/2006/main" xmlns:w14="http://schemas.microsoft.com/office/word/2010/wordml" xmlns:w15="http://schemas.microsoft.com/office/word/2012/wordml" xmlns:w16cex="http://schemas.microsoft.com/office/word/2018/wordml/cex" xmlns:w16cid="http://schemas.microsoft.com/office/word/2016/wordml/cid" xmlns:w16="http://schemas.microsoft.com/office/word/2018/wordml" xmlns:w16du="http://schemas.microsoft.com/office/word/2023/wordml/word16du" xmlns:w16sdtdh="http://schemas.microsoft.com/office/word/2020/wordml/sdtdatahash" xmlns:w16sdtfl="http://schemas.microsoft.com/office/word/2024/wordml/sdtformatlock" xmlns:w16se="http://schemas.microsoft.com/office/word/2015/wordml/symex" xmlns:wpg="http://schemas.microsoft.com/office/word/2010/wordprocessingGroup" xmlns:wpi="http://schemas.microsoft.com/office/word/2010/wordprocessingInk" xmlns:wne="http://schemas.microsoft.com/office/word/2006/wordml" xmlns:wps="http://schemas.microsoft.com/office/word/2010/wordprocessingShape" mc:Ignorable="w14 w15 w16se w16cid w16 w16cex w16sdtdh w16sdtfl w16du wp14">
+<w:endnotes xmlns:wpc="http://schemas.microsoft.com/office/word/2010/wordprocessingCanvas" xmlns:cx="http://schemas.microsoft.com/office/drawing/2014/chartex" xmlns:cx1="http://schemas.microsoft.com/office/drawing/2015/9/8/chartex" xmlns:cx2="http://schemas.microsoft.com/office/drawing/2015/10/21/chartex" xmlns:cx3="http://schemas.microsoft.com/office/drawing/2016/5/9/chartex" xmlns:cx4="http://schemas.microsoft.com/office/drawing/2016/5/10/chartex" xmlns:cx5="http://schemas.microsoft.com/office/drawing/2016/5/11/chartex" xmlns:cx6="http://schemas.microsoft.com/office/drawing/2016/5/12/chartex" xmlns:cx7="http://schemas.microsoft.com/office/drawing/2016/5/13/chartex" xmlns:cx8="http://schemas.microsoft.com/office/drawing/2016/5/14/chartex" xmlns:mc="http://schemas.openxmlformats.org/markup-compatibility/2006" xmlns:aink="http://schemas.microsoft.com/office/drawing/2016/ink" xmlns:am3d="http://schemas.microsoft.com/office/drawing/2017/model3d" xmlns:o="urn:schemas-microsoft-com:office:office" xmlns:r="http://schemas.openxmlformats.org/officeDocument/2006/relationships" xmlns:m="http://schemas.openxmlformats.org/officeDocument/2006/math" xmlns:v="urn:schemas-microsoft-com:vml" xmlns:wp14="http://schemas.microsoft.com/office/word/2010/wordprocessingDrawing" xmlns:wp="http://schemas.openxmlformats.org/drawingml/2006/wordprocessingDrawing" xmlns:w10="urn:schemas-microsoft-com:office:word" xmlns:w="http://schemas.openxmlformats.org/wordprocessingml/2006/main" xmlns:w14="http://schemas.microsoft.com/office/word/2010/wordml" xmlns:w15="http://schemas.microsoft.com/office/word/2012/wordml" xmlns:w16cex="http://schemas.microsoft.com/office/word/2018/wordml/cex" xmlns:w16cid="http://schemas.microsoft.com/office/word/2016/wordml/cid" xmlns:w16="http://schemas.microsoft.com/office/word/2018/wordml" xmlns:w16sdtdh="http://schemas.microsoft.com/office/word/2020/wordml/sdtdatahash" xmlns:w16se="http://schemas.microsoft.com/office/word/2015/wordml/symex" xmlns:wpg="http://schemas.microsoft.com/office/word/2010/wordprocessingGroup" xmlns:wpi="http://schemas.microsoft.com/office/word/2010/wordprocessingInk" xmlns:wne="http://schemas.microsoft.com/office/word/2006/wordml" xmlns:wps="http://schemas.microsoft.com/office/word/2010/wordprocessingShape" mc:Ignorable="w14 w15 w16se w16cid w16 w16cex w16sdtdh wp14">
   <w:endnote w:type="separator" w:id="-1">
     <w:p>
       <w:r>
@@ -10057,7 +10025,7 @@
 </file>
 
 <file path=word/footer1.xml><?xml version="1.0" encoding="utf-8"?>
-<w:ftr xmlns:wpc="http://schemas.microsoft.com/office/word/2010/wordprocessingCanvas" xmlns:cx="http://schemas.microsoft.com/office/drawing/2014/chartex" xmlns:cx1="http://schemas.microsoft.com/office/drawing/2015/9/8/chartex" xmlns:cx2="http://schemas.microsoft.com/office/drawing/2015/10/21/chartex" xmlns:cx3="http://schemas.microsoft.com/office/drawing/2016/5/9/chartex" xmlns:cx4="http://schemas.microsoft.com/office/drawing/2016/5/10/chartex" xmlns:cx5="http://schemas.microsoft.com/office/drawing/2016/5/11/chartex" xmlns:cx6="http://schemas.microsoft.com/office/drawing/2016/5/12/chartex" xmlns:cx7="http://schemas.microsoft.com/office/drawing/2016/5/13/chartex" xmlns:cx8="http://schemas.microsoft.com/office/drawing/2016/5/14/chartex" xmlns:mc="http://schemas.openxmlformats.org/markup-compatibility/2006" xmlns:aink="http://schemas.microsoft.com/office/drawing/2016/ink" xmlns:am3d="http://schemas.microsoft.com/office/drawing/2017/model3d" xmlns:o="urn:schemas-microsoft-com:office:office" xmlns:oel="http://schemas.microsoft.com/office/2019/extlst" xmlns:r="http://schemas.openxmlformats.org/officeDocument/2006/relationships" xmlns:m="http://schemas.openxmlformats.org/officeDocument/2006/math" xmlns:v="urn:schemas-microsoft-com:vml" xmlns:wp14="http://schemas.microsoft.com/office/word/2010/wordprocessingDrawing" xmlns:wp="http://schemas.openxmlformats.org/drawingml/2006/wordprocessingDrawing" xmlns:w10="urn:schemas-microsoft-com:office:word" xmlns:w="http://schemas.openxmlformats.org/wordprocessingml/2006/main" xmlns:w14="http://schemas.microsoft.com/office/word/2010/wordml" xmlns:w15="http://schemas.microsoft.com/office/word/2012/wordml" xmlns:w16cex="http://schemas.microsoft.com/office/word/2018/wordml/cex" xmlns:w16cid="http://schemas.microsoft.com/office/word/2016/wordml/cid" xmlns:w16="http://schemas.microsoft.com/office/word/2018/wordml" xmlns:w16du="http://schemas.microsoft.com/office/word/2023/wordml/word16du" xmlns:w16sdtdh="http://schemas.microsoft.com/office/word/2020/wordml/sdtdatahash" xmlns:w16sdtfl="http://schemas.microsoft.com/office/word/2024/wordml/sdtformatlock" xmlns:w16se="http://schemas.microsoft.com/office/word/2015/wordml/symex" xmlns:wpg="http://schemas.microsoft.com/office/word/2010/wordprocessingGroup" xmlns:wpi="http://schemas.microsoft.com/office/word/2010/wordprocessingInk" xmlns:wne="http://schemas.microsoft.com/office/word/2006/wordml" xmlns:wps="http://schemas.microsoft.com/office/word/2010/wordprocessingShape" mc:Ignorable="w14 w15 w16se w16cid w16 w16cex w16sdtdh w16sdtfl w16du wp14">
+<w:ftr xmlns:wpc="http://schemas.microsoft.com/office/word/2010/wordprocessingCanvas" xmlns:cx="http://schemas.microsoft.com/office/drawing/2014/chartex" xmlns:cx1="http://schemas.microsoft.com/office/drawing/2015/9/8/chartex" xmlns:cx2="http://schemas.microsoft.com/office/drawing/2015/10/21/chartex" xmlns:cx3="http://schemas.microsoft.com/office/drawing/2016/5/9/chartex" xmlns:cx4="http://schemas.microsoft.com/office/drawing/2016/5/10/chartex" xmlns:cx5="http://schemas.microsoft.com/office/drawing/2016/5/11/chartex" xmlns:cx6="http://schemas.microsoft.com/office/drawing/2016/5/12/chartex" xmlns:cx7="http://schemas.microsoft.com/office/drawing/2016/5/13/chartex" xmlns:cx8="http://schemas.microsoft.com/office/drawing/2016/5/14/chartex" xmlns:mc="http://schemas.openxmlformats.org/markup-compatibility/2006" xmlns:aink="http://schemas.microsoft.com/office/drawing/2016/ink" xmlns:am3d="http://schemas.microsoft.com/office/drawing/2017/model3d" xmlns:o="urn:schemas-microsoft-com:office:office" xmlns:r="http://schemas.openxmlformats.org/officeDocument/2006/relationships" xmlns:m="http://schemas.openxmlformats.org/officeDocument/2006/math" xmlns:v="urn:schemas-microsoft-com:vml" xmlns:wp14="http://schemas.microsoft.com/office/word/2010/wordprocessingDrawing" xmlns:wp="http://schemas.openxmlformats.org/drawingml/2006/wordprocessingDrawing" xmlns:w10="urn:schemas-microsoft-com:office:word" xmlns:w="http://schemas.openxmlformats.org/wordprocessingml/2006/main" xmlns:w14="http://schemas.microsoft.com/office/word/2010/wordml" xmlns:w15="http://schemas.microsoft.com/office/word/2012/wordml" xmlns:w16cex="http://schemas.microsoft.com/office/word/2018/wordml/cex" xmlns:w16cid="http://schemas.microsoft.com/office/word/2016/wordml/cid" xmlns:w16="http://schemas.microsoft.com/office/word/2018/wordml" xmlns:w16sdtdh="http://schemas.microsoft.com/office/word/2020/wordml/sdtdatahash" xmlns:w16se="http://schemas.microsoft.com/office/word/2015/wordml/symex" xmlns:wpg="http://schemas.microsoft.com/office/word/2010/wordprocessingGroup" xmlns:wpi="http://schemas.microsoft.com/office/word/2010/wordprocessingInk" xmlns:wne="http://schemas.microsoft.com/office/word/2006/wordml" xmlns:wps="http://schemas.microsoft.com/office/word/2010/wordprocessingShape" mc:Ignorable="w14 w15 w16se w16cid w16 w16cex w16sdtdh wp14">
   <w:p>
     <w:pPr>
       <w:pStyle w:val="Footer"/>
@@ -10067,7 +10035,7 @@
 </file>
 
 <file path=word/footer2.xml><?xml version="1.0" encoding="utf-8"?>
-<w:ftr xmlns:wpc="http://schemas.microsoft.com/office/word/2010/wordprocessingCanvas" xmlns:cx="http://schemas.microsoft.com/office/drawing/2014/chartex" xmlns:cx1="http://schemas.microsoft.com/office/drawing/2015/9/8/chartex" xmlns:cx2="http://schemas.microsoft.com/office/drawing/2015/10/21/chartex" xmlns:cx3="http://schemas.microsoft.com/office/drawing/2016/5/9/chartex" xmlns:cx4="http://schemas.microsoft.com/office/drawing/2016/5/10/chartex" xmlns:cx5="http://schemas.microsoft.com/office/drawing/2016/5/11/chartex" xmlns:cx6="http://schemas.microsoft.com/office/drawing/2016/5/12/chartex" xmlns:cx7="http://schemas.microsoft.com/office/drawing/2016/5/13/chartex" xmlns:cx8="http://schemas.microsoft.com/office/drawing/2016/5/14/chartex" xmlns:mc="http://schemas.openxmlformats.org/markup-compatibility/2006" xmlns:aink="http://schemas.microsoft.com/office/drawing/2016/ink" xmlns:am3d="http://schemas.microsoft.com/office/drawing/2017/model3d" xmlns:o="urn:schemas-microsoft-com:office:office" xmlns:oel="http://schemas.microsoft.com/office/2019/extlst" xmlns:r="http://schemas.openxmlformats.org/officeDocument/2006/relationships" xmlns:m="http://schemas.openxmlformats.org/officeDocument/2006/math" xmlns:v="urn:schemas-microsoft-com:vml" xmlns:wp14="http://schemas.microsoft.com/office/word/2010/wordprocessingDrawing" xmlns:wp="http://schemas.openxmlformats.org/drawingml/2006/wordprocessingDrawing" xmlns:w10="urn:schemas-microsoft-com:office:word" xmlns:w="http://schemas.openxmlformats.org/wordprocessingml/2006/main" xmlns:w14="http://schemas.microsoft.com/office/word/2010/wordml" xmlns:w15="http://schemas.microsoft.com/office/word/2012/wordml" xmlns:w16cex="http://schemas.microsoft.com/office/word/2018/wordml/cex" xmlns:w16cid="http://schemas.microsoft.com/office/word/2016/wordml/cid" xmlns:w16="http://schemas.microsoft.com/office/word/2018/wordml" xmlns:w16du="http://schemas.microsoft.com/office/word/2023/wordml/word16du" xmlns:w16sdtdh="http://schemas.microsoft.com/office/word/2020/wordml/sdtdatahash" xmlns:w16sdtfl="http://schemas.microsoft.com/office/word/2024/wordml/sdtformatlock" xmlns:w16se="http://schemas.microsoft.com/office/word/2015/wordml/symex" xmlns:wpg="http://schemas.microsoft.com/office/word/2010/wordprocessingGroup" xmlns:wpi="http://schemas.microsoft.com/office/word/2010/wordprocessingInk" xmlns:wne="http://schemas.microsoft.com/office/word/2006/wordml" xmlns:wps="http://schemas.microsoft.com/office/word/2010/wordprocessingShape" mc:Ignorable="w14 w15 w16se w16cid w16 w16cex w16sdtdh w16sdtfl w16du wp14">
+<w:ftr xmlns:wpc="http://schemas.microsoft.com/office/word/2010/wordprocessingCanvas" xmlns:cx="http://schemas.microsoft.com/office/drawing/2014/chartex" xmlns:cx1="http://schemas.microsoft.com/office/drawing/2015/9/8/chartex" xmlns:cx2="http://schemas.microsoft.com/office/drawing/2015/10/21/chartex" xmlns:cx3="http://schemas.microsoft.com/office/drawing/2016/5/9/chartex" xmlns:cx4="http://schemas.microsoft.com/office/drawing/2016/5/10/chartex" xmlns:cx5="http://schemas.microsoft.com/office/drawing/2016/5/11/chartex" xmlns:cx6="http://schemas.microsoft.com/office/drawing/2016/5/12/chartex" xmlns:cx7="http://schemas.microsoft.com/office/drawing/2016/5/13/chartex" xmlns:cx8="http://schemas.microsoft.com/office/drawing/2016/5/14/chartex" xmlns:mc="http://schemas.openxmlformats.org/markup-compatibility/2006" xmlns:aink="http://schemas.microsoft.com/office/drawing/2016/ink" xmlns:am3d="http://schemas.microsoft.com/office/drawing/2017/model3d" xmlns:o="urn:schemas-microsoft-com:office:office" xmlns:r="http://schemas.openxmlformats.org/officeDocument/2006/relationships" xmlns:m="http://schemas.openxmlformats.org/officeDocument/2006/math" xmlns:v="urn:schemas-microsoft-com:vml" xmlns:wp14="http://schemas.microsoft.com/office/word/2010/wordprocessingDrawing" xmlns:wp="http://schemas.openxmlformats.org/drawingml/2006/wordprocessingDrawing" xmlns:w10="urn:schemas-microsoft-com:office:word" xmlns:w="http://schemas.openxmlformats.org/wordprocessingml/2006/main" xmlns:w14="http://schemas.microsoft.com/office/word/2010/wordml" xmlns:w15="http://schemas.microsoft.com/office/word/2012/wordml" xmlns:w16cex="http://schemas.microsoft.com/office/word/2018/wordml/cex" xmlns:w16cid="http://schemas.microsoft.com/office/word/2016/wordml/cid" xmlns:w16="http://schemas.microsoft.com/office/word/2018/wordml" xmlns:w16sdtdh="http://schemas.microsoft.com/office/word/2020/wordml/sdtdatahash" xmlns:w16se="http://schemas.microsoft.com/office/word/2015/wordml/symex" xmlns:wpg="http://schemas.microsoft.com/office/word/2010/wordprocessingGroup" xmlns:wpi="http://schemas.microsoft.com/office/word/2010/wordprocessingInk" xmlns:wne="http://schemas.microsoft.com/office/word/2006/wordml" xmlns:wps="http://schemas.microsoft.com/office/word/2010/wordprocessingShape" mc:Ignorable="w14 w15 w16se w16cid w16 w16cex w16sdtdh wp14">
   <w:p>
     <w:pPr>
       <w:pBdr>
@@ -10149,7 +10117,7 @@
 </file>
 
 <file path=word/footer3.xml><?xml version="1.0" encoding="utf-8"?>
-<w:ftr xmlns:wpc="http://schemas.microsoft.com/office/word/2010/wordprocessingCanvas" xmlns:cx="http://schemas.microsoft.com/office/drawing/2014/chartex" xmlns:cx1="http://schemas.microsoft.com/office/drawing/2015/9/8/chartex" xmlns:cx2="http://schemas.microsoft.com/office/drawing/2015/10/21/chartex" xmlns:cx3="http://schemas.microsoft.com/office/drawing/2016/5/9/chartex" xmlns:cx4="http://schemas.microsoft.com/office/drawing/2016/5/10/chartex" xmlns:cx5="http://schemas.microsoft.com/office/drawing/2016/5/11/chartex" xmlns:cx6="http://schemas.microsoft.com/office/drawing/2016/5/12/chartex" xmlns:cx7="http://schemas.microsoft.com/office/drawing/2016/5/13/chartex" xmlns:cx8="http://schemas.microsoft.com/office/drawing/2016/5/14/chartex" xmlns:mc="http://schemas.openxmlformats.org/markup-compatibility/2006" xmlns:aink="http://schemas.microsoft.com/office/drawing/2016/ink" xmlns:am3d="http://schemas.microsoft.com/office/drawing/2017/model3d" xmlns:o="urn:schemas-microsoft-com:office:office" xmlns:oel="http://schemas.microsoft.com/office/2019/extlst" xmlns:r="http://schemas.openxmlformats.org/officeDocument/2006/relationships" xmlns:m="http://schemas.openxmlformats.org/officeDocument/2006/math" xmlns:v="urn:schemas-microsoft-com:vml" xmlns:wp14="http://schemas.microsoft.com/office/word/2010/wordprocessingDrawing" xmlns:wp="http://schemas.openxmlformats.org/drawingml/2006/wordprocessingDrawing" xmlns:w10="urn:schemas-microsoft-com:office:word" xmlns:w="http://schemas.openxmlformats.org/wordprocessingml/2006/main" xmlns:w14="http://schemas.microsoft.com/office/word/2010/wordml" xmlns:w15="http://schemas.microsoft.com/office/word/2012/wordml" xmlns:w16cex="http://schemas.microsoft.com/office/word/2018/wordml/cex" xmlns:w16cid="http://schemas.microsoft.com/office/word/2016/wordml/cid" xmlns:w16="http://schemas.microsoft.com/office/word/2018/wordml" xmlns:w16du="http://schemas.microsoft.com/office/word/2023/wordml/word16du" xmlns:w16sdtdh="http://schemas.microsoft.com/office/word/2020/wordml/sdtdatahash" xmlns:w16sdtfl="http://schemas.microsoft.com/office/word/2024/wordml/sdtformatlock" xmlns:w16se="http://schemas.microsoft.com/office/word/2015/wordml/symex" xmlns:wpg="http://schemas.microsoft.com/office/word/2010/wordprocessingGroup" xmlns:wpi="http://schemas.microsoft.com/office/word/2010/wordprocessingInk" xmlns:wne="http://schemas.microsoft.com/office/word/2006/wordml" xmlns:wps="http://schemas.microsoft.com/office/word/2010/wordprocessingShape" mc:Ignorable="w14 w15 w16se w16cid w16 w16cex w16sdtdh w16sdtfl w16du wp14">
+<w:ftr xmlns:wpc="http://schemas.microsoft.com/office/word/2010/wordprocessingCanvas" xmlns:cx="http://schemas.microsoft.com/office/drawing/2014/chartex" xmlns:cx1="http://schemas.microsoft.com/office/drawing/2015/9/8/chartex" xmlns:cx2="http://schemas.microsoft.com/office/drawing/2015/10/21/chartex" xmlns:cx3="http://schemas.microsoft.com/office/drawing/2016/5/9/chartex" xmlns:cx4="http://schemas.microsoft.com/office/drawing/2016/5/10/chartex" xmlns:cx5="http://schemas.microsoft.com/office/drawing/2016/5/11/chartex" xmlns:cx6="http://schemas.microsoft.com/office/drawing/2016/5/12/chartex" xmlns:cx7="http://schemas.microsoft.com/office/drawing/2016/5/13/chartex" xmlns:cx8="http://schemas.microsoft.com/office/drawing/2016/5/14/chartex" xmlns:mc="http://schemas.openxmlformats.org/markup-compatibility/2006" xmlns:aink="http://schemas.microsoft.com/office/drawing/2016/ink" xmlns:am3d="http://schemas.microsoft.com/office/drawing/2017/model3d" xmlns:o="urn:schemas-microsoft-com:office:office" xmlns:r="http://schemas.openxmlformats.org/officeDocument/2006/relationships" xmlns:m="http://schemas.openxmlformats.org/officeDocument/2006/math" xmlns:v="urn:schemas-microsoft-com:vml" xmlns:wp14="http://schemas.microsoft.com/office/word/2010/wordprocessingDrawing" xmlns:wp="http://schemas.openxmlformats.org/drawingml/2006/wordprocessingDrawing" xmlns:w10="urn:schemas-microsoft-com:office:word" xmlns:w="http://schemas.openxmlformats.org/wordprocessingml/2006/main" xmlns:w14="http://schemas.microsoft.com/office/word/2010/wordml" xmlns:w15="http://schemas.microsoft.com/office/word/2012/wordml" xmlns:w16cex="http://schemas.microsoft.com/office/word/2018/wordml/cex" xmlns:w16cid="http://schemas.microsoft.com/office/word/2016/wordml/cid" xmlns:w16="http://schemas.microsoft.com/office/word/2018/wordml" xmlns:w16sdtdh="http://schemas.microsoft.com/office/word/2020/wordml/sdtdatahash" xmlns:w16se="http://schemas.microsoft.com/office/word/2015/wordml/symex" xmlns:wpg="http://schemas.microsoft.com/office/word/2010/wordprocessingGroup" xmlns:wpi="http://schemas.microsoft.com/office/word/2010/wordprocessingInk" xmlns:wne="http://schemas.microsoft.com/office/word/2006/wordml" xmlns:wps="http://schemas.microsoft.com/office/word/2010/wordprocessingShape" mc:Ignorable="w14 w15 w16se w16cid w16 w16cex w16sdtdh wp14">
   <w:p>
     <w:pPr>
       <w:pStyle w:val="Footer"/>
@@ -10159,7 +10127,7 @@
 </file>
 
 <file path=word/footnotes.xml><?xml version="1.0" encoding="utf-8"?>
-<w:footnotes xmlns:wpc="http://schemas.microsoft.com/office/word/2010/wordprocessingCanvas" xmlns:cx="http://schemas.microsoft.com/office/drawing/2014/chartex" xmlns:cx1="http://schemas.microsoft.com/office/drawing/2015/9/8/chartex" xmlns:cx2="http://schemas.microsoft.com/office/drawing/2015/10/21/chartex" xmlns:cx3="http://schemas.microsoft.com/office/drawing/2016/5/9/chartex" xmlns:cx4="http://schemas.microsoft.com/office/drawing/2016/5/10/chartex" xmlns:cx5="http://schemas.microsoft.com/office/drawing/2016/5/11/chartex" xmlns:cx6="http://schemas.microsoft.com/office/drawing/2016/5/12/chartex" xmlns:cx7="http://schemas.microsoft.com/office/drawing/2016/5/13/chartex" xmlns:cx8="http://schemas.microsoft.com/office/drawing/2016/5/14/chartex" xmlns:mc="http://schemas.openxmlformats.org/markup-compatibility/2006" xmlns:aink="http://schemas.microsoft.com/office/drawing/2016/ink" xmlns:am3d="http://schemas.microsoft.com/office/drawing/2017/model3d" xmlns:o="urn:schemas-microsoft-com:office:office" xmlns:oel="http://schemas.microsoft.com/office/2019/extlst" xmlns:r="http://schemas.openxmlformats.org/officeDocument/2006/relationships" xmlns:m="http://schemas.openxmlformats.org/officeDocument/2006/math" xmlns:v="urn:schemas-microsoft-com:vml" xmlns:wp14="http://schemas.microsoft.com/office/word/2010/wordprocessingDrawing" xmlns:wp="http://schemas.openxmlformats.org/drawingml/2006/wordprocessingDrawing" xmlns:w10="urn:schemas-microsoft-com:office:word" xmlns:w="http://schemas.openxmlformats.org/wordprocessingml/2006/main" xmlns:w14="http://schemas.microsoft.com/office/word/2010/wordml" xmlns:w15="http://schemas.microsoft.com/office/word/2012/wordml" xmlns:w16cex="http://schemas.microsoft.com/office/word/2018/wordml/cex" xmlns:w16cid="http://schemas.microsoft.com/office/word/2016/wordml/cid" xmlns:w16="http://schemas.microsoft.com/office/word/2018/wordml" xmlns:w16du="http://schemas.microsoft.com/office/word/2023/wordml/word16du" xmlns:w16sdtdh="http://schemas.microsoft.com/office/word/2020/wordml/sdtdatahash" xmlns:w16sdtfl="http://schemas.microsoft.com/office/word/2024/wordml/sdtformatlock" xmlns:w16se="http://schemas.microsoft.com/office/word/2015/wordml/symex" xmlns:wpg="http://schemas.microsoft.com/office/word/2010/wordprocessingGroup" xmlns:wpi="http://schemas.microsoft.com/office/word/2010/wordprocessingInk" xmlns:wne="http://schemas.microsoft.com/office/word/2006/wordml" xmlns:wps="http://schemas.microsoft.com/office/word/2010/wordprocessingShape" mc:Ignorable="w14 w15 w16se w16cid w16 w16cex w16sdtdh w16sdtfl w16du wp14">
+<w:footnotes xmlns:wpc="http://schemas.microsoft.com/office/word/2010/wordprocessingCanvas" xmlns:cx="http://schemas.microsoft.com/office/drawing/2014/chartex" xmlns:cx1="http://schemas.microsoft.com/office/drawing/2015/9/8/chartex" xmlns:cx2="http://schemas.microsoft.com/office/drawing/2015/10/21/chartex" xmlns:cx3="http://schemas.microsoft.com/office/drawing/2016/5/9/chartex" xmlns:cx4="http://schemas.microsoft.com/office/drawing/2016/5/10/chartex" xmlns:cx5="http://schemas.microsoft.com/office/drawing/2016/5/11/chartex" xmlns:cx6="http://schemas.microsoft.com/office/drawing/2016/5/12/chartex" xmlns:cx7="http://schemas.microsoft.com/office/drawing/2016/5/13/chartex" xmlns:cx8="http://schemas.microsoft.com/office/drawing/2016/5/14/chartex" xmlns:mc="http://schemas.openxmlformats.org/markup-compatibility/2006" xmlns:aink="http://schemas.microsoft.com/office/drawing/2016/ink" xmlns:am3d="http://schemas.microsoft.com/office/drawing/2017/model3d" xmlns:o="urn:schemas-microsoft-com:office:office" xmlns:r="http://schemas.openxmlformats.org/officeDocument/2006/relationships" xmlns:m="http://schemas.openxmlformats.org/officeDocument/2006/math" xmlns:v="urn:schemas-microsoft-com:vml" xmlns:wp14="http://schemas.microsoft.com/office/word/2010/wordprocessingDrawing" xmlns:wp="http://schemas.openxmlformats.org/drawingml/2006/wordprocessingDrawing" xmlns:w10="urn:schemas-microsoft-com:office:word" xmlns:w="http://schemas.openxmlformats.org/wordprocessingml/2006/main" xmlns:w14="http://schemas.microsoft.com/office/word/2010/wordml" xmlns:w15="http://schemas.microsoft.com/office/word/2012/wordml" xmlns:w16cex="http://schemas.microsoft.com/office/word/2018/wordml/cex" xmlns:w16cid="http://schemas.microsoft.com/office/word/2016/wordml/cid" xmlns:w16="http://schemas.microsoft.com/office/word/2018/wordml" xmlns:w16sdtdh="http://schemas.microsoft.com/office/word/2020/wordml/sdtdatahash" xmlns:w16se="http://schemas.microsoft.com/office/word/2015/wordml/symex" xmlns:wpg="http://schemas.microsoft.com/office/word/2010/wordprocessingGroup" xmlns:wpi="http://schemas.microsoft.com/office/word/2010/wordprocessingInk" xmlns:wne="http://schemas.microsoft.com/office/word/2006/wordml" xmlns:wps="http://schemas.microsoft.com/office/word/2010/wordprocessingShape" mc:Ignorable="w14 w15 w16se w16cid w16 w16cex w16sdtdh wp14">
   <w:footnote w:type="separator" w:id="-1">
     <w:p>
       <w:r>
@@ -10178,7 +10146,7 @@
 </file>
 
 <file path=word/header1.xml><?xml version="1.0" encoding="utf-8"?>
-<w:hdr xmlns:wpc="http://schemas.microsoft.com/office/word/2010/wordprocessingCanvas" xmlns:cx="http://schemas.microsoft.com/office/drawing/2014/chartex" xmlns:cx1="http://schemas.microsoft.com/office/drawing/2015/9/8/chartex" xmlns:cx2="http://schemas.microsoft.com/office/drawing/2015/10/21/chartex" xmlns:cx3="http://schemas.microsoft.com/office/drawing/2016/5/9/chartex" xmlns:cx4="http://schemas.microsoft.com/office/drawing/2016/5/10/chartex" xmlns:cx5="http://schemas.microsoft.com/office/drawing/2016/5/11/chartex" xmlns:cx6="http://schemas.microsoft.com/office/drawing/2016/5/12/chartex" xmlns:cx7="http://schemas.microsoft.com/office/drawing/2016/5/13/chartex" xmlns:cx8="http://schemas.microsoft.com/office/drawing/2016/5/14/chartex" xmlns:mc="http://schemas.openxmlformats.org/markup-compatibility/2006" xmlns:aink="http://schemas.microsoft.com/office/drawing/2016/ink" xmlns:am3d="http://schemas.microsoft.com/office/drawing/2017/model3d" xmlns:o="urn:schemas-microsoft-com:office:office" xmlns:oel="http://schemas.microsoft.com/office/2019/extlst" xmlns:r="http://schemas.openxmlformats.org/officeDocument/2006/relationships" xmlns:m="http://schemas.openxmlformats.org/officeDocument/2006/math" xmlns:v="urn:schemas-microsoft-com:vml" xmlns:wp14="http://schemas.microsoft.com/office/word/2010/wordprocessingDrawing" xmlns:wp="http://schemas.openxmlformats.org/drawingml/2006/wordprocessingDrawing" xmlns:w10="urn:schemas-microsoft-com:office:word" xmlns:w="http://schemas.openxmlformats.org/wordprocessingml/2006/main" xmlns:w14="http://schemas.microsoft.com/office/word/2010/wordml" xmlns:w15="http://schemas.microsoft.com/office/word/2012/wordml" xmlns:w16cex="http://schemas.microsoft.com/office/word/2018/wordml/cex" xmlns:w16cid="http://schemas.microsoft.com/office/word/2016/wordml/cid" xmlns:w16="http://schemas.microsoft.com/office/word/2018/wordml" xmlns:w16du="http://schemas.microsoft.com/office/word/2023/wordml/word16du" xmlns:w16sdtdh="http://schemas.microsoft.com/office/word/2020/wordml/sdtdatahash" xmlns:w16sdtfl="http://schemas.microsoft.com/office/word/2024/wordml/sdtformatlock" xmlns:w16se="http://schemas.microsoft.com/office/word/2015/wordml/symex" xmlns:wpg="http://schemas.microsoft.com/office/word/2010/wordprocessingGroup" xmlns:wpi="http://schemas.microsoft.com/office/word/2010/wordprocessingInk" xmlns:wne="http://schemas.microsoft.com/office/word/2006/wordml" xmlns:wps="http://schemas.microsoft.com/office/word/2010/wordprocessingShape" mc:Ignorable="w14 w15 w16se w16cid w16 w16cex w16sdtdh w16sdtfl w16du wp14">
+<w:hdr xmlns:wpc="http://schemas.microsoft.com/office/word/2010/wordprocessingCanvas" xmlns:cx="http://schemas.microsoft.com/office/drawing/2014/chartex" xmlns:cx1="http://schemas.microsoft.com/office/drawing/2015/9/8/chartex" xmlns:cx2="http://schemas.microsoft.com/office/drawing/2015/10/21/chartex" xmlns:cx3="http://schemas.microsoft.com/office/drawing/2016/5/9/chartex" xmlns:cx4="http://schemas.microsoft.com/office/drawing/2016/5/10/chartex" xmlns:cx5="http://schemas.microsoft.com/office/drawing/2016/5/11/chartex" xmlns:cx6="http://schemas.microsoft.com/office/drawing/2016/5/12/chartex" xmlns:cx7="http://schemas.microsoft.com/office/drawing/2016/5/13/chartex" xmlns:cx8="http://schemas.microsoft.com/office/drawing/2016/5/14/chartex" xmlns:mc="http://schemas.openxmlformats.org/markup-compatibility/2006" xmlns:aink="http://schemas.microsoft.com/office/drawing/2016/ink" xmlns:am3d="http://schemas.microsoft.com/office/drawing/2017/model3d" xmlns:o="urn:schemas-microsoft-com:office:office" xmlns:r="http://schemas.openxmlformats.org/officeDocument/2006/relationships" xmlns:m="http://schemas.openxmlformats.org/officeDocument/2006/math" xmlns:v="urn:schemas-microsoft-com:vml" xmlns:wp14="http://schemas.microsoft.com/office/word/2010/wordprocessingDrawing" xmlns:wp="http://schemas.openxmlformats.org/drawingml/2006/wordprocessingDrawing" xmlns:w10="urn:schemas-microsoft-com:office:word" xmlns:w="http://schemas.openxmlformats.org/wordprocessingml/2006/main" xmlns:w14="http://schemas.microsoft.com/office/word/2010/wordml" xmlns:w15="http://schemas.microsoft.com/office/word/2012/wordml" xmlns:w16cex="http://schemas.microsoft.com/office/word/2018/wordml/cex" xmlns:w16cid="http://schemas.microsoft.com/office/word/2016/wordml/cid" xmlns:w16="http://schemas.microsoft.com/office/word/2018/wordml" xmlns:w16sdtdh="http://schemas.microsoft.com/office/word/2020/wordml/sdtdatahash" xmlns:w16se="http://schemas.microsoft.com/office/word/2015/wordml/symex" xmlns:wpg="http://schemas.microsoft.com/office/word/2010/wordprocessingGroup" xmlns:wpi="http://schemas.microsoft.com/office/word/2010/wordprocessingInk" xmlns:wne="http://schemas.microsoft.com/office/word/2006/wordml" xmlns:wps="http://schemas.microsoft.com/office/word/2010/wordprocessingShape" mc:Ignorable="w14 w15 w16se w16cid w16 w16cex w16sdtdh wp14">
   <w:p>
     <w:pPr>
       <w:pStyle w:val="Header"/>
@@ -10188,7 +10156,7 @@
 </file>
 
 <file path=word/header2.xml><?xml version="1.0" encoding="utf-8"?>
-<w:hdr xmlns:wpc="http://schemas.microsoft.com/office/word/2010/wordprocessingCanvas" xmlns:cx="http://schemas.microsoft.com/office/drawing/2014/chartex" xmlns:cx1="http://schemas.microsoft.com/office/drawing/2015/9/8/chartex" xmlns:cx2="http://schemas.microsoft.com/office/drawing/2015/10/21/chartex" xmlns:cx3="http://schemas.microsoft.com/office/drawing/2016/5/9/chartex" xmlns:cx4="http://schemas.microsoft.com/office/drawing/2016/5/10/chartex" xmlns:cx5="http://schemas.microsoft.com/office/drawing/2016/5/11/chartex" xmlns:cx6="http://schemas.microsoft.com/office/drawing/2016/5/12/chartex" xmlns:cx7="http://schemas.microsoft.com/office/drawing/2016/5/13/chartex" xmlns:cx8="http://schemas.microsoft.com/office/drawing/2016/5/14/chartex" xmlns:mc="http://schemas.openxmlformats.org/markup-compatibility/2006" xmlns:aink="http://schemas.microsoft.com/office/drawing/2016/ink" xmlns:am3d="http://schemas.microsoft.com/office/drawing/2017/model3d" xmlns:o="urn:schemas-microsoft-com:office:office" xmlns:oel="http://schemas.microsoft.com/office/2019/extlst" xmlns:r="http://schemas.openxmlformats.org/officeDocument/2006/relationships" xmlns:m="http://schemas.openxmlformats.org/officeDocument/2006/math" xmlns:v="urn:schemas-microsoft-com:vml" xmlns:wp14="http://schemas.microsoft.com/office/word/2010/wordprocessingDrawing" xmlns:wp="http://schemas.openxmlformats.org/drawingml/2006/wordprocessingDrawing" xmlns:w10="urn:schemas-microsoft-com:office:word" xmlns:w="http://schemas.openxmlformats.org/wordprocessingml/2006/main" xmlns:w14="http://schemas.microsoft.com/office/word/2010/wordml" xmlns:w15="http://schemas.microsoft.com/office/word/2012/wordml" xmlns:w16cex="http://schemas.microsoft.com/office/word/2018/wordml/cex" xmlns:w16cid="http://schemas.microsoft.com/office/word/2016/wordml/cid" xmlns:w16="http://schemas.microsoft.com/office/word/2018/wordml" xmlns:w16du="http://schemas.microsoft.com/office/word/2023/wordml/word16du" xmlns:w16sdtdh="http://schemas.microsoft.com/office/word/2020/wordml/sdtdatahash" xmlns:w16sdtfl="http://schemas.microsoft.com/office/word/2024/wordml/sdtformatlock" xmlns:w16se="http://schemas.microsoft.com/office/word/2015/wordml/symex" xmlns:wpg="http://schemas.microsoft.com/office/word/2010/wordprocessingGroup" xmlns:wpi="http://schemas.microsoft.com/office/word/2010/wordprocessingInk" xmlns:wne="http://schemas.microsoft.com/office/word/2006/wordml" xmlns:wps="http://schemas.microsoft.com/office/word/2010/wordprocessingShape" mc:Ignorable="w14 w15 w16se w16cid w16 w16cex w16sdtdh w16sdtfl w16du wp14">
+<w:hdr xmlns:wpc="http://schemas.microsoft.com/office/word/2010/wordprocessingCanvas" xmlns:cx="http://schemas.microsoft.com/office/drawing/2014/chartex" xmlns:cx1="http://schemas.microsoft.com/office/drawing/2015/9/8/chartex" xmlns:cx2="http://schemas.microsoft.com/office/drawing/2015/10/21/chartex" xmlns:cx3="http://schemas.microsoft.com/office/drawing/2016/5/9/chartex" xmlns:cx4="http://schemas.microsoft.com/office/drawing/2016/5/10/chartex" xmlns:cx5="http://schemas.microsoft.com/office/drawing/2016/5/11/chartex" xmlns:cx6="http://schemas.microsoft.com/office/drawing/2016/5/12/chartex" xmlns:cx7="http://schemas.microsoft.com/office/drawing/2016/5/13/chartex" xmlns:cx8="http://schemas.microsoft.com/office/drawing/2016/5/14/chartex" xmlns:mc="http://schemas.openxmlformats.org/markup-compatibility/2006" xmlns:aink="http://schemas.microsoft.com/office/drawing/2016/ink" xmlns:am3d="http://schemas.microsoft.com/office/drawing/2017/model3d" xmlns:o="urn:schemas-microsoft-com:office:office" xmlns:r="http://schemas.openxmlformats.org/officeDocument/2006/relationships" xmlns:m="http://schemas.openxmlformats.org/officeDocument/2006/math" xmlns:v="urn:schemas-microsoft-com:vml" xmlns:wp14="http://schemas.microsoft.com/office/word/2010/wordprocessingDrawing" xmlns:wp="http://schemas.openxmlformats.org/drawingml/2006/wordprocessingDrawing" xmlns:w10="urn:schemas-microsoft-com:office:word" xmlns:w="http://schemas.openxmlformats.org/wordprocessingml/2006/main" xmlns:w14="http://schemas.microsoft.com/office/word/2010/wordml" xmlns:w15="http://schemas.microsoft.com/office/word/2012/wordml" xmlns:w16cex="http://schemas.microsoft.com/office/word/2018/wordml/cex" xmlns:w16cid="http://schemas.microsoft.com/office/word/2016/wordml/cid" xmlns:w16="http://schemas.microsoft.com/office/word/2018/wordml" xmlns:w16sdtdh="http://schemas.microsoft.com/office/word/2020/wordml/sdtdatahash" xmlns:w16se="http://schemas.microsoft.com/office/word/2015/wordml/symex" xmlns:wpg="http://schemas.microsoft.com/office/word/2010/wordprocessingGroup" xmlns:wpi="http://schemas.microsoft.com/office/word/2010/wordprocessingInk" xmlns:wne="http://schemas.microsoft.com/office/word/2006/wordml" xmlns:wps="http://schemas.microsoft.com/office/word/2010/wordprocessingShape" mc:Ignorable="w14 w15 w16se w16cid w16 w16cex w16sdtdh wp14">
   <w:p>
     <w:pPr>
       <w:pBdr>
@@ -10231,7 +10199,7 @@
 </file>
 
 <file path=word/header3.xml><?xml version="1.0" encoding="utf-8"?>
-<w:hdr xmlns:wpc="http://schemas.microsoft.com/office/word/2010/wordprocessingCanvas" xmlns:cx="http://schemas.microsoft.com/office/drawing/2014/chartex" xmlns:cx1="http://schemas.microsoft.com/office/drawing/2015/9/8/chartex" xmlns:cx2="http://schemas.microsoft.com/office/drawing/2015/10/21/chartex" xmlns:cx3="http://schemas.microsoft.com/office/drawing/2016/5/9/chartex" xmlns:cx4="http://schemas.microsoft.com/office/drawing/2016/5/10/chartex" xmlns:cx5="http://schemas.microsoft.com/office/drawing/2016/5/11/chartex" xmlns:cx6="http://schemas.microsoft.com/office/drawing/2016/5/12/chartex" xmlns:cx7="http://schemas.microsoft.com/office/drawing/2016/5/13/chartex" xmlns:cx8="http://schemas.microsoft.com/office/drawing/2016/5/14/chartex" xmlns:mc="http://schemas.openxmlformats.org/markup-compatibility/2006" xmlns:aink="http://schemas.microsoft.com/office/drawing/2016/ink" xmlns:am3d="http://schemas.microsoft.com/office/drawing/2017/model3d" xmlns:o="urn:schemas-microsoft-com:office:office" xmlns:oel="http://schemas.microsoft.com/office/2019/extlst" xmlns:r="http://schemas.openxmlformats.org/officeDocument/2006/relationships" xmlns:m="http://schemas.openxmlformats.org/officeDocument/2006/math" xmlns:v="urn:schemas-microsoft-com:vml" xmlns:wp14="http://schemas.microsoft.com/office/word/2010/wordprocessingDrawing" xmlns:wp="http://schemas.openxmlformats.org/drawingml/2006/wordprocessingDrawing" xmlns:w10="urn:schemas-microsoft-com:office:word" xmlns:w="http://schemas.openxmlformats.org/wordprocessingml/2006/main" xmlns:w14="http://schemas.microsoft.com/office/word/2010/wordml" xmlns:w15="http://schemas.microsoft.com/office/word/2012/wordml" xmlns:w16cex="http://schemas.microsoft.com/office/word/2018/wordml/cex" xmlns:w16cid="http://schemas.microsoft.com/office/word/2016/wordml/cid" xmlns:w16="http://schemas.microsoft.com/office/word/2018/wordml" xmlns:w16du="http://schemas.microsoft.com/office/word/2023/wordml/word16du" xmlns:w16sdtdh="http://schemas.microsoft.com/office/word/2020/wordml/sdtdatahash" xmlns:w16sdtfl="http://schemas.microsoft.com/office/word/2024/wordml/sdtformatlock" xmlns:w16se="http://schemas.microsoft.com/office/word/2015/wordml/symex" xmlns:wpg="http://schemas.microsoft.com/office/word/2010/wordprocessingGroup" xmlns:wpi="http://schemas.microsoft.com/office/word/2010/wordprocessingInk" xmlns:wne="http://schemas.microsoft.com/office/word/2006/wordml" xmlns:wps="http://schemas.microsoft.com/office/word/2010/wordprocessingShape" mc:Ignorable="w14 w15 w16se w16cid w16 w16cex w16sdtdh w16sdtfl w16du wp14">
+<w:hdr xmlns:wpc="http://schemas.microsoft.com/office/word/2010/wordprocessingCanvas" xmlns:cx="http://schemas.microsoft.com/office/drawing/2014/chartex" xmlns:cx1="http://schemas.microsoft.com/office/drawing/2015/9/8/chartex" xmlns:cx2="http://schemas.microsoft.com/office/drawing/2015/10/21/chartex" xmlns:cx3="http://schemas.microsoft.com/office/drawing/2016/5/9/chartex" xmlns:cx4="http://schemas.microsoft.com/office/drawing/2016/5/10/chartex" xmlns:cx5="http://schemas.microsoft.com/office/drawing/2016/5/11/chartex" xmlns:cx6="http://schemas.microsoft.com/office/drawing/2016/5/12/chartex" xmlns:cx7="http://schemas.microsoft.com/office/drawing/2016/5/13/chartex" xmlns:cx8="http://schemas.microsoft.com/office/drawing/2016/5/14/chartex" xmlns:mc="http://schemas.openxmlformats.org/markup-compatibility/2006" xmlns:aink="http://schemas.microsoft.com/office/drawing/2016/ink" xmlns:am3d="http://schemas.microsoft.com/office/drawing/2017/model3d" xmlns:o="urn:schemas-microsoft-com:office:office" xmlns:r="http://schemas.openxmlformats.org/officeDocument/2006/relationships" xmlns:m="http://schemas.openxmlformats.org/officeDocument/2006/math" xmlns:v="urn:schemas-microsoft-com:vml" xmlns:wp14="http://schemas.microsoft.com/office/word/2010/wordprocessingDrawing" xmlns:wp="http://schemas.openxmlformats.org/drawingml/2006/wordprocessingDrawing" xmlns:w10="urn:schemas-microsoft-com:office:word" xmlns:w="http://schemas.openxmlformats.org/wordprocessingml/2006/main" xmlns:w14="http://schemas.microsoft.com/office/word/2010/wordml" xmlns:w15="http://schemas.microsoft.com/office/word/2012/wordml" xmlns:w16cex="http://schemas.microsoft.com/office/word/2018/wordml/cex" xmlns:w16cid="http://schemas.microsoft.com/office/word/2016/wordml/cid" xmlns:w16="http://schemas.microsoft.com/office/word/2018/wordml" xmlns:w16sdtdh="http://schemas.microsoft.com/office/word/2020/wordml/sdtdatahash" xmlns:w16se="http://schemas.microsoft.com/office/word/2015/wordml/symex" xmlns:wpg="http://schemas.microsoft.com/office/word/2010/wordprocessingGroup" xmlns:wpi="http://schemas.microsoft.com/office/word/2010/wordprocessingInk" xmlns:wne="http://schemas.microsoft.com/office/word/2006/wordml" xmlns:wps="http://schemas.microsoft.com/office/word/2010/wordprocessingShape" mc:Ignorable="w14 w15 w16se w16cid w16 w16cex w16sdtdh wp14">
   <w:p>
     <w:pPr>
       <w:pStyle w:val="Header"/>
@@ -10241,7 +10209,7 @@
 </file>
 
 <file path=word/numbering.xml><?xml version="1.0" encoding="utf-8"?>
-<w:numbering xmlns:wpc="http://schemas.microsoft.com/office/word/2010/wordprocessingCanvas" xmlns:cx="http://schemas.microsoft.com/office/drawing/2014/chartex" xmlns:cx1="http://schemas.microsoft.com/office/drawing/2015/9/8/chartex" xmlns:cx2="http://schemas.microsoft.com/office/drawing/2015/10/21/chartex" xmlns:cx3="http://schemas.microsoft.com/office/drawing/2016/5/9/chartex" xmlns:cx4="http://schemas.microsoft.com/office/drawing/2016/5/10/chartex" xmlns:cx5="http://schemas.microsoft.com/office/drawing/2016/5/11/chartex" xmlns:cx6="http://schemas.microsoft.com/office/drawing/2016/5/12/chartex" xmlns:cx7="http://schemas.microsoft.com/office/drawing/2016/5/13/chartex" xmlns:cx8="http://schemas.microsoft.com/office/drawing/2016/5/14/chartex" xmlns:mc="http://schemas.openxmlformats.org/markup-compatibility/2006" xmlns:aink="http://schemas.microsoft.com/office/drawing/2016/ink" xmlns:am3d="http://schemas.microsoft.com/office/drawing/2017/model3d" xmlns:o="urn:schemas-microsoft-com:office:office" xmlns:oel="http://schemas.microsoft.com/office/2019/extlst" xmlns:r="http://schemas.openxmlformats.org/officeDocument/2006/relationships" xmlns:m="http://schemas.openxmlformats.org/officeDocument/2006/math" xmlns:v="urn:schemas-microsoft-com:vml" xmlns:wp14="http://schemas.microsoft.com/office/word/2010/wordprocessingDrawing" xmlns:wp="http://schemas.openxmlformats.org/drawingml/2006/wordprocessingDrawing" xmlns:w10="urn:schemas-microsoft-com:office:word" xmlns:w="http://schemas.openxmlformats.org/wordprocessingml/2006/main" xmlns:w14="http://schemas.microsoft.com/office/word/2010/wordml" xmlns:w15="http://schemas.microsoft.com/office/word/2012/wordml" xmlns:w16cex="http://schemas.microsoft.com/office/word/2018/wordml/cex" xmlns:w16cid="http://schemas.microsoft.com/office/word/2016/wordml/cid" xmlns:w16="http://schemas.microsoft.com/office/word/2018/wordml" xmlns:w16du="http://schemas.microsoft.com/office/word/2023/wordml/word16du" xmlns:w16sdtdh="http://schemas.microsoft.com/office/word/2020/wordml/sdtdatahash" xmlns:w16sdtfl="http://schemas.microsoft.com/office/word/2024/wordml/sdtformatlock" xmlns:w16se="http://schemas.microsoft.com/office/word/2015/wordml/symex" xmlns:wpg="http://schemas.microsoft.com/office/word/2010/wordprocessingGroup" xmlns:wpi="http://schemas.microsoft.com/office/word/2010/wordprocessingInk" xmlns:wne="http://schemas.microsoft.com/office/word/2006/wordml" xmlns:wps="http://schemas.microsoft.com/office/word/2010/wordprocessingShape" mc:Ignorable="w14 w15 w16se w16cid w16 w16cex w16sdtdh w16sdtfl w16du wp14">
+<w:numbering xmlns:wpc="http://schemas.microsoft.com/office/word/2010/wordprocessingCanvas" xmlns:cx="http://schemas.microsoft.com/office/drawing/2014/chartex" xmlns:cx1="http://schemas.microsoft.com/office/drawing/2015/9/8/chartex" xmlns:cx2="http://schemas.microsoft.com/office/drawing/2015/10/21/chartex" xmlns:cx3="http://schemas.microsoft.com/office/drawing/2016/5/9/chartex" xmlns:cx4="http://schemas.microsoft.com/office/drawing/2016/5/10/chartex" xmlns:cx5="http://schemas.microsoft.com/office/drawing/2016/5/11/chartex" xmlns:cx6="http://schemas.microsoft.com/office/drawing/2016/5/12/chartex" xmlns:cx7="http://schemas.microsoft.com/office/drawing/2016/5/13/chartex" xmlns:cx8="http://schemas.microsoft.com/office/drawing/2016/5/14/chartex" xmlns:mc="http://schemas.openxmlformats.org/markup-compatibility/2006" xmlns:aink="http://schemas.microsoft.com/office/drawing/2016/ink" xmlns:am3d="http://schemas.microsoft.com/office/drawing/2017/model3d" xmlns:o="urn:schemas-microsoft-com:office:office" xmlns:r="http://schemas.openxmlformats.org/officeDocument/2006/relationships" xmlns:m="http://schemas.openxmlformats.org/officeDocument/2006/math" xmlns:v="urn:schemas-microsoft-com:vml" xmlns:wp14="http://schemas.microsoft.com/office/word/2010/wordprocessingDrawing" xmlns:wp="http://schemas.openxmlformats.org/drawingml/2006/wordprocessingDrawing" xmlns:w10="urn:schemas-microsoft-com:office:word" xmlns:w="http://schemas.openxmlformats.org/wordprocessingml/2006/main" xmlns:w14="http://schemas.microsoft.com/office/word/2010/wordml" xmlns:w15="http://schemas.microsoft.com/office/word/2012/wordml" xmlns:w16cex="http://schemas.microsoft.com/office/word/2018/wordml/cex" xmlns:w16cid="http://schemas.microsoft.com/office/word/2016/wordml/cid" xmlns:w16="http://schemas.microsoft.com/office/word/2018/wordml" xmlns:w16sdtdh="http://schemas.microsoft.com/office/word/2020/wordml/sdtdatahash" xmlns:w16se="http://schemas.microsoft.com/office/word/2015/wordml/symex" xmlns:wpg="http://schemas.microsoft.com/office/word/2010/wordprocessingGroup" xmlns:wpi="http://schemas.microsoft.com/office/word/2010/wordprocessingInk" xmlns:wne="http://schemas.microsoft.com/office/word/2006/wordml" xmlns:wps="http://schemas.microsoft.com/office/word/2010/wordprocessingShape" mc:Ignorable="w14 w15 w16se w16cid w16 w16cex w16sdtdh wp14">
   <w:abstractNum w:abstractNumId="0" w15:restartNumberingAfterBreak="0">
     <w:nsid w:val="19B85A84"/>
     <w:multiLevelType w:val="hybridMultilevel"/>
@@ -10552,41 +10520,41 @@
       <w:lvlJc w:val="left"/>
     </w:lvl>
   </w:abstractNum>
-  <w:num w:numId="1" w16cid:durableId="1548451513">
+  <w:num w:numId="1">
     <w:abstractNumId w:val="2"/>
     <w:lvlOverride w:ilvl="0">
       <w:startOverride w:val="1"/>
     </w:lvlOverride>
   </w:num>
-  <w:num w:numId="2" w16cid:durableId="406927219">
+  <w:num w:numId="2">
     <w:abstractNumId w:val="0"/>
     <w:lvlOverride w:ilvl="0">
       <w:startOverride w:val="1"/>
     </w:lvlOverride>
   </w:num>
-  <w:num w:numId="3" w16cid:durableId="1209684877">
+  <w:num w:numId="3">
     <w:abstractNumId w:val="1"/>
     <w:lvlOverride w:ilvl="0">
       <w:startOverride w:val="1"/>
     </w:lvlOverride>
   </w:num>
-  <w:num w:numId="4" w16cid:durableId="188567385">
+  <w:num w:numId="4">
     <w:abstractNumId w:val="0"/>
   </w:num>
-  <w:num w:numId="5" w16cid:durableId="751972918">
+  <w:num w:numId="5">
     <w:abstractNumId w:val="4"/>
   </w:num>
-  <w:num w:numId="6" w16cid:durableId="1298678207">
+  <w:num w:numId="6">
     <w:abstractNumId w:val="1"/>
   </w:num>
-  <w:num w:numId="7" w16cid:durableId="143203211">
+  <w:num w:numId="7">
     <w:abstractNumId w:val="3"/>
   </w:num>
 </w:numbering>
 </file>
 
 <file path=word/styles.xml><?xml version="1.0" encoding="utf-8"?>
-<w:styles xmlns:mc="http://schemas.openxmlformats.org/markup-compatibility/2006" xmlns:r="http://schemas.openxmlformats.org/officeDocument/2006/relationships" xmlns:w="http://schemas.openxmlformats.org/wordprocessingml/2006/main" xmlns:w14="http://schemas.microsoft.com/office/word/2010/wordml" xmlns:w15="http://schemas.microsoft.com/office/word/2012/wordml" xmlns:w16cex="http://schemas.microsoft.com/office/word/2018/wordml/cex" xmlns:w16cid="http://schemas.microsoft.com/office/word/2016/wordml/cid" xmlns:w16="http://schemas.microsoft.com/office/word/2018/wordml" xmlns:w16du="http://schemas.microsoft.com/office/word/2023/wordml/word16du" xmlns:w16sdtdh="http://schemas.microsoft.com/office/word/2020/wordml/sdtdatahash" xmlns:w16sdtfl="http://schemas.microsoft.com/office/word/2024/wordml/sdtformatlock" xmlns:w16se="http://schemas.microsoft.com/office/word/2015/wordml/symex" mc:Ignorable="w14 w15 w16se w16cid w16 w16cex w16sdtdh w16sdtfl w16du">
+<w:styles xmlns:mc="http://schemas.openxmlformats.org/markup-compatibility/2006" xmlns:r="http://schemas.openxmlformats.org/officeDocument/2006/relationships" xmlns:w="http://schemas.openxmlformats.org/wordprocessingml/2006/main" xmlns:w14="http://schemas.microsoft.com/office/word/2010/wordml" xmlns:w15="http://schemas.microsoft.com/office/word/2012/wordml" xmlns:w16cex="http://schemas.microsoft.com/office/word/2018/wordml/cex" xmlns:w16cid="http://schemas.microsoft.com/office/word/2016/wordml/cid" xmlns:w16="http://schemas.microsoft.com/office/word/2018/wordml" xmlns:w16sdtdh="http://schemas.microsoft.com/office/word/2020/wordml/sdtdatahash" xmlns:w16se="http://schemas.microsoft.com/office/word/2015/wordml/symex" mc:Ignorable="w14 w15 w16se w16cid w16 w16cex w16sdtdh">
   <w:docDefaults>
     <w:rPrDefault>
       <w:rPr>

</xml_diff>

<commit_message>
Added Add Task page (add-task.html) – Zaid
</commit_message>
<xml_diff>
--- a/DF_Assignment_04_Spring_2026.docx
+++ b/DF_Assignment_04_Spring_2026.docx
@@ -92,25 +92,7 @@
           <w:sz w:val="24"/>
           <w:szCs w:val="24"/>
         </w:rPr>
-        <w:t xml:space="preserve">Students will design and implement a complete CI/CD pipeline for a containerized web </w:t>
-      </w:r>
-      <w:r>
-        <w:rPr>
-          <w:rFonts w:ascii="Arial" w:eastAsia="Arial" w:hAnsi="Arial" w:cs="Arial"/>
-          <w:color w:val="000000"/>
-          <w:sz w:val="24"/>
-          <w:szCs w:val="24"/>
-        </w:rPr>
-        <w:t>application by integrating a CI workflow (triggered on a Pull Request) with a CD workflow (triggered on a merge/push to the develop branch). The assignment covers creating a fresh GitHub repository, versioning the assignment document, configuring GitHub En</w:t>
-      </w:r>
-      <w:r>
-        <w:rPr>
-          <w:rFonts w:ascii="Arial" w:eastAsia="Arial" w:hAnsi="Arial" w:cs="Arial"/>
-          <w:color w:val="000000"/>
-          <w:sz w:val="24"/>
-          <w:szCs w:val="24"/>
-        </w:rPr>
-        <w:t>vironments, managing secrets, and chaining two GitHub Actions workflows.</w:t>
+        <w:t>Students will design and implement a complete CI/CD pipeline for a containerized web application by integrating a CI workflow (triggered on a Pull Request) with a CD workflow (triggered on a merge/push to the develop branch). The assignment covers creating a fresh GitHub repository, versioning the assignment document, configuring GitHub Environments, managing secrets, and chaining two GitHub Actions workflows.</w:t>
       </w:r>
     </w:p>
     <w:p>
@@ -182,16 +164,7 @@
           <w:sz w:val="24"/>
           <w:szCs w:val="24"/>
         </w:rPr>
-        <w:t xml:space="preserve">Version the assignment question paper </w:t>
-      </w:r>
-      <w:r>
-        <w:rPr>
-          <w:rFonts w:ascii="Arial" w:eastAsia="Arial" w:hAnsi="Arial" w:cs="Arial"/>
-          <w:color w:val="000000"/>
-          <w:sz w:val="24"/>
-          <w:szCs w:val="24"/>
-        </w:rPr>
-        <w:t>inside the GitHub repository.</w:t>
+        <w:t>Version the assignment question paper inside the GitHub repository.</w:t>
       </w:r>
     </w:p>
     <w:p>
@@ -278,16 +251,7 @@
           <w:sz w:val="24"/>
           <w:szCs w:val="24"/>
         </w:rPr>
-        <w:t>Design and implement a CD workflow triggered by a p</w:t>
-      </w:r>
-      <w:r>
-        <w:rPr>
-          <w:rFonts w:ascii="Arial" w:eastAsia="Arial" w:hAnsi="Arial" w:cs="Arial"/>
-          <w:color w:val="000000"/>
-          <w:sz w:val="24"/>
-          <w:szCs w:val="24"/>
-        </w:rPr>
-        <w:t xml:space="preserve">ush event on the </w:t>
+        <w:t xml:space="preserve">Design and implement a CD workflow triggered by a push event on the </w:t>
       </w:r>
       <w:r>
         <w:rPr>
@@ -430,16 +394,7 @@
           <w:sz w:val="24"/>
           <w:szCs w:val="24"/>
         </w:rPr>
-        <w:t xml:space="preserve">New Repository: Students MUST create a brand-new GitHub repository for this assignment. Do NOT reuse or fork any </w:t>
-      </w:r>
-      <w:r>
-        <w:rPr>
-          <w:rFonts w:ascii="Arial" w:eastAsia="Arial" w:hAnsi="Arial" w:cs="Arial"/>
-          <w:color w:val="000000"/>
-          <w:sz w:val="24"/>
-          <w:szCs w:val="24"/>
-        </w:rPr>
-        <w:t>repository from a previous assignment.</w:t>
+        <w:t>New Repository: Students MUST create a brand-new GitHub repository for this assignment. Do NOT reuse or fork any repository from a previous assignment.</w:t>
       </w:r>
     </w:p>
     <w:p>
@@ -462,16 +417,7 @@
           <w:sz w:val="24"/>
           <w:szCs w:val="24"/>
         </w:rPr>
-        <w:t xml:space="preserve">Assignment Document in Repo: The Assignment 04 question paper (this .docx file) must be committed to the root of the repository. Each student must fill in their own details in their respective row in Table 1 </w:t>
-      </w:r>
-      <w:r>
-        <w:rPr>
-          <w:rFonts w:ascii="Arial" w:eastAsia="Arial" w:hAnsi="Arial" w:cs="Arial"/>
-          <w:color w:val="000000"/>
-          <w:sz w:val="24"/>
-          <w:szCs w:val="24"/>
-        </w:rPr>
-        <w:t>(Group Details) directly inside the versioned document.</w:t>
+        <w:t>Assignment Document in Repo: The Assignment 04 question paper (this .docx file) must be committed to the root of the repository. Each student must fill in their own details in their respective row in Table 1 (Group Details) directly inside the versioned document.</w:t>
       </w:r>
     </w:p>
     <w:p>
@@ -494,16 +440,7 @@
           <w:sz w:val="24"/>
           <w:szCs w:val="24"/>
         </w:rPr>
-        <w:t>Secrets Ownership: All GitHub secrets (DOCKERHUB_USERNAME, DOCKERHUB_TOKEN, RENDER_DEPLOY_HOOK_URL) must be created by the Team Lead using the TL's own Docker Hub and Render credentials. No team membe</w:t>
-      </w:r>
-      <w:r>
-        <w:rPr>
-          <w:rFonts w:ascii="Arial" w:eastAsia="Arial" w:hAnsi="Arial" w:cs="Arial"/>
-          <w:color w:val="000000"/>
-          <w:sz w:val="24"/>
-          <w:szCs w:val="24"/>
-        </w:rPr>
-        <w:t>r other than the TL should create or modify secrets.</w:t>
+        <w:t>Secrets Ownership: All GitHub secrets (DOCKERHUB_USERNAME, DOCKERHUB_TOKEN, RENDER_DEPLOY_HOOK_URL) must be created by the Team Lead using the TL's own Docker Hub and Render credentials. No team member other than the TL should create or modify secrets.</w:t>
       </w:r>
     </w:p>
     <w:p>
@@ -549,16 +486,7 @@
           <w:sz w:val="24"/>
           <w:szCs w:val="24"/>
         </w:rPr>
-        <w:t xml:space="preserve">Only the Team Lead will submit the final document to the </w:t>
-      </w:r>
-      <w:r>
-        <w:rPr>
-          <w:rFonts w:ascii="Arial" w:eastAsia="Arial" w:hAnsi="Arial" w:cs="Arial"/>
-          <w:color w:val="000000"/>
-          <w:sz w:val="24"/>
-          <w:szCs w:val="24"/>
-        </w:rPr>
-        <w:t>LMS.</w:t>
+        <w:t>Only the Team Lead will submit the final document to the LMS.</w:t>
       </w:r>
     </w:p>
     <w:p>
@@ -686,18 +614,7 @@
           <w:sz w:val="18"/>
           <w:szCs w:val="18"/>
         </w:rPr>
-        <w:t xml:space="preserve"> Each student must fill their own</w:t>
-      </w:r>
-      <w:r>
-        <w:rPr>
-          <w:rFonts w:ascii="Arial" w:eastAsia="Arial" w:hAnsi="Arial" w:cs="Arial"/>
-          <w:b/>
-          <w:bCs/>
-          <w:color w:val="444444"/>
-          <w:sz w:val="18"/>
-          <w:szCs w:val="18"/>
-        </w:rPr>
-        <w:t xml:space="preserve"> row (including Assigned Page) in the versioned copy inside the repo</w:t>
+        <w:t xml:space="preserve"> Each student must fill their own row (including Assigned Page) in the versioned copy inside the repo</w:t>
       </w:r>
     </w:p>
     <w:tbl>
@@ -719,12 +636,12 @@
       </w:tblPr>
       <w:tblGrid>
         <w:gridCol w:w="471"/>
-        <w:gridCol w:w="1424"/>
-        <w:gridCol w:w="1349"/>
+        <w:gridCol w:w="1071"/>
+        <w:gridCol w:w="1314"/>
         <w:gridCol w:w="1561"/>
-        <w:gridCol w:w="1306"/>
-        <w:gridCol w:w="1596"/>
-        <w:gridCol w:w="1653"/>
+        <w:gridCol w:w="1184"/>
+        <w:gridCol w:w="2324"/>
+        <w:gridCol w:w="1435"/>
       </w:tblGrid>
       <w:tr>
         <w:trPr>
@@ -1156,7 +1073,11 @@
             </w:tcMar>
             <w:vAlign w:val="center"/>
           </w:tcPr>
-          <w:p/>
+          <w:p>
+            <w:r>
+              <w:t>Zaid</w:t>
+            </w:r>
+          </w:p>
         </w:tc>
         <w:tc>
           <w:tcPr>
@@ -1176,7 +1097,11 @@
             </w:tcMar>
             <w:vAlign w:val="center"/>
           </w:tcPr>
-          <w:p/>
+          <w:p>
+            <w:r>
+              <w:t>zaidchughtai</w:t>
+            </w:r>
+          </w:p>
         </w:tc>
         <w:tc>
           <w:tcPr>
@@ -1196,7 +1121,11 @@
             </w:tcMar>
             <w:vAlign w:val="center"/>
           </w:tcPr>
-          <w:p/>
+          <w:p>
+            <w:r>
+              <w:t>Member</w:t>
+            </w:r>
+          </w:p>
         </w:tc>
         <w:tc>
           <w:tcPr>
@@ -1216,7 +1145,11 @@
             </w:tcMar>
             <w:vAlign w:val="center"/>
           </w:tcPr>
-          <w:p/>
+          <w:p>
+            <w:r>
+              <w:t>add-task.html</w:t>
+            </w:r>
+          </w:p>
         </w:tc>
         <w:tc>
           <w:tcPr>
@@ -1236,7 +1169,17 @@
             </w:tcMar>
             <w:vAlign w:val="center"/>
           </w:tcPr>
-          <w:p/>
+          <w:p>
+            <w:r>
+              <w:t>feature/zaid</w:t>
+            </w:r>
+            <w:r>
+              <w:t>chughtai</w:t>
+            </w:r>
+            <w:r>
+              <w:t>/add-task</w:t>
+            </w:r>
+          </w:p>
         </w:tc>
         <w:tc>
           <w:tcPr>
@@ -1710,13 +1653,7 @@
           </w:tcPr>
           <w:p>
             <w:r>
-              <w:t>feature/</w:t>
-            </w:r>
-            <w:r>
-              <w:t>sufyan-majeed</w:t>
-            </w:r>
-            <w:r>
-              <w:t>/about</w:t>
+              <w:t>feature/sufyan-majeed/about</w:t>
             </w:r>
           </w:p>
         </w:tc>
@@ -1841,14 +1778,7 @@
           <w:rFonts w:ascii="Arial" w:eastAsia="Arial" w:hAnsi="Arial" w:cs="Arial"/>
           <w:color w:val="000000"/>
         </w:rPr>
-        <w:t xml:space="preserve">Your team is the development crew for TaskFlow, a lightweight task-management web application consisting of five HTML pages. The Team Lead </w:t>
-      </w:r>
-      <w:r>
-        <w:rPr>
-          <w:rFonts w:ascii="Arial" w:eastAsia="Arial" w:hAnsi="Arial" w:cs="Arial"/>
-          <w:color w:val="000000"/>
-        </w:rPr>
-        <w:t>sets up the repository, Dockerfile, shared stylesheet, and the CI/CD pipelines. Each team member is then individually responsible for building one specific page of the application, following the full Git, GitHub, and Docker flow independently.</w:t>
+        <w:t>Your team is the development crew for TaskFlow, a lightweight task-management web application consisting of five HTML pages. The Team Lead sets up the repository, Dockerfile, shared stylesheet, and the CI/CD pipelines. Each team member is then individually responsible for building one specific page of the application, following the full Git, GitHub, and Docker flow independently.</w:t>
       </w:r>
     </w:p>
     <w:p>
@@ -1866,14 +1796,7 @@
           <w:rFonts w:ascii="Arial" w:eastAsia="Arial" w:hAnsi="Arial" w:cs="Arial"/>
           <w:color w:val="000000"/>
         </w:rPr>
-        <w:t>The 5 pages</w:t>
-      </w:r>
-      <w:r>
-        <w:rPr>
-          <w:rFonts w:ascii="Arial" w:eastAsia="Arial" w:hAnsi="Arial" w:cs="Arial"/>
-          <w:color w:val="000000"/>
-        </w:rPr>
-        <w:t xml:space="preserve"> of the TaskFlow application and their assignment are defined in Table 3 below. The Team Lead takes Page 1 (Home / Dashboard) in addition to their setup responsibilities.</w:t>
+        <w:t>The 5 pages of the TaskFlow application and their assignment are defined in Table 3 below. The Team Lead takes Page 1 (Home / Dashboard) in addition to their setup responsibilities.</w:t>
       </w:r>
     </w:p>
     <w:p>
@@ -2445,16 +2368,7 @@
                 <w:sz w:val="18"/>
                 <w:szCs w:val="18"/>
               </w:rPr>
-              <w:t xml:space="preserve">A table listing all tasks with columns for title, due date, priority, and status. </w:t>
-            </w:r>
-            <w:r>
-              <w:rPr>
-                <w:rFonts w:ascii="Arial" w:eastAsia="Arial" w:hAnsi="Arial" w:cs="Arial"/>
-                <w:color w:val="000000"/>
-                <w:sz w:val="18"/>
-                <w:szCs w:val="18"/>
-              </w:rPr>
-              <w:t>Includes basic filter buttons (All / Pending / Completed).</w:t>
+              <w:t>A table listing all tasks with columns for title, due date, priority, and status. Includes basic filter buttons (All / Pending / Completed).</w:t>
             </w:r>
           </w:p>
         </w:tc>
@@ -2614,6 +2528,7 @@
                 <w:sz w:val="18"/>
                 <w:szCs w:val="18"/>
               </w:rPr>
+              <w:lastRenderedPageBreak/>
               <w:t>5</w:t>
             </w:r>
           </w:p>
@@ -2706,16 +2621,7 @@
                 <w:sz w:val="18"/>
                 <w:szCs w:val="18"/>
               </w:rPr>
-              <w:t xml:space="preserve">A page </w:t>
-            </w:r>
-            <w:r>
-              <w:rPr>
-                <w:rFonts w:ascii="Arial" w:eastAsia="Arial" w:hAnsi="Arial" w:cs="Arial"/>
-                <w:color w:val="000000"/>
-                <w:sz w:val="18"/>
-                <w:szCs w:val="18"/>
-              </w:rPr>
-              <w:t>describing the TaskFlow application, its purpose, and a simple usage guide explaining how to navigate and use the app.</w:t>
+              <w:t>A page describing the TaskFlow application, its purpose, and a simple usage guide explaining how to navigate and use the app.</w:t>
             </w:r>
           </w:p>
         </w:tc>
@@ -2803,14 +2709,7 @@
           <w:rFonts w:ascii="Arial" w:eastAsia="Arial" w:hAnsi="Arial" w:cs="Arial"/>
           <w:color w:val="000000"/>
         </w:rPr>
-        <w:t xml:space="preserve">Commit the page file and push the feature branch to </w:t>
-      </w:r>
-      <w:r>
-        <w:rPr>
-          <w:rFonts w:ascii="Arial" w:eastAsia="Arial" w:hAnsi="Arial" w:cs="Arial"/>
-          <w:color w:val="000000"/>
-        </w:rPr>
-        <w:t>GitHub.</w:t>
+        <w:t>Commit the page file and push the feature branch to GitHub.</w:t>
       </w:r>
     </w:p>
     <w:p>
@@ -2872,14 +2771,7 @@
           <w:rFonts w:ascii="Arial" w:eastAsia="Arial" w:hAnsi="Arial" w:cs="Arial"/>
           <w:color w:val="000000"/>
         </w:rPr>
-        <w:t>, which triggers the</w:t>
-      </w:r>
-      <w:r>
-        <w:rPr>
-          <w:rFonts w:ascii="Arial" w:eastAsia="Arial" w:hAnsi="Arial" w:cs="Arial"/>
-          <w:color w:val="000000"/>
-        </w:rPr>
-        <w:t xml:space="preserve"> CD workflow and deploys the updated application to Render.</w:t>
+        <w:t>, which triggers the CD workflow and deploys the updated application to Render.</w:t>
       </w:r>
     </w:p>
     <w:p>
@@ -2965,14 +2857,7 @@
           <w:rFonts w:ascii="Arial" w:eastAsia="Arial" w:hAnsi="Arial" w:cs="Arial"/>
           <w:color w:val="000000"/>
         </w:rPr>
-        <w:t xml:space="preserve">Create a new public GitHub repository named </w:t>
-      </w:r>
-      <w:r>
-        <w:rPr>
-          <w:rFonts w:ascii="Arial" w:eastAsia="Arial" w:hAnsi="Arial" w:cs="Arial"/>
-          <w:color w:val="000000"/>
-        </w:rPr>
-        <w:t>taskflow-cicd (or a name agreed by the team). Do NOT clone or fork any existing repository.</w:t>
+        <w:t>Create a new public GitHub repository named taskflow-cicd (or a name agreed by the team). Do NOT clone or fork any existing repository.</w:t>
       </w:r>
     </w:p>
     <w:p>
@@ -3034,14 +2919,7 @@
           <w:rFonts w:ascii="Arial" w:eastAsia="Arial" w:hAnsi="Arial" w:cs="Arial"/>
           <w:color w:val="000000"/>
         </w:rPr>
-        <w:t>: require at least one PR review and requi</w:t>
-      </w:r>
-      <w:r>
-        <w:rPr>
-          <w:rFonts w:ascii="Arial" w:eastAsia="Arial" w:hAnsi="Arial" w:cs="Arial"/>
-          <w:color w:val="000000"/>
-        </w:rPr>
-        <w:t>re the CI status check to pass before merging.</w:t>
+        <w:t>: require at least one PR review and require the CI status check to pass before merging.</w:t>
       </w:r>
     </w:p>
     <w:p>
@@ -3058,14 +2936,7 @@
           <w:rFonts w:ascii="Arial" w:eastAsia="Arial" w:hAnsi="Arial" w:cs="Arial"/>
           <w:color w:val="000000"/>
         </w:rPr>
-        <w:t>Team Lead: Sign up on Render (render.com), create a new Web Service connected to the Docker Hub image repository, and copy the deploy hook URL from the Render service settings. This URL will be stored as the R</w:t>
-      </w:r>
-      <w:r>
-        <w:rPr>
-          <w:rFonts w:ascii="Arial" w:eastAsia="Arial" w:hAnsi="Arial" w:cs="Arial"/>
-          <w:color w:val="000000"/>
-        </w:rPr>
-        <w:t>ENDER_DEPLOY_HOOK_URL secret.</w:t>
+        <w:t>Team Lead: Sign up on Render (render.com), create a new Web Service connected to the Docker Hub image repository, and copy the deploy hook URL from the Render service settings. This URL will be stored as the RENDER_DEPLOY_HOOK_URL secret.</w:t>
       </w:r>
     </w:p>
     <w:p>
@@ -3102,16 +2973,7 @@
           <w:bCs/>
           <w:color w:val="000000"/>
         </w:rPr>
-        <w:t>Required repository str</w:t>
-      </w:r>
-      <w:r>
-        <w:rPr>
-          <w:rFonts w:ascii="Arial" w:eastAsia="Arial" w:hAnsi="Arial" w:cs="Arial"/>
-          <w:b/>
-          <w:bCs/>
-          <w:color w:val="000000"/>
-        </w:rPr>
-        <w:t>ucture:</w:t>
+        <w:t>Required repository structure:</w:t>
       </w:r>
     </w:p>
     <w:p>
@@ -3952,6 +3814,7 @@
                 <w:sz w:val="18"/>
                 <w:szCs w:val="18"/>
               </w:rPr>
+              <w:lastRenderedPageBreak/>
               <w:t>Assignment_04_Spring2026.docx</w:t>
             </w:r>
           </w:p>
@@ -4009,18 +3872,7 @@
           <w:sz w:val="28"/>
           <w:szCs w:val="28"/>
         </w:rPr>
-        <w:t xml:space="preserve">GITHUB </w:t>
-      </w:r>
-      <w:r>
-        <w:rPr>
-          <w:rFonts w:ascii="Arial" w:eastAsia="Arial" w:hAnsi="Arial" w:cs="Arial"/>
-          <w:b/>
-          <w:bCs/>
-          <w:color w:val="1F3864"/>
-          <w:sz w:val="28"/>
-          <w:szCs w:val="28"/>
-        </w:rPr>
-        <w:t>DEVELOPMENT ENVIRONMENT &amp; SECRETS (MANDATORY)</w:t>
+        <w:t>GITHUB DEVELOPMENT ENVIRONMENT &amp; SECRETS (MANDATORY)</w:t>
       </w:r>
     </w:p>
     <w:p>
@@ -4033,7 +3885,6 @@
           <w:rFonts w:ascii="Arial" w:eastAsia="Arial" w:hAnsi="Arial" w:cs="Arial"/>
           <w:color w:val="000000"/>
         </w:rPr>
-        <w:lastRenderedPageBreak/>
         <w:t xml:space="preserve">The Team Lead (TL) is responsible for creating all secrets listed below. The TL is the repository admin and the credentials in use </w:t>
       </w:r>
       <w:r>
@@ -4155,18 +4006,7 @@
           <w:sz w:val="18"/>
           <w:szCs w:val="18"/>
         </w:rPr>
-        <w:t xml:space="preserve">Table 4: Secrets </w:t>
-      </w:r>
-      <w:r>
-        <w:rPr>
-          <w:rFonts w:ascii="Arial" w:eastAsia="Arial" w:hAnsi="Arial" w:cs="Arial"/>
-          <w:b/>
-          <w:bCs/>
-          <w:color w:val="444444"/>
-          <w:sz w:val="18"/>
-          <w:szCs w:val="18"/>
-        </w:rPr>
-        <w:t>Configuration Reference</w:t>
+        <w:t>Table 4: Secrets Configuration Reference</w:t>
       </w:r>
     </w:p>
     <w:tbl>
@@ -4619,7 +4459,7 @@
           <w:sz w:val="18"/>
           <w:szCs w:val="18"/>
         </w:rPr>
-        <w:t>All three secrets must be created by the Team Lead, as the TL is the repository admin and the credentials belong to them. DOCKERHUB_USERNAME and DOCKERHUB_TOKEN must be the Team Lead's own Docker Hub credentials, added as repository-level secrets (Settings</w:t>
+        <w:t xml:space="preserve">All three secrets must be created by the Team Lead, as the TL is the repository admin and the credentials belong to them. DOCKERHUB_USERNAME and DOCKERHUB_TOKEN must be the Team Lead's own Docker Hub credentials, added as repository-level secrets (Settings → Secrets and variables → Actions → Repository secrets). RENDER_DEPLOY_HOOK_URL is obtained from the Render web service set up by the Team Lead and must be added as an environment-level secret inside the </w:t>
       </w:r>
       <w:r>
         <w:rPr>
@@ -4628,7 +4468,7 @@
           <w:sz w:val="18"/>
           <w:szCs w:val="18"/>
         </w:rPr>
-        <w:t xml:space="preserve"> → Secrets and variables → Actions → Repository secrets). RENDER_DEPLOY_HOOK_URL is obtained from the Render web service set up by the Team Lead and must be added as an environment-level secret inside the </w:t>
+        <w:t>“development”</w:t>
       </w:r>
       <w:r>
         <w:rPr>
@@ -4637,25 +4477,7 @@
           <w:sz w:val="18"/>
           <w:szCs w:val="18"/>
         </w:rPr>
-        <w:t>“development”</w:t>
-      </w:r>
-      <w:r>
-        <w:rPr>
-          <w:rFonts w:ascii="Arial" w:eastAsia="Arial" w:hAnsi="Arial" w:cs="Arial"/>
-          <w:color w:val="555555"/>
-          <w:sz w:val="18"/>
-          <w:szCs w:val="18"/>
-        </w:rPr>
-        <w:t xml:space="preserve"> environment (Settings → Environments </w:t>
-      </w:r>
-      <w:r>
-        <w:rPr>
-          <w:rFonts w:ascii="Arial" w:eastAsia="Arial" w:hAnsi="Arial" w:cs="Arial"/>
-          <w:color w:val="555555"/>
-          <w:sz w:val="18"/>
-          <w:szCs w:val="18"/>
-        </w:rPr>
-        <w:t>→ development → Add secret).</w:t>
+        <w:t xml:space="preserve"> environment (Settings → Environments → development → Add secret).</w:t>
       </w:r>
     </w:p>
     <w:p>
@@ -4747,14 +4569,7 @@
           <w:rFonts w:ascii="Arial" w:eastAsia="Arial" w:hAnsi="Arial" w:cs="Arial"/>
           <w:color w:val="000000"/>
         </w:rPr>
-        <w:t xml:space="preserve">Step 1 – </w:t>
-      </w:r>
-      <w:r>
-        <w:rPr>
-          <w:rFonts w:ascii="Arial" w:eastAsia="Arial" w:hAnsi="Arial" w:cs="Arial"/>
-          <w:color w:val="000000"/>
-        </w:rPr>
-        <w:t>Checkout: Check out the repository code using actions/checkout.</w:t>
+        <w:t>Step 1 – Checkout: Check out the repository code using actions/checkout.</w:t>
       </w:r>
     </w:p>
     <w:p>
@@ -4788,14 +4603,7 @@
           <w:rFonts w:ascii="Arial" w:eastAsia="Arial" w:hAnsi="Arial" w:cs="Arial"/>
           <w:color w:val="000000"/>
         </w:rPr>
-        <w:t xml:space="preserve">Step 3 – Build Image: Build the Docker image from the </w:t>
-      </w:r>
-      <w:r>
-        <w:rPr>
-          <w:rFonts w:ascii="Arial" w:eastAsia="Arial" w:hAnsi="Arial" w:cs="Arial"/>
-          <w:color w:val="000000"/>
-        </w:rPr>
-        <w:t>Dockerfile in the project root.</w:t>
+        <w:t>Step 3 – Build Image: Build the Docker image from the Dockerfile in the project root.</w:t>
       </w:r>
     </w:p>
     <w:p>
@@ -4895,6 +4703,7 @@
           <w:rFonts w:ascii="Arial" w:eastAsia="Arial" w:hAnsi="Arial" w:cs="Arial"/>
           <w:color w:val="000000"/>
         </w:rPr>
+        <w:lastRenderedPageBreak/>
         <w:t xml:space="preserve">The CI status check must appear as a required check in the Branch Protection Rules on </w:t>
       </w:r>
       <w:r>
@@ -4933,19 +4742,64 @@
           <w:sz w:val="28"/>
           <w:szCs w:val="28"/>
         </w:rPr>
-        <w:t>CD PIPELINE R</w:t>
-      </w:r>
+        <w:t>CD PIPELINE REQUIREMENTS  (.github/workflows/cd.yml)</w:t>
+      </w:r>
+    </w:p>
+    <w:p>
+      <w:pPr>
+        <w:spacing w:before="60" w:after="120"/>
+        <w:jc w:val="both"/>
+      </w:pPr>
       <w:r>
         <w:rPr>
           <w:rFonts w:ascii="Arial" w:eastAsia="Arial" w:hAnsi="Arial" w:cs="Arial"/>
           <w:b/>
           <w:bCs/>
-          <w:color w:val="1F3864"/>
-          <w:sz w:val="28"/>
-          <w:szCs w:val="28"/>
-        </w:rPr>
-        <w:t>EQUIREMENTS  (.github/workflows/cd.yml)</w:t>
-      </w:r>
+          <w:color w:val="000000"/>
+        </w:rPr>
+        <w:t xml:space="preserve">Trigger: The CD workflow must be triggered by a push event on the </w:t>
+      </w:r>
+      <w:r>
+        <w:rPr>
+          <w:rFonts w:ascii="Arial" w:eastAsia="Arial" w:hAnsi="Arial" w:cs="Arial"/>
+          <w:b/>
+          <w:bCs/>
+          <w:color w:val="000000"/>
+        </w:rPr>
+        <w:t>“develop”</w:t>
+      </w:r>
+      <w:r>
+        <w:rPr>
+          <w:rFonts w:ascii="Arial" w:eastAsia="Arial" w:hAnsi="Arial" w:cs="Arial"/>
+          <w:b/>
+          <w:bCs/>
+          <w:color w:val="000000"/>
+        </w:rPr>
+        <w:t xml:space="preserve"> branch. This push event occurs automatically when a Pull Request is merged into </w:t>
+      </w:r>
+      <w:r>
+        <w:rPr>
+          <w:rFonts w:ascii="Arial" w:eastAsia="Arial" w:hAnsi="Arial" w:cs="Arial"/>
+          <w:b/>
+          <w:bCs/>
+          <w:color w:val="000000"/>
+        </w:rPr>
+        <w:t>“develop”</w:t>
+      </w:r>
+      <w:r>
+        <w:rPr>
+          <w:rFonts w:ascii="Arial" w:eastAsia="Arial" w:hAnsi="Arial" w:cs="Arial"/>
+          <w:b/>
+          <w:bCs/>
+          <w:color w:val="000000"/>
+        </w:rPr>
+        <w:t>.</w:t>
+      </w:r>
+    </w:p>
+    <w:p>
+      <w:pPr>
+        <w:spacing w:after="100"/>
+      </w:pPr>
     </w:p>
     <w:p>
       <w:pPr>
@@ -4955,72 +4809,9 @@
       <w:r>
         <w:rPr>
           <w:rFonts w:ascii="Arial" w:eastAsia="Arial" w:hAnsi="Arial" w:cs="Arial"/>
-          <w:b/>
-          <w:bCs/>
-          <w:color w:val="000000"/>
-        </w:rPr>
-        <w:t xml:space="preserve">Trigger: The CD workflow must be triggered by a push event on the </w:t>
-      </w:r>
-      <w:r>
-        <w:rPr>
-          <w:rFonts w:ascii="Arial" w:eastAsia="Arial" w:hAnsi="Arial" w:cs="Arial"/>
-          <w:b/>
-          <w:bCs/>
-          <w:color w:val="000000"/>
-        </w:rPr>
-        <w:t>“develop”</w:t>
-      </w:r>
-      <w:r>
-        <w:rPr>
-          <w:rFonts w:ascii="Arial" w:eastAsia="Arial" w:hAnsi="Arial" w:cs="Arial"/>
-          <w:b/>
-          <w:bCs/>
-          <w:color w:val="000000"/>
-        </w:rPr>
-        <w:t xml:space="preserve"> branch. This push event occurs automatically when a Pull Request is merged into </w:t>
-      </w:r>
-      <w:r>
-        <w:rPr>
-          <w:rFonts w:ascii="Arial" w:eastAsia="Arial" w:hAnsi="Arial" w:cs="Arial"/>
-          <w:b/>
-          <w:bCs/>
-          <w:color w:val="000000"/>
-        </w:rPr>
-        <w:t>“develop”</w:t>
-      </w:r>
-      <w:r>
-        <w:rPr>
-          <w:rFonts w:ascii="Arial" w:eastAsia="Arial" w:hAnsi="Arial" w:cs="Arial"/>
-          <w:b/>
-          <w:bCs/>
-          <w:color w:val="000000"/>
-        </w:rPr>
-        <w:t>.</w:t>
-      </w:r>
-    </w:p>
-    <w:p>
-      <w:pPr>
-        <w:spacing w:after="100"/>
-      </w:pPr>
-    </w:p>
-    <w:p>
-      <w:pPr>
-        <w:spacing w:before="60" w:after="120"/>
-        <w:jc w:val="both"/>
-      </w:pPr>
-      <w:r>
-        <w:rPr>
-          <w:rFonts w:ascii="Arial" w:eastAsia="Arial" w:hAnsi="Arial" w:cs="Arial"/>
-          <w:color w:val="000000"/>
-        </w:rPr>
-        <w:t>The CD workflow must include the following steps</w:t>
-      </w:r>
-      <w:r>
-        <w:rPr>
-          <w:rFonts w:ascii="Arial" w:eastAsia="Arial" w:hAnsi="Arial" w:cs="Arial"/>
-          <w:color w:val="000000"/>
-        </w:rPr>
-        <w:t xml:space="preserve"> in order:</w:t>
+          <w:color w:val="000000"/>
+        </w:rPr>
+        <w:t>The CD workflow must include the following steps in order:</w:t>
       </w:r>
     </w:p>
     <w:p>
@@ -5071,14 +4862,7 @@
           <w:rFonts w:ascii="Arial" w:eastAsia="Arial" w:hAnsi="Arial" w:cs="Arial"/>
           <w:color w:val="000000"/>
         </w:rPr>
-        <w:t>Step 3</w:t>
-      </w:r>
-      <w:r>
-        <w:rPr>
-          <w:rFonts w:ascii="Arial" w:eastAsia="Arial" w:hAnsi="Arial" w:cs="Arial"/>
-          <w:color w:val="000000"/>
-        </w:rPr>
-        <w:t xml:space="preserve"> – Deploy: Send an HTTP POST request to the Render deploy hook URL using curl:</w:t>
+        <w:t>Step 3 – Deploy: Send an HTTP POST request to the Render deploy hook URL using curl:</w:t>
       </w:r>
     </w:p>
     <w:p>
@@ -5148,14 +4932,7 @@
           <w:rFonts w:ascii="Arial" w:eastAsia="Arial" w:hAnsi="Arial" w:cs="Arial"/>
           <w:color w:val="000000"/>
         </w:rPr>
-        <w:t>The CD wor</w:t>
-      </w:r>
-      <w:r>
-        <w:rPr>
-          <w:rFonts w:ascii="Arial" w:eastAsia="Arial" w:hAnsi="Arial" w:cs="Arial"/>
-          <w:color w:val="000000"/>
-        </w:rPr>
-        <w:t>kflow file must declare runs-on: ubuntu-latest.</w:t>
+        <w:t>The CD workflow file must declare runs-on: ubuntu-latest.</w:t>
       </w:r>
     </w:p>
     <w:p>
@@ -5348,18 +5125,7 @@
                 <w:sz w:val="18"/>
                 <w:szCs w:val="18"/>
               </w:rPr>
-              <w:t xml:space="preserve">Key </w:t>
-            </w:r>
-            <w:r>
-              <w:rPr>
-                <w:rFonts w:ascii="Arial" w:eastAsia="Arial" w:hAnsi="Arial" w:cs="Arial"/>
-                <w:b/>
-                <w:bCs/>
-                <w:color w:val="FFFFFF"/>
-                <w:sz w:val="18"/>
-                <w:szCs w:val="18"/>
-              </w:rPr>
-              <w:t>Steps</w:t>
+              <w:t>Key Steps</w:t>
             </w:r>
           </w:p>
         </w:tc>
@@ -5707,14 +5473,7 @@
           <w:rFonts w:ascii="Arial" w:eastAsia="Arial" w:hAnsi="Arial" w:cs="Arial"/>
           <w:color w:val="000000"/>
         </w:rPr>
-        <w:t>Commit the Assignment 04 question paper (.docx) to the root of the repository. Every t</w:t>
-      </w:r>
-      <w:r>
-        <w:rPr>
-          <w:rFonts w:ascii="Arial" w:eastAsia="Arial" w:hAnsi="Arial" w:cs="Arial"/>
-          <w:color w:val="000000"/>
-        </w:rPr>
-        <w:t xml:space="preserve">eam member must fill in their details </w:t>
+        <w:t xml:space="preserve">Commit the Assignment 04 question paper (.docx) to the root of the repository. Every team member must fill in their details </w:t>
       </w:r>
       <w:r>
         <w:rPr>
@@ -5818,14 +5577,7 @@
           <w:rFonts w:ascii="Arial" w:eastAsia="Arial" w:hAnsi="Arial" w:cs="Arial"/>
           <w:color w:val="000000"/>
         </w:rPr>
-        <w:t>Team Lead: Apply Branch Protection Rules on th</w:t>
-      </w:r>
-      <w:r>
-        <w:rPr>
-          <w:rFonts w:ascii="Arial" w:eastAsia="Arial" w:hAnsi="Arial" w:cs="Arial"/>
-          <w:color w:val="000000"/>
-        </w:rPr>
-        <w:t xml:space="preserve">e </w:t>
+        <w:t xml:space="preserve">Team Lead: Apply Branch Protection Rules on the </w:t>
       </w:r>
       <w:r>
         <w:rPr>
@@ -5946,14 +5698,7 @@
           <w:rFonts w:ascii="Arial" w:eastAsia="Arial" w:hAnsi="Arial" w:cs="Arial"/>
           <w:color w:val="000000"/>
         </w:rPr>
-        <w:t>Each team membe</w:t>
-      </w:r>
-      <w:r>
-        <w:rPr>
-          <w:rFonts w:ascii="Arial" w:eastAsia="Arial" w:hAnsi="Arial" w:cs="Arial"/>
-          <w:color w:val="000000"/>
-        </w:rPr>
-        <w:t>r must independently complete the following full DevOps flow for their assigned page (refer to Table 3):</w:t>
+        <w:t>Each team member must independently complete the following full DevOps flow for their assigned page (refer to Table 3):</w:t>
       </w:r>
     </w:p>
     <w:p>
@@ -5989,6 +5734,7 @@
           <w:sz w:val="19"/>
           <w:szCs w:val="19"/>
         </w:rPr>
+        <w:lastRenderedPageBreak/>
         <w:t>Build the assigned HTML page with proper content and link it to style.css</w:t>
       </w:r>
     </w:p>
@@ -6007,15 +5753,7 @@
           <w:sz w:val="19"/>
           <w:szCs w:val="19"/>
         </w:rPr>
-        <w:t xml:space="preserve">Commit the </w:t>
-      </w:r>
-      <w:r>
-        <w:rPr>
-          <w:rFonts w:ascii="Arial" w:eastAsia="Arial" w:hAnsi="Arial" w:cs="Arial"/>
-          <w:sz w:val="19"/>
-          <w:szCs w:val="19"/>
-        </w:rPr>
-        <w:t>page and push the feature branch to GitHub</w:t>
+        <w:t>Commit the page and push the feature branch to GitHub</w:t>
       </w:r>
     </w:p>
     <w:p>
@@ -6116,14 +5854,7 @@
           <w:rFonts w:ascii="Arial" w:eastAsia="Arial" w:hAnsi="Arial" w:cs="Arial"/>
           <w:color w:val="000000"/>
         </w:rPr>
-        <w:t xml:space="preserve">After all 5 PRs are merged, verify the </w:t>
-      </w:r>
-      <w:r>
-        <w:rPr>
-          <w:rFonts w:ascii="Arial" w:eastAsia="Arial" w:hAnsi="Arial" w:cs="Arial"/>
-          <w:color w:val="000000"/>
-        </w:rPr>
-        <w:t>live TaskFlow application on Render contains all five pages and navigation between them works correctly.</w:t>
+        <w:t>After all 5 PRs are merged, verify the live TaskFlow application on Render contains all five pages and navigation between them works correctly.</w:t>
       </w:r>
     </w:p>
     <w:p>
@@ -6546,16 +6277,7 @@
                 <w:sz w:val="18"/>
                 <w:szCs w:val="18"/>
               </w:rPr>
-              <w:t xml:space="preserve">Version the Assignment 04 question paper (Assignment_04_Spring2026.docx) inside the repo root; each </w:t>
-            </w:r>
-            <w:r>
-              <w:rPr>
-                <w:rFonts w:ascii="Arial" w:eastAsia="Arial" w:hAnsi="Arial" w:cs="Arial"/>
-                <w:color w:val="000000"/>
-                <w:sz w:val="18"/>
-                <w:szCs w:val="18"/>
-              </w:rPr>
-              <w:t>member fills their row including Assigned Page</w:t>
+              <w:t>Version the Assignment 04 question paper (Assignment_04_Spring2026.docx) inside the repo root; each member fills their row including Assigned Page</w:t>
             </w:r>
           </w:p>
         </w:tc>
@@ -6838,16 +6560,7 @@
                 <w:sz w:val="18"/>
                 <w:szCs w:val="18"/>
               </w:rPr>
-              <w:t xml:space="preserve">Configure repository-level secrets: DOCKERHUB_USERNAME, DOCKERHUB_TOKEN (Team Lead's </w:t>
-            </w:r>
-            <w:r>
-              <w:rPr>
-                <w:rFonts w:ascii="Arial" w:eastAsia="Arial" w:hAnsi="Arial" w:cs="Arial"/>
-                <w:color w:val="000000"/>
-                <w:sz w:val="18"/>
-                <w:szCs w:val="18"/>
-              </w:rPr>
-              <w:t>credentials)</w:t>
+              <w:t>Configure repository-level secrets: DOCKERHUB_USERNAME, DOCKERHUB_TOKEN (Team Lead's credentials)</w:t>
             </w:r>
           </w:p>
         </w:tc>
@@ -7130,16 +6843,7 @@
                 <w:sz w:val="18"/>
                 <w:szCs w:val="18"/>
               </w:rPr>
-              <w:t xml:space="preserve">Each member creates their feature branch using the </w:t>
-            </w:r>
-            <w:r>
-              <w:rPr>
-                <w:rFonts w:ascii="Arial" w:eastAsia="Arial" w:hAnsi="Arial" w:cs="Arial"/>
-                <w:color w:val="000000"/>
-                <w:sz w:val="18"/>
-                <w:szCs w:val="18"/>
-              </w:rPr>
-              <w:t>correct naming convention (feature/&lt;username&gt;/&lt;page-name&gt;)</w:t>
+              <w:t>Each member creates their feature branch using the correct naming convention (feature/&lt;username&gt;/&lt;page-name&gt;)</w:t>
             </w:r>
           </w:p>
         </w:tc>
@@ -7345,16 +7049,7 @@
                 <w:sz w:val="18"/>
                 <w:szCs w:val="18"/>
               </w:rPr>
-              <w:t xml:space="preserve">; PR description is meaningful and CI </w:t>
-            </w:r>
-            <w:r>
-              <w:rPr>
-                <w:rFonts w:ascii="Arial" w:eastAsia="Arial" w:hAnsi="Arial" w:cs="Arial"/>
-                <w:color w:val="000000"/>
-                <w:sz w:val="18"/>
-                <w:szCs w:val="18"/>
-              </w:rPr>
-              <w:t>passes before merge</w:t>
+              <w:t>; PR description is meaningful and CI passes before merge</w:t>
             </w:r>
           </w:p>
         </w:tc>
@@ -7731,16 +7426,7 @@
                 <w:sz w:val="18"/>
                 <w:szCs w:val="18"/>
               </w:rPr>
-              <w:t xml:space="preserve">Build Docker image and tag correctly (latest and/or </w:t>
-            </w:r>
-            <w:r>
-              <w:rPr>
-                <w:rFonts w:ascii="Arial" w:eastAsia="Arial" w:hAnsi="Arial" w:cs="Arial"/>
-                <w:color w:val="000000"/>
-                <w:sz w:val="18"/>
-                <w:szCs w:val="18"/>
-              </w:rPr>
-              <w:t>commit SHA)</w:t>
+              <w:t>Build Docker image and tag correctly (latest and/or commit SHA)</w:t>
             </w:r>
           </w:p>
         </w:tc>
@@ -8181,6 +7867,7 @@
                 <w:sz w:val="18"/>
                 <w:szCs w:val="18"/>
               </w:rPr>
+              <w:lastRenderedPageBreak/>
               <w:t>15</w:t>
             </w:r>
           </w:p>
@@ -8211,16 +7898,7 @@
                 <w:sz w:val="18"/>
                 <w:szCs w:val="18"/>
               </w:rPr>
-              <w:t xml:space="preserve">Deploy step invokes Render webhook via curl POST; deployed app </w:t>
-            </w:r>
-            <w:r>
-              <w:rPr>
-                <w:rFonts w:ascii="Arial" w:eastAsia="Arial" w:hAnsi="Arial" w:cs="Arial"/>
-                <w:color w:val="000000"/>
-                <w:sz w:val="18"/>
-                <w:szCs w:val="18"/>
-              </w:rPr>
-              <w:t>on Render contains all 5 pages</w:t>
+              <w:t>Deploy step invokes Render webhook via curl POST; deployed app on Render contains all 5 pages</w:t>
             </w:r>
           </w:p>
         </w:tc>
@@ -8494,16 +8172,7 @@
                 <w:sz w:val="18"/>
                 <w:szCs w:val="18"/>
               </w:rPr>
-              <w:t xml:space="preserve">Individual reflection (4–5 lines per member) on </w:t>
-            </w:r>
-            <w:r>
-              <w:rPr>
-                <w:rFonts w:ascii="Arial" w:eastAsia="Arial" w:hAnsi="Arial" w:cs="Arial"/>
-                <w:color w:val="000000"/>
-                <w:sz w:val="18"/>
-                <w:szCs w:val="18"/>
-              </w:rPr>
-              <w:t>CI/CD integration and page development experience</w:t>
+              <w:t>Individual reflection (4–5 lines per member) on CI/CD integration and page development experience</w:t>
             </w:r>
           </w:p>
         </w:tc>
@@ -8672,14 +8341,7 @@
           <w:rFonts w:ascii="Arial" w:eastAsia="Arial" w:hAnsi="Arial" w:cs="Arial"/>
           <w:color w:val="000000"/>
         </w:rPr>
-        <w:t xml:space="preserve">Completed Assignment 04 document with all group details filled in (including each member's Assigned </w:t>
-      </w:r>
-      <w:r>
-        <w:rPr>
-          <w:rFonts w:ascii="Arial" w:eastAsia="Arial" w:hAnsi="Arial" w:cs="Arial"/>
-          <w:color w:val="000000"/>
-        </w:rPr>
-        <w:t>Page).</w:t>
+        <w:t>Completed Assignment 04 document with all group details filled in (including each member's Assigned Page).</w:t>
       </w:r>
     </w:p>
     <w:p>
@@ -8761,14 +8423,7 @@
           <w:rFonts w:ascii="Arial" w:eastAsia="Arial" w:hAnsi="Arial" w:cs="Arial"/>
           <w:color w:val="000000"/>
         </w:rPr>
-        <w:t>Screenshot 2: Each member's CI workflow run triggered by their in</w:t>
-      </w:r>
-      <w:r>
-        <w:rPr>
-          <w:rFonts w:ascii="Arial" w:eastAsia="Arial" w:hAnsi="Arial" w:cs="Arial"/>
-          <w:color w:val="000000"/>
-        </w:rPr>
-        <w:t xml:space="preserve">dividual PR </w:t>
+        <w:t xml:space="preserve">Screenshot 2: Each member's CI workflow run triggered by their individual PR </w:t>
       </w:r>
       <w:r>
         <w:rPr>
@@ -8861,14 +8516,7 @@
           <w:rFonts w:ascii="Arial" w:eastAsia="Arial" w:hAnsi="Arial" w:cs="Arial"/>
           <w:color w:val="000000"/>
         </w:rPr>
-        <w:t>Scre</w:t>
-      </w:r>
-      <w:r>
-        <w:rPr>
-          <w:rFonts w:ascii="Arial" w:eastAsia="Arial" w:hAnsi="Arial" w:cs="Arial"/>
-          <w:color w:val="000000"/>
-        </w:rPr>
-        <w:t>enshot 5: Live TaskFlow application on Render showing all five pages are accessible.</w:t>
+        <w:t>Screenshot 5: Live TaskFlow application on Render showing all five pages are accessible.</w:t>
       </w:r>
     </w:p>
     <w:p>
@@ -8902,14 +8550,7 @@
           <w:rFonts w:ascii="Arial" w:eastAsia="Arial" w:hAnsi="Arial" w:cs="Arial"/>
           <w:color w:val="000000"/>
         </w:rPr>
-        <w:t xml:space="preserve">Individual reflection: Each team member must write 4–5 lines on what they </w:t>
-      </w:r>
-      <w:r>
-        <w:rPr>
-          <w:rFonts w:ascii="Arial" w:eastAsia="Arial" w:hAnsi="Arial" w:cs="Arial"/>
-          <w:color w:val="000000"/>
-        </w:rPr>
-        <w:t>learnt and any challenges they faced.</w:t>
+        <w:t>Individual reflection: Each team member must write 4–5 lines on what they learnt and any challenges they faced.</w:t>
       </w:r>
     </w:p>
     <w:p>
@@ -9415,6 +9056,7 @@
           <w:sz w:val="28"/>
           <w:szCs w:val="28"/>
         </w:rPr>
+        <w:lastRenderedPageBreak/>
         <w:t>TEAM REFLECTION</w:t>
       </w:r>
     </w:p>
@@ -9448,16 +9090,7 @@
           <w:bCs/>
           <w:color w:val="000000"/>
         </w:rPr>
-        <w:t xml:space="preserve">Member 1  (Name: </w:t>
-      </w:r>
-      <w:r>
-        <w:rPr>
-          <w:rFonts w:ascii="Arial" w:eastAsia="Arial" w:hAnsi="Arial" w:cs="Arial"/>
-          <w:b/>
-          <w:bCs/>
-          <w:color w:val="000000"/>
-        </w:rPr>
-        <w:t>_______________________________________________)</w:t>
+        <w:t>Member 1  (Name: _______________________________________________)</w:t>
       </w:r>
     </w:p>
     <w:tbl>
@@ -9778,16 +9411,7 @@
           <w:bCs/>
           <w:color w:val="000000"/>
         </w:rPr>
-        <w:t xml:space="preserve">Member 4  (Name: </w:t>
-      </w:r>
-      <w:r>
-        <w:rPr>
-          <w:rFonts w:ascii="Arial" w:eastAsia="Arial" w:hAnsi="Arial" w:cs="Arial"/>
-          <w:b/>
-          <w:bCs/>
-          <w:color w:val="000000"/>
-        </w:rPr>
-        <w:t>_______________________________________________)</w:t>
+        <w:t>Member 4  (Name: _______________________________________________)</w:t>
       </w:r>
     </w:p>
     <w:tbl>

</xml_diff>

<commit_message>
feat: add Task Detail page (task-detail.html) – Aoun
</commit_message>
<xml_diff>
--- a/DF_Assignment_04_Spring_2026.docx
+++ b/DF_Assignment_04_Spring_2026.docx
@@ -1,6 +1,6 @@
 
 <file path=word/document.xml><?xml version="1.0" encoding="utf-8"?>
-<w:document xmlns:wpc="http://schemas.microsoft.com/office/word/2010/wordprocessingCanvas" xmlns:cx="http://schemas.microsoft.com/office/drawing/2014/chartex" xmlns:cx1="http://schemas.microsoft.com/office/drawing/2015/9/8/chartex" xmlns:cx2="http://schemas.microsoft.com/office/drawing/2015/10/21/chartex" xmlns:cx3="http://schemas.microsoft.com/office/drawing/2016/5/9/chartex" xmlns:cx4="http://schemas.microsoft.com/office/drawing/2016/5/10/chartex" xmlns:cx5="http://schemas.microsoft.com/office/drawing/2016/5/11/chartex" xmlns:cx6="http://schemas.microsoft.com/office/drawing/2016/5/12/chartex" xmlns:cx7="http://schemas.microsoft.com/office/drawing/2016/5/13/chartex" xmlns:cx8="http://schemas.microsoft.com/office/drawing/2016/5/14/chartex" xmlns:mc="http://schemas.openxmlformats.org/markup-compatibility/2006" xmlns:aink="http://schemas.microsoft.com/office/drawing/2016/ink" xmlns:am3d="http://schemas.microsoft.com/office/drawing/2017/model3d" xmlns:o="urn:schemas-microsoft-com:office:office" xmlns:r="http://schemas.openxmlformats.org/officeDocument/2006/relationships" xmlns:m="http://schemas.openxmlformats.org/officeDocument/2006/math" xmlns:v="urn:schemas-microsoft-com:vml" xmlns:wp14="http://schemas.microsoft.com/office/word/2010/wordprocessingDrawing" xmlns:wp="http://schemas.openxmlformats.org/drawingml/2006/wordprocessingDrawing" xmlns:w10="urn:schemas-microsoft-com:office:word" xmlns:w="http://schemas.openxmlformats.org/wordprocessingml/2006/main" xmlns:w14="http://schemas.microsoft.com/office/word/2010/wordml" xmlns:w15="http://schemas.microsoft.com/office/word/2012/wordml" xmlns:w16cex="http://schemas.microsoft.com/office/word/2018/wordml/cex" xmlns:w16cid="http://schemas.microsoft.com/office/word/2016/wordml/cid" xmlns:w16="http://schemas.microsoft.com/office/word/2018/wordml" xmlns:w16sdtdh="http://schemas.microsoft.com/office/word/2020/wordml/sdtdatahash" xmlns:w16se="http://schemas.microsoft.com/office/word/2015/wordml/symex" xmlns:wpg="http://schemas.microsoft.com/office/word/2010/wordprocessingGroup" xmlns:wpi="http://schemas.microsoft.com/office/word/2010/wordprocessingInk" xmlns:wne="http://schemas.microsoft.com/office/word/2006/wordml" xmlns:wps="http://schemas.microsoft.com/office/word/2010/wordprocessingShape" mc:Ignorable="w14 w15 w16se w16cid w16 w16cex w16sdtdh wp14">
+<w:document xmlns:wpc="http://schemas.microsoft.com/office/word/2010/wordprocessingCanvas" xmlns:cx="http://schemas.microsoft.com/office/drawing/2014/chartex" xmlns:cx1="http://schemas.microsoft.com/office/drawing/2015/9/8/chartex" xmlns:cx2="http://schemas.microsoft.com/office/drawing/2015/10/21/chartex" xmlns:cx3="http://schemas.microsoft.com/office/drawing/2016/5/9/chartex" xmlns:cx4="http://schemas.microsoft.com/office/drawing/2016/5/10/chartex" xmlns:cx5="http://schemas.microsoft.com/office/drawing/2016/5/11/chartex" xmlns:cx6="http://schemas.microsoft.com/office/drawing/2016/5/12/chartex" xmlns:cx7="http://schemas.microsoft.com/office/drawing/2016/5/13/chartex" xmlns:cx8="http://schemas.microsoft.com/office/drawing/2016/5/14/chartex" xmlns:mc="http://schemas.openxmlformats.org/markup-compatibility/2006" xmlns:aink="http://schemas.microsoft.com/office/drawing/2016/ink" xmlns:am3d="http://schemas.microsoft.com/office/drawing/2017/model3d" xmlns:o="urn:schemas-microsoft-com:office:office" xmlns:oel="http://schemas.microsoft.com/office/2019/extlst" xmlns:r="http://schemas.openxmlformats.org/officeDocument/2006/relationships" xmlns:m="http://schemas.openxmlformats.org/officeDocument/2006/math" xmlns:v="urn:schemas-microsoft-com:vml" xmlns:wp14="http://schemas.microsoft.com/office/word/2010/wordprocessingDrawing" xmlns:wp="http://schemas.openxmlformats.org/drawingml/2006/wordprocessingDrawing" xmlns:w10="urn:schemas-microsoft-com:office:word" xmlns:w="http://schemas.openxmlformats.org/wordprocessingml/2006/main" xmlns:w14="http://schemas.microsoft.com/office/word/2010/wordml" xmlns:w15="http://schemas.microsoft.com/office/word/2012/wordml" xmlns:w16cex="http://schemas.microsoft.com/office/word/2018/wordml/cex" xmlns:w16cid="http://schemas.microsoft.com/office/word/2016/wordml/cid" xmlns:w16="http://schemas.microsoft.com/office/word/2018/wordml" xmlns:w16du="http://schemas.microsoft.com/office/word/2023/wordml/word16du" xmlns:w16sdtdh="http://schemas.microsoft.com/office/word/2020/wordml/sdtdatahash" xmlns:w16sdtfl="http://schemas.microsoft.com/office/word/2024/wordml/sdtformatlock" xmlns:w16se="http://schemas.microsoft.com/office/word/2015/wordml/symex" xmlns:wpg="http://schemas.microsoft.com/office/word/2010/wordprocessingGroup" xmlns:wpi="http://schemas.microsoft.com/office/word/2010/wordprocessingInk" xmlns:wne="http://schemas.microsoft.com/office/word/2006/wordml" xmlns:wps="http://schemas.microsoft.com/office/word/2010/wordprocessingShape" mc:Ignorable="w14 w15 w16se w16cid w16 w16cex w16sdtdh w16sdtfl w16du wp14">
   <w:body>
     <w:p>
       <w:pPr>
@@ -92,25 +92,7 @@
           <w:sz w:val="24"/>
           <w:szCs w:val="24"/>
         </w:rPr>
-        <w:t xml:space="preserve">Students will design and implement a complete CI/CD pipeline for a containerized web </w:t>
-      </w:r>
-      <w:r>
-        <w:rPr>
-          <w:rFonts w:ascii="Arial" w:eastAsia="Arial" w:hAnsi="Arial" w:cs="Arial"/>
-          <w:color w:val="000000"/>
-          <w:sz w:val="24"/>
-          <w:szCs w:val="24"/>
-        </w:rPr>
-        <w:t>application by integrating a CI workflow (triggered on a Pull Request) with a CD workflow (triggered on a merge/push to the develop branch). The assignment covers creating a fresh GitHub repository, versioning the assignment document, configuring GitHub En</w:t>
-      </w:r>
-      <w:r>
-        <w:rPr>
-          <w:rFonts w:ascii="Arial" w:eastAsia="Arial" w:hAnsi="Arial" w:cs="Arial"/>
-          <w:color w:val="000000"/>
-          <w:sz w:val="24"/>
-          <w:szCs w:val="24"/>
-        </w:rPr>
-        <w:t>vironments, managing secrets, and chaining two GitHub Actions workflows.</w:t>
+        <w:t>Students will design and implement a complete CI/CD pipeline for a containerized web application by integrating a CI workflow (triggered on a Pull Request) with a CD workflow (triggered on a merge/push to the develop branch). The assignment covers creating a fresh GitHub repository, versioning the assignment document, configuring GitHub Environments, managing secrets, and chaining two GitHub Actions workflows.</w:t>
       </w:r>
     </w:p>
     <w:p>
@@ -182,16 +164,7 @@
           <w:sz w:val="24"/>
           <w:szCs w:val="24"/>
         </w:rPr>
-        <w:t xml:space="preserve">Version the assignment question paper </w:t>
-      </w:r>
-      <w:r>
-        <w:rPr>
-          <w:rFonts w:ascii="Arial" w:eastAsia="Arial" w:hAnsi="Arial" w:cs="Arial"/>
-          <w:color w:val="000000"/>
-          <w:sz w:val="24"/>
-          <w:szCs w:val="24"/>
-        </w:rPr>
-        <w:t>inside the GitHub repository.</w:t>
+        <w:t>Version the assignment question paper inside the GitHub repository.</w:t>
       </w:r>
     </w:p>
     <w:p>
@@ -278,16 +251,7 @@
           <w:sz w:val="24"/>
           <w:szCs w:val="24"/>
         </w:rPr>
-        <w:t>Design and implement a CD workflow triggered by a p</w:t>
-      </w:r>
-      <w:r>
-        <w:rPr>
-          <w:rFonts w:ascii="Arial" w:eastAsia="Arial" w:hAnsi="Arial" w:cs="Arial"/>
-          <w:color w:val="000000"/>
-          <w:sz w:val="24"/>
-          <w:szCs w:val="24"/>
-        </w:rPr>
-        <w:t xml:space="preserve">ush event on the </w:t>
+        <w:t xml:space="preserve">Design and implement a CD workflow triggered by a push event on the </w:t>
       </w:r>
       <w:r>
         <w:rPr>
@@ -430,16 +394,7 @@
           <w:sz w:val="24"/>
           <w:szCs w:val="24"/>
         </w:rPr>
-        <w:t xml:space="preserve">New Repository: Students MUST create a brand-new GitHub repository for this assignment. Do NOT reuse or fork any </w:t>
-      </w:r>
-      <w:r>
-        <w:rPr>
-          <w:rFonts w:ascii="Arial" w:eastAsia="Arial" w:hAnsi="Arial" w:cs="Arial"/>
-          <w:color w:val="000000"/>
-          <w:sz w:val="24"/>
-          <w:szCs w:val="24"/>
-        </w:rPr>
-        <w:t>repository from a previous assignment.</w:t>
+        <w:t>New Repository: Students MUST create a brand-new GitHub repository for this assignment. Do NOT reuse or fork any repository from a previous assignment.</w:t>
       </w:r>
     </w:p>
     <w:p>
@@ -462,16 +417,7 @@
           <w:sz w:val="24"/>
           <w:szCs w:val="24"/>
         </w:rPr>
-        <w:t xml:space="preserve">Assignment Document in Repo: The Assignment 04 question paper (this .docx file) must be committed to the root of the repository. Each student must fill in their own details in their respective row in Table 1 </w:t>
-      </w:r>
-      <w:r>
-        <w:rPr>
-          <w:rFonts w:ascii="Arial" w:eastAsia="Arial" w:hAnsi="Arial" w:cs="Arial"/>
-          <w:color w:val="000000"/>
-          <w:sz w:val="24"/>
-          <w:szCs w:val="24"/>
-        </w:rPr>
-        <w:t>(Group Details) directly inside the versioned document.</w:t>
+        <w:t>Assignment Document in Repo: The Assignment 04 question paper (this .docx file) must be committed to the root of the repository. Each student must fill in their own details in their respective row in Table 1 (Group Details) directly inside the versioned document.</w:t>
       </w:r>
     </w:p>
     <w:p>
@@ -494,16 +440,7 @@
           <w:sz w:val="24"/>
           <w:szCs w:val="24"/>
         </w:rPr>
-        <w:t>Secrets Ownership: All GitHub secrets (DOCKERHUB_USERNAME, DOCKERHUB_TOKEN, RENDER_DEPLOY_HOOK_URL) must be created by the Team Lead using the TL's own Docker Hub and Render credentials. No team membe</w:t>
-      </w:r>
-      <w:r>
-        <w:rPr>
-          <w:rFonts w:ascii="Arial" w:eastAsia="Arial" w:hAnsi="Arial" w:cs="Arial"/>
-          <w:color w:val="000000"/>
-          <w:sz w:val="24"/>
-          <w:szCs w:val="24"/>
-        </w:rPr>
-        <w:t>r other than the TL should create or modify secrets.</w:t>
+        <w:t>Secrets Ownership: All GitHub secrets (DOCKERHUB_USERNAME, DOCKERHUB_TOKEN, RENDER_DEPLOY_HOOK_URL) must be created by the Team Lead using the TL's own Docker Hub and Render credentials. No team member other than the TL should create or modify secrets.</w:t>
       </w:r>
     </w:p>
     <w:p>
@@ -549,16 +486,7 @@
           <w:sz w:val="24"/>
           <w:szCs w:val="24"/>
         </w:rPr>
-        <w:t xml:space="preserve">Only the Team Lead will submit the final document to the </w:t>
-      </w:r>
-      <w:r>
-        <w:rPr>
-          <w:rFonts w:ascii="Arial" w:eastAsia="Arial" w:hAnsi="Arial" w:cs="Arial"/>
-          <w:color w:val="000000"/>
-          <w:sz w:val="24"/>
-          <w:szCs w:val="24"/>
-        </w:rPr>
-        <w:t>LMS.</w:t>
+        <w:t>Only the Team Lead will submit the final document to the LMS.</w:t>
       </w:r>
     </w:p>
     <w:p>
@@ -686,18 +614,7 @@
           <w:sz w:val="18"/>
           <w:szCs w:val="18"/>
         </w:rPr>
-        <w:t xml:space="preserve"> Each student must fill their own</w:t>
-      </w:r>
-      <w:r>
-        <w:rPr>
-          <w:rFonts w:ascii="Arial" w:eastAsia="Arial" w:hAnsi="Arial" w:cs="Arial"/>
-          <w:b/>
-          <w:bCs/>
-          <w:color w:val="444444"/>
-          <w:sz w:val="18"/>
-          <w:szCs w:val="18"/>
-        </w:rPr>
-        <w:t xml:space="preserve"> row (including Assigned Page) in the versioned copy inside the repo</w:t>
+        <w:t xml:space="preserve"> Each student must fill their own row (including Assigned Page) in the versioned copy inside the repo</w:t>
       </w:r>
     </w:p>
     <w:tbl>
@@ -719,12 +636,12 @@
       </w:tblPr>
       <w:tblGrid>
         <w:gridCol w:w="471"/>
-        <w:gridCol w:w="1424"/>
-        <w:gridCol w:w="1349"/>
+        <w:gridCol w:w="1286"/>
+        <w:gridCol w:w="1492"/>
         <w:gridCol w:w="1561"/>
-        <w:gridCol w:w="1306"/>
-        <w:gridCol w:w="1596"/>
-        <w:gridCol w:w="1653"/>
+        <w:gridCol w:w="1258"/>
+        <w:gridCol w:w="1724"/>
+        <w:gridCol w:w="1568"/>
       </w:tblGrid>
       <w:tr>
         <w:trPr>
@@ -1460,7 +1377,11 @@
             </w:tcMar>
             <w:vAlign w:val="center"/>
           </w:tcPr>
-          <w:p/>
+          <w:p>
+            <w:r>
+              <w:t>Syed Aoun Ali Kazmi</w:t>
+            </w:r>
+          </w:p>
         </w:tc>
         <w:tc>
           <w:tcPr>
@@ -1480,7 +1401,11 @@
             </w:tcMar>
             <w:vAlign w:val="center"/>
           </w:tcPr>
-          <w:p/>
+          <w:p>
+            <w:r>
+              <w:t>Aounshah1214</w:t>
+            </w:r>
+          </w:p>
         </w:tc>
         <w:tc>
           <w:tcPr>
@@ -1500,7 +1425,11 @@
             </w:tcMar>
             <w:vAlign w:val="center"/>
           </w:tcPr>
-          <w:p/>
+          <w:p>
+            <w:r>
+              <w:t>M|ember</w:t>
+            </w:r>
+          </w:p>
         </w:tc>
         <w:tc>
           <w:tcPr>
@@ -1520,7 +1449,11 @@
             </w:tcMar>
             <w:vAlign w:val="center"/>
           </w:tcPr>
-          <w:p/>
+          <w:p>
+            <w:r>
+              <w:t>task-detail.html</w:t>
+            </w:r>
+          </w:p>
         </w:tc>
         <w:tc>
           <w:tcPr>
@@ -1540,7 +1473,11 @@
             </w:tcMar>
             <w:vAlign w:val="center"/>
           </w:tcPr>
-          <w:p/>
+          <w:p>
+            <w:r>
+              <w:t>feature/aoun/task-detail</w:t>
+            </w:r>
+          </w:p>
         </w:tc>
         <w:tc>
           <w:tcPr>
@@ -1560,7 +1497,11 @@
             </w:tcMar>
             <w:vAlign w:val="center"/>
           </w:tcPr>
-          <w:p/>
+          <w:p>
+            <w:r>
+              <w:t>No</w:t>
+            </w:r>
+          </w:p>
         </w:tc>
       </w:tr>
       <w:tr>
@@ -1710,13 +1651,7 @@
           </w:tcPr>
           <w:p>
             <w:r>
-              <w:t>feature/</w:t>
-            </w:r>
-            <w:r>
-              <w:t>sufyan-majeed</w:t>
-            </w:r>
-            <w:r>
-              <w:t>/about</w:t>
+              <w:t>feature/sufyan-majeed/about</w:t>
             </w:r>
           </w:p>
         </w:tc>
@@ -1841,14 +1776,7 @@
           <w:rFonts w:ascii="Arial" w:eastAsia="Arial" w:hAnsi="Arial" w:cs="Arial"/>
           <w:color w:val="000000"/>
         </w:rPr>
-        <w:t xml:space="preserve">Your team is the development crew for TaskFlow, a lightweight task-management web application consisting of five HTML pages. The Team Lead </w:t>
-      </w:r>
-      <w:r>
-        <w:rPr>
-          <w:rFonts w:ascii="Arial" w:eastAsia="Arial" w:hAnsi="Arial" w:cs="Arial"/>
-          <w:color w:val="000000"/>
-        </w:rPr>
-        <w:t>sets up the repository, Dockerfile, shared stylesheet, and the CI/CD pipelines. Each team member is then individually responsible for building one specific page of the application, following the full Git, GitHub, and Docker flow independently.</w:t>
+        <w:t>Your team is the development crew for TaskFlow, a lightweight task-management web application consisting of five HTML pages. The Team Lead sets up the repository, Dockerfile, shared stylesheet, and the CI/CD pipelines. Each team member is then individually responsible for building one specific page of the application, following the full Git, GitHub, and Docker flow independently.</w:t>
       </w:r>
     </w:p>
     <w:p>
@@ -1866,14 +1794,7 @@
           <w:rFonts w:ascii="Arial" w:eastAsia="Arial" w:hAnsi="Arial" w:cs="Arial"/>
           <w:color w:val="000000"/>
         </w:rPr>
-        <w:t>The 5 pages</w:t>
-      </w:r>
-      <w:r>
-        <w:rPr>
-          <w:rFonts w:ascii="Arial" w:eastAsia="Arial" w:hAnsi="Arial" w:cs="Arial"/>
-          <w:color w:val="000000"/>
-        </w:rPr>
-        <w:t xml:space="preserve"> of the TaskFlow application and their assignment are defined in Table 3 below. The Team Lead takes Page 1 (Home / Dashboard) in addition to their setup responsibilities.</w:t>
+        <w:t>The 5 pages of the TaskFlow application and their assignment are defined in Table 3 below. The Team Lead takes Page 1 (Home / Dashboard) in addition to their setup responsibilities.</w:t>
       </w:r>
     </w:p>
     <w:p>
@@ -2445,16 +2366,7 @@
                 <w:sz w:val="18"/>
                 <w:szCs w:val="18"/>
               </w:rPr>
-              <w:t xml:space="preserve">A table listing all tasks with columns for title, due date, priority, and status. </w:t>
-            </w:r>
-            <w:r>
-              <w:rPr>
-                <w:rFonts w:ascii="Arial" w:eastAsia="Arial" w:hAnsi="Arial" w:cs="Arial"/>
-                <w:color w:val="000000"/>
-                <w:sz w:val="18"/>
-                <w:szCs w:val="18"/>
-              </w:rPr>
-              <w:t>Includes basic filter buttons (All / Pending / Completed).</w:t>
+              <w:t>A table listing all tasks with columns for title, due date, priority, and status. Includes basic filter buttons (All / Pending / Completed).</w:t>
             </w:r>
           </w:p>
         </w:tc>
@@ -2614,6 +2526,7 @@
                 <w:sz w:val="18"/>
                 <w:szCs w:val="18"/>
               </w:rPr>
+              <w:lastRenderedPageBreak/>
               <w:t>5</w:t>
             </w:r>
           </w:p>
@@ -2706,16 +2619,7 @@
                 <w:sz w:val="18"/>
                 <w:szCs w:val="18"/>
               </w:rPr>
-              <w:t xml:space="preserve">A page </w:t>
-            </w:r>
-            <w:r>
-              <w:rPr>
-                <w:rFonts w:ascii="Arial" w:eastAsia="Arial" w:hAnsi="Arial" w:cs="Arial"/>
-                <w:color w:val="000000"/>
-                <w:sz w:val="18"/>
-                <w:szCs w:val="18"/>
-              </w:rPr>
-              <w:t>describing the TaskFlow application, its purpose, and a simple usage guide explaining how to navigate and use the app.</w:t>
+              <w:t>A page describing the TaskFlow application, its purpose, and a simple usage guide explaining how to navigate and use the app.</w:t>
             </w:r>
           </w:p>
         </w:tc>
@@ -2803,14 +2707,7 @@
           <w:rFonts w:ascii="Arial" w:eastAsia="Arial" w:hAnsi="Arial" w:cs="Arial"/>
           <w:color w:val="000000"/>
         </w:rPr>
-        <w:t xml:space="preserve">Commit the page file and push the feature branch to </w:t>
-      </w:r>
-      <w:r>
-        <w:rPr>
-          <w:rFonts w:ascii="Arial" w:eastAsia="Arial" w:hAnsi="Arial" w:cs="Arial"/>
-          <w:color w:val="000000"/>
-        </w:rPr>
-        <w:t>GitHub.</w:t>
+        <w:t>Commit the page file and push the feature branch to GitHub.</w:t>
       </w:r>
     </w:p>
     <w:p>
@@ -2872,14 +2769,7 @@
           <w:rFonts w:ascii="Arial" w:eastAsia="Arial" w:hAnsi="Arial" w:cs="Arial"/>
           <w:color w:val="000000"/>
         </w:rPr>
-        <w:t>, which triggers the</w:t>
-      </w:r>
-      <w:r>
-        <w:rPr>
-          <w:rFonts w:ascii="Arial" w:eastAsia="Arial" w:hAnsi="Arial" w:cs="Arial"/>
-          <w:color w:val="000000"/>
-        </w:rPr>
-        <w:t xml:space="preserve"> CD workflow and deploys the updated application to Render.</w:t>
+        <w:t>, which triggers the CD workflow and deploys the updated application to Render.</w:t>
       </w:r>
     </w:p>
     <w:p>
@@ -2965,14 +2855,7 @@
           <w:rFonts w:ascii="Arial" w:eastAsia="Arial" w:hAnsi="Arial" w:cs="Arial"/>
           <w:color w:val="000000"/>
         </w:rPr>
-        <w:t xml:space="preserve">Create a new public GitHub repository named </w:t>
-      </w:r>
-      <w:r>
-        <w:rPr>
-          <w:rFonts w:ascii="Arial" w:eastAsia="Arial" w:hAnsi="Arial" w:cs="Arial"/>
-          <w:color w:val="000000"/>
-        </w:rPr>
-        <w:t>taskflow-cicd (or a name agreed by the team). Do NOT clone or fork any existing repository.</w:t>
+        <w:t>Create a new public GitHub repository named taskflow-cicd (or a name agreed by the team). Do NOT clone or fork any existing repository.</w:t>
       </w:r>
     </w:p>
     <w:p>
@@ -3034,14 +2917,7 @@
           <w:rFonts w:ascii="Arial" w:eastAsia="Arial" w:hAnsi="Arial" w:cs="Arial"/>
           <w:color w:val="000000"/>
         </w:rPr>
-        <w:t>: require at least one PR review and requi</w:t>
-      </w:r>
-      <w:r>
-        <w:rPr>
-          <w:rFonts w:ascii="Arial" w:eastAsia="Arial" w:hAnsi="Arial" w:cs="Arial"/>
-          <w:color w:val="000000"/>
-        </w:rPr>
-        <w:t>re the CI status check to pass before merging.</w:t>
+        <w:t>: require at least one PR review and require the CI status check to pass before merging.</w:t>
       </w:r>
     </w:p>
     <w:p>
@@ -3058,14 +2934,7 @@
           <w:rFonts w:ascii="Arial" w:eastAsia="Arial" w:hAnsi="Arial" w:cs="Arial"/>
           <w:color w:val="000000"/>
         </w:rPr>
-        <w:t>Team Lead: Sign up on Render (render.com), create a new Web Service connected to the Docker Hub image repository, and copy the deploy hook URL from the Render service settings. This URL will be stored as the R</w:t>
-      </w:r>
-      <w:r>
-        <w:rPr>
-          <w:rFonts w:ascii="Arial" w:eastAsia="Arial" w:hAnsi="Arial" w:cs="Arial"/>
-          <w:color w:val="000000"/>
-        </w:rPr>
-        <w:t>ENDER_DEPLOY_HOOK_URL secret.</w:t>
+        <w:t>Team Lead: Sign up on Render (render.com), create a new Web Service connected to the Docker Hub image repository, and copy the deploy hook URL from the Render service settings. This URL will be stored as the RENDER_DEPLOY_HOOK_URL secret.</w:t>
       </w:r>
     </w:p>
     <w:p>
@@ -3102,16 +2971,7 @@
           <w:bCs/>
           <w:color w:val="000000"/>
         </w:rPr>
-        <w:t>Required repository str</w:t>
-      </w:r>
-      <w:r>
-        <w:rPr>
-          <w:rFonts w:ascii="Arial" w:eastAsia="Arial" w:hAnsi="Arial" w:cs="Arial"/>
-          <w:b/>
-          <w:bCs/>
-          <w:color w:val="000000"/>
-        </w:rPr>
-        <w:t>ucture:</w:t>
+        <w:t>Required repository structure:</w:t>
       </w:r>
     </w:p>
     <w:p>
@@ -3952,6 +3812,7 @@
                 <w:sz w:val="18"/>
                 <w:szCs w:val="18"/>
               </w:rPr>
+              <w:lastRenderedPageBreak/>
               <w:t>Assignment_04_Spring2026.docx</w:t>
             </w:r>
           </w:p>
@@ -4009,18 +3870,7 @@
           <w:sz w:val="28"/>
           <w:szCs w:val="28"/>
         </w:rPr>
-        <w:t xml:space="preserve">GITHUB </w:t>
-      </w:r>
-      <w:r>
-        <w:rPr>
-          <w:rFonts w:ascii="Arial" w:eastAsia="Arial" w:hAnsi="Arial" w:cs="Arial"/>
-          <w:b/>
-          <w:bCs/>
-          <w:color w:val="1F3864"/>
-          <w:sz w:val="28"/>
-          <w:szCs w:val="28"/>
-        </w:rPr>
-        <w:t>DEVELOPMENT ENVIRONMENT &amp; SECRETS (MANDATORY)</w:t>
+        <w:t>GITHUB DEVELOPMENT ENVIRONMENT &amp; SECRETS (MANDATORY)</w:t>
       </w:r>
     </w:p>
     <w:p>
@@ -4033,7 +3883,6 @@
           <w:rFonts w:ascii="Arial" w:eastAsia="Arial" w:hAnsi="Arial" w:cs="Arial"/>
           <w:color w:val="000000"/>
         </w:rPr>
-        <w:lastRenderedPageBreak/>
         <w:t xml:space="preserve">The Team Lead (TL) is responsible for creating all secrets listed below. The TL is the repository admin and the credentials in use </w:t>
       </w:r>
       <w:r>
@@ -4155,18 +4004,7 @@
           <w:sz w:val="18"/>
           <w:szCs w:val="18"/>
         </w:rPr>
-        <w:t xml:space="preserve">Table 4: Secrets </w:t>
-      </w:r>
-      <w:r>
-        <w:rPr>
-          <w:rFonts w:ascii="Arial" w:eastAsia="Arial" w:hAnsi="Arial" w:cs="Arial"/>
-          <w:b/>
-          <w:bCs/>
-          <w:color w:val="444444"/>
-          <w:sz w:val="18"/>
-          <w:szCs w:val="18"/>
-        </w:rPr>
-        <w:t>Configuration Reference</w:t>
+        <w:t>Table 4: Secrets Configuration Reference</w:t>
       </w:r>
     </w:p>
     <w:tbl>
@@ -4619,7 +4457,7 @@
           <w:sz w:val="18"/>
           <w:szCs w:val="18"/>
         </w:rPr>
-        <w:t>All three secrets must be created by the Team Lead, as the TL is the repository admin and the credentials belong to them. DOCKERHUB_USERNAME and DOCKERHUB_TOKEN must be the Team Lead's own Docker Hub credentials, added as repository-level secrets (Settings</w:t>
+        <w:t xml:space="preserve">All three secrets must be created by the Team Lead, as the TL is the repository admin and the credentials belong to them. DOCKERHUB_USERNAME and DOCKERHUB_TOKEN must be the Team Lead's own Docker Hub credentials, added as repository-level secrets (Settings → Secrets and variables → Actions → Repository secrets). RENDER_DEPLOY_HOOK_URL is obtained from the Render web service set up by the Team Lead and must be added as an environment-level secret inside the </w:t>
       </w:r>
       <w:r>
         <w:rPr>
@@ -4628,7 +4466,7 @@
           <w:sz w:val="18"/>
           <w:szCs w:val="18"/>
         </w:rPr>
-        <w:t xml:space="preserve"> → Secrets and variables → Actions → Repository secrets). RENDER_DEPLOY_HOOK_URL is obtained from the Render web service set up by the Team Lead and must be added as an environment-level secret inside the </w:t>
+        <w:t>“development”</w:t>
       </w:r>
       <w:r>
         <w:rPr>
@@ -4637,25 +4475,7 @@
           <w:sz w:val="18"/>
           <w:szCs w:val="18"/>
         </w:rPr>
-        <w:t>“development”</w:t>
-      </w:r>
-      <w:r>
-        <w:rPr>
-          <w:rFonts w:ascii="Arial" w:eastAsia="Arial" w:hAnsi="Arial" w:cs="Arial"/>
-          <w:color w:val="555555"/>
-          <w:sz w:val="18"/>
-          <w:szCs w:val="18"/>
-        </w:rPr>
-        <w:t xml:space="preserve"> environment (Settings → Environments </w:t>
-      </w:r>
-      <w:r>
-        <w:rPr>
-          <w:rFonts w:ascii="Arial" w:eastAsia="Arial" w:hAnsi="Arial" w:cs="Arial"/>
-          <w:color w:val="555555"/>
-          <w:sz w:val="18"/>
-          <w:szCs w:val="18"/>
-        </w:rPr>
-        <w:t>→ development → Add secret).</w:t>
+        <w:t xml:space="preserve"> environment (Settings → Environments → development → Add secret).</w:t>
       </w:r>
     </w:p>
     <w:p>
@@ -4747,14 +4567,7 @@
           <w:rFonts w:ascii="Arial" w:eastAsia="Arial" w:hAnsi="Arial" w:cs="Arial"/>
           <w:color w:val="000000"/>
         </w:rPr>
-        <w:t xml:space="preserve">Step 1 – </w:t>
-      </w:r>
-      <w:r>
-        <w:rPr>
-          <w:rFonts w:ascii="Arial" w:eastAsia="Arial" w:hAnsi="Arial" w:cs="Arial"/>
-          <w:color w:val="000000"/>
-        </w:rPr>
-        <w:t>Checkout: Check out the repository code using actions/checkout.</w:t>
+        <w:t>Step 1 – Checkout: Check out the repository code using actions/checkout.</w:t>
       </w:r>
     </w:p>
     <w:p>
@@ -4788,14 +4601,7 @@
           <w:rFonts w:ascii="Arial" w:eastAsia="Arial" w:hAnsi="Arial" w:cs="Arial"/>
           <w:color w:val="000000"/>
         </w:rPr>
-        <w:t xml:space="preserve">Step 3 – Build Image: Build the Docker image from the </w:t>
-      </w:r>
-      <w:r>
-        <w:rPr>
-          <w:rFonts w:ascii="Arial" w:eastAsia="Arial" w:hAnsi="Arial" w:cs="Arial"/>
-          <w:color w:val="000000"/>
-        </w:rPr>
-        <w:t>Dockerfile in the project root.</w:t>
+        <w:t>Step 3 – Build Image: Build the Docker image from the Dockerfile in the project root.</w:t>
       </w:r>
     </w:p>
     <w:p>
@@ -4895,6 +4701,7 @@
           <w:rFonts w:ascii="Arial" w:eastAsia="Arial" w:hAnsi="Arial" w:cs="Arial"/>
           <w:color w:val="000000"/>
         </w:rPr>
+        <w:lastRenderedPageBreak/>
         <w:t xml:space="preserve">The CI status check must appear as a required check in the Branch Protection Rules on </w:t>
       </w:r>
       <w:r>
@@ -4933,19 +4740,64 @@
           <w:sz w:val="28"/>
           <w:szCs w:val="28"/>
         </w:rPr>
-        <w:t>CD PIPELINE R</w:t>
-      </w:r>
+        <w:t>CD PIPELINE REQUIREMENTS  (.github/workflows/cd.yml)</w:t>
+      </w:r>
+    </w:p>
+    <w:p>
+      <w:pPr>
+        <w:spacing w:before="60" w:after="120"/>
+        <w:jc w:val="both"/>
+      </w:pPr>
       <w:r>
         <w:rPr>
           <w:rFonts w:ascii="Arial" w:eastAsia="Arial" w:hAnsi="Arial" w:cs="Arial"/>
           <w:b/>
           <w:bCs/>
-          <w:color w:val="1F3864"/>
-          <w:sz w:val="28"/>
-          <w:szCs w:val="28"/>
-        </w:rPr>
-        <w:t>EQUIREMENTS  (.github/workflows/cd.yml)</w:t>
-      </w:r>
+          <w:color w:val="000000"/>
+        </w:rPr>
+        <w:t xml:space="preserve">Trigger: The CD workflow must be triggered by a push event on the </w:t>
+      </w:r>
+      <w:r>
+        <w:rPr>
+          <w:rFonts w:ascii="Arial" w:eastAsia="Arial" w:hAnsi="Arial" w:cs="Arial"/>
+          <w:b/>
+          <w:bCs/>
+          <w:color w:val="000000"/>
+        </w:rPr>
+        <w:t>“develop”</w:t>
+      </w:r>
+      <w:r>
+        <w:rPr>
+          <w:rFonts w:ascii="Arial" w:eastAsia="Arial" w:hAnsi="Arial" w:cs="Arial"/>
+          <w:b/>
+          <w:bCs/>
+          <w:color w:val="000000"/>
+        </w:rPr>
+        <w:t xml:space="preserve"> branch. This push event occurs automatically when a Pull Request is merged into </w:t>
+      </w:r>
+      <w:r>
+        <w:rPr>
+          <w:rFonts w:ascii="Arial" w:eastAsia="Arial" w:hAnsi="Arial" w:cs="Arial"/>
+          <w:b/>
+          <w:bCs/>
+          <w:color w:val="000000"/>
+        </w:rPr>
+        <w:t>“develop”</w:t>
+      </w:r>
+      <w:r>
+        <w:rPr>
+          <w:rFonts w:ascii="Arial" w:eastAsia="Arial" w:hAnsi="Arial" w:cs="Arial"/>
+          <w:b/>
+          <w:bCs/>
+          <w:color w:val="000000"/>
+        </w:rPr>
+        <w:t>.</w:t>
+      </w:r>
+    </w:p>
+    <w:p>
+      <w:pPr>
+        <w:spacing w:after="100"/>
+      </w:pPr>
     </w:p>
     <w:p>
       <w:pPr>
@@ -4955,72 +4807,9 @@
       <w:r>
         <w:rPr>
           <w:rFonts w:ascii="Arial" w:eastAsia="Arial" w:hAnsi="Arial" w:cs="Arial"/>
-          <w:b/>
-          <w:bCs/>
-          <w:color w:val="000000"/>
-        </w:rPr>
-        <w:t xml:space="preserve">Trigger: The CD workflow must be triggered by a push event on the </w:t>
-      </w:r>
-      <w:r>
-        <w:rPr>
-          <w:rFonts w:ascii="Arial" w:eastAsia="Arial" w:hAnsi="Arial" w:cs="Arial"/>
-          <w:b/>
-          <w:bCs/>
-          <w:color w:val="000000"/>
-        </w:rPr>
-        <w:t>“develop”</w:t>
-      </w:r>
-      <w:r>
-        <w:rPr>
-          <w:rFonts w:ascii="Arial" w:eastAsia="Arial" w:hAnsi="Arial" w:cs="Arial"/>
-          <w:b/>
-          <w:bCs/>
-          <w:color w:val="000000"/>
-        </w:rPr>
-        <w:t xml:space="preserve"> branch. This push event occurs automatically when a Pull Request is merged into </w:t>
-      </w:r>
-      <w:r>
-        <w:rPr>
-          <w:rFonts w:ascii="Arial" w:eastAsia="Arial" w:hAnsi="Arial" w:cs="Arial"/>
-          <w:b/>
-          <w:bCs/>
-          <w:color w:val="000000"/>
-        </w:rPr>
-        <w:t>“develop”</w:t>
-      </w:r>
-      <w:r>
-        <w:rPr>
-          <w:rFonts w:ascii="Arial" w:eastAsia="Arial" w:hAnsi="Arial" w:cs="Arial"/>
-          <w:b/>
-          <w:bCs/>
-          <w:color w:val="000000"/>
-        </w:rPr>
-        <w:t>.</w:t>
-      </w:r>
-    </w:p>
-    <w:p>
-      <w:pPr>
-        <w:spacing w:after="100"/>
-      </w:pPr>
-    </w:p>
-    <w:p>
-      <w:pPr>
-        <w:spacing w:before="60" w:after="120"/>
-        <w:jc w:val="both"/>
-      </w:pPr>
-      <w:r>
-        <w:rPr>
-          <w:rFonts w:ascii="Arial" w:eastAsia="Arial" w:hAnsi="Arial" w:cs="Arial"/>
-          <w:color w:val="000000"/>
-        </w:rPr>
-        <w:t>The CD workflow must include the following steps</w:t>
-      </w:r>
-      <w:r>
-        <w:rPr>
-          <w:rFonts w:ascii="Arial" w:eastAsia="Arial" w:hAnsi="Arial" w:cs="Arial"/>
-          <w:color w:val="000000"/>
-        </w:rPr>
-        <w:t xml:space="preserve"> in order:</w:t>
+          <w:color w:val="000000"/>
+        </w:rPr>
+        <w:t>The CD workflow must include the following steps in order:</w:t>
       </w:r>
     </w:p>
     <w:p>
@@ -5071,14 +4860,7 @@
           <w:rFonts w:ascii="Arial" w:eastAsia="Arial" w:hAnsi="Arial" w:cs="Arial"/>
           <w:color w:val="000000"/>
         </w:rPr>
-        <w:t>Step 3</w:t>
-      </w:r>
-      <w:r>
-        <w:rPr>
-          <w:rFonts w:ascii="Arial" w:eastAsia="Arial" w:hAnsi="Arial" w:cs="Arial"/>
-          <w:color w:val="000000"/>
-        </w:rPr>
-        <w:t xml:space="preserve"> – Deploy: Send an HTTP POST request to the Render deploy hook URL using curl:</w:t>
+        <w:t>Step 3 – Deploy: Send an HTTP POST request to the Render deploy hook URL using curl:</w:t>
       </w:r>
     </w:p>
     <w:p>
@@ -5148,14 +4930,7 @@
           <w:rFonts w:ascii="Arial" w:eastAsia="Arial" w:hAnsi="Arial" w:cs="Arial"/>
           <w:color w:val="000000"/>
         </w:rPr>
-        <w:t>The CD wor</w:t>
-      </w:r>
-      <w:r>
-        <w:rPr>
-          <w:rFonts w:ascii="Arial" w:eastAsia="Arial" w:hAnsi="Arial" w:cs="Arial"/>
-          <w:color w:val="000000"/>
-        </w:rPr>
-        <w:t>kflow file must declare runs-on: ubuntu-latest.</w:t>
+        <w:t>The CD workflow file must declare runs-on: ubuntu-latest.</w:t>
       </w:r>
     </w:p>
     <w:p>
@@ -5348,18 +5123,7 @@
                 <w:sz w:val="18"/>
                 <w:szCs w:val="18"/>
               </w:rPr>
-              <w:t xml:space="preserve">Key </w:t>
-            </w:r>
-            <w:r>
-              <w:rPr>
-                <w:rFonts w:ascii="Arial" w:eastAsia="Arial" w:hAnsi="Arial" w:cs="Arial"/>
-                <w:b/>
-                <w:bCs/>
-                <w:color w:val="FFFFFF"/>
-                <w:sz w:val="18"/>
-                <w:szCs w:val="18"/>
-              </w:rPr>
-              <w:t>Steps</w:t>
+              <w:t>Key Steps</w:t>
             </w:r>
           </w:p>
         </w:tc>
@@ -5707,14 +5471,7 @@
           <w:rFonts w:ascii="Arial" w:eastAsia="Arial" w:hAnsi="Arial" w:cs="Arial"/>
           <w:color w:val="000000"/>
         </w:rPr>
-        <w:t>Commit the Assignment 04 question paper (.docx) to the root of the repository. Every t</w:t>
-      </w:r>
-      <w:r>
-        <w:rPr>
-          <w:rFonts w:ascii="Arial" w:eastAsia="Arial" w:hAnsi="Arial" w:cs="Arial"/>
-          <w:color w:val="000000"/>
-        </w:rPr>
-        <w:t xml:space="preserve">eam member must fill in their details </w:t>
+        <w:t xml:space="preserve">Commit the Assignment 04 question paper (.docx) to the root of the repository. Every team member must fill in their details </w:t>
       </w:r>
       <w:r>
         <w:rPr>
@@ -5818,14 +5575,7 @@
           <w:rFonts w:ascii="Arial" w:eastAsia="Arial" w:hAnsi="Arial" w:cs="Arial"/>
           <w:color w:val="000000"/>
         </w:rPr>
-        <w:t>Team Lead: Apply Branch Protection Rules on th</w:t>
-      </w:r>
-      <w:r>
-        <w:rPr>
-          <w:rFonts w:ascii="Arial" w:eastAsia="Arial" w:hAnsi="Arial" w:cs="Arial"/>
-          <w:color w:val="000000"/>
-        </w:rPr>
-        <w:t xml:space="preserve">e </w:t>
+        <w:t xml:space="preserve">Team Lead: Apply Branch Protection Rules on the </w:t>
       </w:r>
       <w:r>
         <w:rPr>
@@ -5946,14 +5696,7 @@
           <w:rFonts w:ascii="Arial" w:eastAsia="Arial" w:hAnsi="Arial" w:cs="Arial"/>
           <w:color w:val="000000"/>
         </w:rPr>
-        <w:t>Each team membe</w:t>
-      </w:r>
-      <w:r>
-        <w:rPr>
-          <w:rFonts w:ascii="Arial" w:eastAsia="Arial" w:hAnsi="Arial" w:cs="Arial"/>
-          <w:color w:val="000000"/>
-        </w:rPr>
-        <w:t>r must independently complete the following full DevOps flow for their assigned page (refer to Table 3):</w:t>
+        <w:t>Each team member must independently complete the following full DevOps flow for their assigned page (refer to Table 3):</w:t>
       </w:r>
     </w:p>
     <w:p>
@@ -5989,6 +5732,7 @@
           <w:sz w:val="19"/>
           <w:szCs w:val="19"/>
         </w:rPr>
+        <w:lastRenderedPageBreak/>
         <w:t>Build the assigned HTML page with proper content and link it to style.css</w:t>
       </w:r>
     </w:p>
@@ -6007,15 +5751,7 @@
           <w:sz w:val="19"/>
           <w:szCs w:val="19"/>
         </w:rPr>
-        <w:t xml:space="preserve">Commit the </w:t>
-      </w:r>
-      <w:r>
-        <w:rPr>
-          <w:rFonts w:ascii="Arial" w:eastAsia="Arial" w:hAnsi="Arial" w:cs="Arial"/>
-          <w:sz w:val="19"/>
-          <w:szCs w:val="19"/>
-        </w:rPr>
-        <w:t>page and push the feature branch to GitHub</w:t>
+        <w:t>Commit the page and push the feature branch to GitHub</w:t>
       </w:r>
     </w:p>
     <w:p>
@@ -6116,14 +5852,7 @@
           <w:rFonts w:ascii="Arial" w:eastAsia="Arial" w:hAnsi="Arial" w:cs="Arial"/>
           <w:color w:val="000000"/>
         </w:rPr>
-        <w:t xml:space="preserve">After all 5 PRs are merged, verify the </w:t>
-      </w:r>
-      <w:r>
-        <w:rPr>
-          <w:rFonts w:ascii="Arial" w:eastAsia="Arial" w:hAnsi="Arial" w:cs="Arial"/>
-          <w:color w:val="000000"/>
-        </w:rPr>
-        <w:t>live TaskFlow application on Render contains all five pages and navigation between them works correctly.</w:t>
+        <w:t>After all 5 PRs are merged, verify the live TaskFlow application on Render contains all five pages and navigation between them works correctly.</w:t>
       </w:r>
     </w:p>
     <w:p>
@@ -6546,16 +6275,7 @@
                 <w:sz w:val="18"/>
                 <w:szCs w:val="18"/>
               </w:rPr>
-              <w:t xml:space="preserve">Version the Assignment 04 question paper (Assignment_04_Spring2026.docx) inside the repo root; each </w:t>
-            </w:r>
-            <w:r>
-              <w:rPr>
-                <w:rFonts w:ascii="Arial" w:eastAsia="Arial" w:hAnsi="Arial" w:cs="Arial"/>
-                <w:color w:val="000000"/>
-                <w:sz w:val="18"/>
-                <w:szCs w:val="18"/>
-              </w:rPr>
-              <w:t>member fills their row including Assigned Page</w:t>
+              <w:t>Version the Assignment 04 question paper (Assignment_04_Spring2026.docx) inside the repo root; each member fills their row including Assigned Page</w:t>
             </w:r>
           </w:p>
         </w:tc>
@@ -6838,16 +6558,7 @@
                 <w:sz w:val="18"/>
                 <w:szCs w:val="18"/>
               </w:rPr>
-              <w:t xml:space="preserve">Configure repository-level secrets: DOCKERHUB_USERNAME, DOCKERHUB_TOKEN (Team Lead's </w:t>
-            </w:r>
-            <w:r>
-              <w:rPr>
-                <w:rFonts w:ascii="Arial" w:eastAsia="Arial" w:hAnsi="Arial" w:cs="Arial"/>
-                <w:color w:val="000000"/>
-                <w:sz w:val="18"/>
-                <w:szCs w:val="18"/>
-              </w:rPr>
-              <w:t>credentials)</w:t>
+              <w:t>Configure repository-level secrets: DOCKERHUB_USERNAME, DOCKERHUB_TOKEN (Team Lead's credentials)</w:t>
             </w:r>
           </w:p>
         </w:tc>
@@ -7130,16 +6841,7 @@
                 <w:sz w:val="18"/>
                 <w:szCs w:val="18"/>
               </w:rPr>
-              <w:t xml:space="preserve">Each member creates their feature branch using the </w:t>
-            </w:r>
-            <w:r>
-              <w:rPr>
-                <w:rFonts w:ascii="Arial" w:eastAsia="Arial" w:hAnsi="Arial" w:cs="Arial"/>
-                <w:color w:val="000000"/>
-                <w:sz w:val="18"/>
-                <w:szCs w:val="18"/>
-              </w:rPr>
-              <w:t>correct naming convention (feature/&lt;username&gt;/&lt;page-name&gt;)</w:t>
+              <w:t>Each member creates their feature branch using the correct naming convention (feature/&lt;username&gt;/&lt;page-name&gt;)</w:t>
             </w:r>
           </w:p>
         </w:tc>
@@ -7345,16 +7047,7 @@
                 <w:sz w:val="18"/>
                 <w:szCs w:val="18"/>
               </w:rPr>
-              <w:t xml:space="preserve">; PR description is meaningful and CI </w:t>
-            </w:r>
-            <w:r>
-              <w:rPr>
-                <w:rFonts w:ascii="Arial" w:eastAsia="Arial" w:hAnsi="Arial" w:cs="Arial"/>
-                <w:color w:val="000000"/>
-                <w:sz w:val="18"/>
-                <w:szCs w:val="18"/>
-              </w:rPr>
-              <w:t>passes before merge</w:t>
+              <w:t>; PR description is meaningful and CI passes before merge</w:t>
             </w:r>
           </w:p>
         </w:tc>
@@ -7731,16 +7424,7 @@
                 <w:sz w:val="18"/>
                 <w:szCs w:val="18"/>
               </w:rPr>
-              <w:t xml:space="preserve">Build Docker image and tag correctly (latest and/or </w:t>
-            </w:r>
-            <w:r>
-              <w:rPr>
-                <w:rFonts w:ascii="Arial" w:eastAsia="Arial" w:hAnsi="Arial" w:cs="Arial"/>
-                <w:color w:val="000000"/>
-                <w:sz w:val="18"/>
-                <w:szCs w:val="18"/>
-              </w:rPr>
-              <w:t>commit SHA)</w:t>
+              <w:t>Build Docker image and tag correctly (latest and/or commit SHA)</w:t>
             </w:r>
           </w:p>
         </w:tc>
@@ -8181,6 +7865,7 @@
                 <w:sz w:val="18"/>
                 <w:szCs w:val="18"/>
               </w:rPr>
+              <w:lastRenderedPageBreak/>
               <w:t>15</w:t>
             </w:r>
           </w:p>
@@ -8211,16 +7896,7 @@
                 <w:sz w:val="18"/>
                 <w:szCs w:val="18"/>
               </w:rPr>
-              <w:t xml:space="preserve">Deploy step invokes Render webhook via curl POST; deployed app </w:t>
-            </w:r>
-            <w:r>
-              <w:rPr>
-                <w:rFonts w:ascii="Arial" w:eastAsia="Arial" w:hAnsi="Arial" w:cs="Arial"/>
-                <w:color w:val="000000"/>
-                <w:sz w:val="18"/>
-                <w:szCs w:val="18"/>
-              </w:rPr>
-              <w:t>on Render contains all 5 pages</w:t>
+              <w:t>Deploy step invokes Render webhook via curl POST; deployed app on Render contains all 5 pages</w:t>
             </w:r>
           </w:p>
         </w:tc>
@@ -8494,16 +8170,7 @@
                 <w:sz w:val="18"/>
                 <w:szCs w:val="18"/>
               </w:rPr>
-              <w:t xml:space="preserve">Individual reflection (4–5 lines per member) on </w:t>
-            </w:r>
-            <w:r>
-              <w:rPr>
-                <w:rFonts w:ascii="Arial" w:eastAsia="Arial" w:hAnsi="Arial" w:cs="Arial"/>
-                <w:color w:val="000000"/>
-                <w:sz w:val="18"/>
-                <w:szCs w:val="18"/>
-              </w:rPr>
-              <w:t>CI/CD integration and page development experience</w:t>
+              <w:t>Individual reflection (4–5 lines per member) on CI/CD integration and page development experience</w:t>
             </w:r>
           </w:p>
         </w:tc>
@@ -8672,14 +8339,7 @@
           <w:rFonts w:ascii="Arial" w:eastAsia="Arial" w:hAnsi="Arial" w:cs="Arial"/>
           <w:color w:val="000000"/>
         </w:rPr>
-        <w:t xml:space="preserve">Completed Assignment 04 document with all group details filled in (including each member's Assigned </w:t>
-      </w:r>
-      <w:r>
-        <w:rPr>
-          <w:rFonts w:ascii="Arial" w:eastAsia="Arial" w:hAnsi="Arial" w:cs="Arial"/>
-          <w:color w:val="000000"/>
-        </w:rPr>
-        <w:t>Page).</w:t>
+        <w:t>Completed Assignment 04 document with all group details filled in (including each member's Assigned Page).</w:t>
       </w:r>
     </w:p>
     <w:p>
@@ -8761,14 +8421,7 @@
           <w:rFonts w:ascii="Arial" w:eastAsia="Arial" w:hAnsi="Arial" w:cs="Arial"/>
           <w:color w:val="000000"/>
         </w:rPr>
-        <w:t>Screenshot 2: Each member's CI workflow run triggered by their in</w:t>
-      </w:r>
-      <w:r>
-        <w:rPr>
-          <w:rFonts w:ascii="Arial" w:eastAsia="Arial" w:hAnsi="Arial" w:cs="Arial"/>
-          <w:color w:val="000000"/>
-        </w:rPr>
-        <w:t xml:space="preserve">dividual PR </w:t>
+        <w:t xml:space="preserve">Screenshot 2: Each member's CI workflow run triggered by their individual PR </w:t>
       </w:r>
       <w:r>
         <w:rPr>
@@ -8861,14 +8514,7 @@
           <w:rFonts w:ascii="Arial" w:eastAsia="Arial" w:hAnsi="Arial" w:cs="Arial"/>
           <w:color w:val="000000"/>
         </w:rPr>
-        <w:t>Scre</w:t>
-      </w:r>
-      <w:r>
-        <w:rPr>
-          <w:rFonts w:ascii="Arial" w:eastAsia="Arial" w:hAnsi="Arial" w:cs="Arial"/>
-          <w:color w:val="000000"/>
-        </w:rPr>
-        <w:t>enshot 5: Live TaskFlow application on Render showing all five pages are accessible.</w:t>
+        <w:t>Screenshot 5: Live TaskFlow application on Render showing all five pages are accessible.</w:t>
       </w:r>
     </w:p>
     <w:p>
@@ -8902,14 +8548,7 @@
           <w:rFonts w:ascii="Arial" w:eastAsia="Arial" w:hAnsi="Arial" w:cs="Arial"/>
           <w:color w:val="000000"/>
         </w:rPr>
-        <w:t xml:space="preserve">Individual reflection: Each team member must write 4–5 lines on what they </w:t>
-      </w:r>
-      <w:r>
-        <w:rPr>
-          <w:rFonts w:ascii="Arial" w:eastAsia="Arial" w:hAnsi="Arial" w:cs="Arial"/>
-          <w:color w:val="000000"/>
-        </w:rPr>
-        <w:t>learnt and any challenges they faced.</w:t>
+        <w:t>Individual reflection: Each team member must write 4–5 lines on what they learnt and any challenges they faced.</w:t>
       </w:r>
     </w:p>
     <w:p>
@@ -9415,6 +9054,7 @@
           <w:sz w:val="28"/>
           <w:szCs w:val="28"/>
         </w:rPr>
+        <w:lastRenderedPageBreak/>
         <w:t>TEAM REFLECTION</w:t>
       </w:r>
     </w:p>
@@ -9448,16 +9088,7 @@
           <w:bCs/>
           <w:color w:val="000000"/>
         </w:rPr>
-        <w:t xml:space="preserve">Member 1  (Name: </w:t>
-      </w:r>
-      <w:r>
-        <w:rPr>
-          <w:rFonts w:ascii="Arial" w:eastAsia="Arial" w:hAnsi="Arial" w:cs="Arial"/>
-          <w:b/>
-          <w:bCs/>
-          <w:color w:val="000000"/>
-        </w:rPr>
-        <w:t>_______________________________________________)</w:t>
+        <w:t>Member 1  (Name: _______________________________________________)</w:t>
       </w:r>
     </w:p>
     <w:tbl>
@@ -9778,16 +9409,7 @@
           <w:bCs/>
           <w:color w:val="000000"/>
         </w:rPr>
-        <w:t xml:space="preserve">Member 4  (Name: </w:t>
-      </w:r>
-      <w:r>
-        <w:rPr>
-          <w:rFonts w:ascii="Arial" w:eastAsia="Arial" w:hAnsi="Arial" w:cs="Arial"/>
-          <w:b/>
-          <w:bCs/>
-          <w:color w:val="000000"/>
-        </w:rPr>
-        <w:t>_______________________________________________)</w:t>
+        <w:t>Member 4  (Name: _______________________________________________)</w:t>
       </w:r>
     </w:p>
     <w:tbl>
@@ -10006,7 +9628,7 @@
 </file>
 
 <file path=word/endnotes.xml><?xml version="1.0" encoding="utf-8"?>
-<w:endnotes xmlns:wpc="http://schemas.microsoft.com/office/word/2010/wordprocessingCanvas" xmlns:cx="http://schemas.microsoft.com/office/drawing/2014/chartex" xmlns:cx1="http://schemas.microsoft.com/office/drawing/2015/9/8/chartex" xmlns:cx2="http://schemas.microsoft.com/office/drawing/2015/10/21/chartex" xmlns:cx3="http://schemas.microsoft.com/office/drawing/2016/5/9/chartex" xmlns:cx4="http://schemas.microsoft.com/office/drawing/2016/5/10/chartex" xmlns:cx5="http://schemas.microsoft.com/office/drawing/2016/5/11/chartex" xmlns:cx6="http://schemas.microsoft.com/office/drawing/2016/5/12/chartex" xmlns:cx7="http://schemas.microsoft.com/office/drawing/2016/5/13/chartex" xmlns:cx8="http://schemas.microsoft.com/office/drawing/2016/5/14/chartex" xmlns:mc="http://schemas.openxmlformats.org/markup-compatibility/2006" xmlns:aink="http://schemas.microsoft.com/office/drawing/2016/ink" xmlns:am3d="http://schemas.microsoft.com/office/drawing/2017/model3d" xmlns:o="urn:schemas-microsoft-com:office:office" xmlns:r="http://schemas.openxmlformats.org/officeDocument/2006/relationships" xmlns:m="http://schemas.openxmlformats.org/officeDocument/2006/math" xmlns:v="urn:schemas-microsoft-com:vml" xmlns:wp14="http://schemas.microsoft.com/office/word/2010/wordprocessingDrawing" xmlns:wp="http://schemas.openxmlformats.org/drawingml/2006/wordprocessingDrawing" xmlns:w10="urn:schemas-microsoft-com:office:word" xmlns:w="http://schemas.openxmlformats.org/wordprocessingml/2006/main" xmlns:w14="http://schemas.microsoft.com/office/word/2010/wordml" xmlns:w15="http://schemas.microsoft.com/office/word/2012/wordml" xmlns:w16cex="http://schemas.microsoft.com/office/word/2018/wordml/cex" xmlns:w16cid="http://schemas.microsoft.com/office/word/2016/wordml/cid" xmlns:w16="http://schemas.microsoft.com/office/word/2018/wordml" xmlns:w16sdtdh="http://schemas.microsoft.com/office/word/2020/wordml/sdtdatahash" xmlns:w16se="http://schemas.microsoft.com/office/word/2015/wordml/symex" xmlns:wpg="http://schemas.microsoft.com/office/word/2010/wordprocessingGroup" xmlns:wpi="http://schemas.microsoft.com/office/word/2010/wordprocessingInk" xmlns:wne="http://schemas.microsoft.com/office/word/2006/wordml" xmlns:wps="http://schemas.microsoft.com/office/word/2010/wordprocessingShape" mc:Ignorable="w14 w15 w16se w16cid w16 w16cex w16sdtdh wp14">
+<w:endnotes xmlns:wpc="http://schemas.microsoft.com/office/word/2010/wordprocessingCanvas" xmlns:cx="http://schemas.microsoft.com/office/drawing/2014/chartex" xmlns:cx1="http://schemas.microsoft.com/office/drawing/2015/9/8/chartex" xmlns:cx2="http://schemas.microsoft.com/office/drawing/2015/10/21/chartex" xmlns:cx3="http://schemas.microsoft.com/office/drawing/2016/5/9/chartex" xmlns:cx4="http://schemas.microsoft.com/office/drawing/2016/5/10/chartex" xmlns:cx5="http://schemas.microsoft.com/office/drawing/2016/5/11/chartex" xmlns:cx6="http://schemas.microsoft.com/office/drawing/2016/5/12/chartex" xmlns:cx7="http://schemas.microsoft.com/office/drawing/2016/5/13/chartex" xmlns:cx8="http://schemas.microsoft.com/office/drawing/2016/5/14/chartex" xmlns:mc="http://schemas.openxmlformats.org/markup-compatibility/2006" xmlns:aink="http://schemas.microsoft.com/office/drawing/2016/ink" xmlns:am3d="http://schemas.microsoft.com/office/drawing/2017/model3d" xmlns:o="urn:schemas-microsoft-com:office:office" xmlns:oel="http://schemas.microsoft.com/office/2019/extlst" xmlns:r="http://schemas.openxmlformats.org/officeDocument/2006/relationships" xmlns:m="http://schemas.openxmlformats.org/officeDocument/2006/math" xmlns:v="urn:schemas-microsoft-com:vml" xmlns:wp14="http://schemas.microsoft.com/office/word/2010/wordprocessingDrawing" xmlns:wp="http://schemas.openxmlformats.org/drawingml/2006/wordprocessingDrawing" xmlns:w10="urn:schemas-microsoft-com:office:word" xmlns:w="http://schemas.openxmlformats.org/wordprocessingml/2006/main" xmlns:w14="http://schemas.microsoft.com/office/word/2010/wordml" xmlns:w15="http://schemas.microsoft.com/office/word/2012/wordml" xmlns:w16cex="http://schemas.microsoft.com/office/word/2018/wordml/cex" xmlns:w16cid="http://schemas.microsoft.com/office/word/2016/wordml/cid" xmlns:w16="http://schemas.microsoft.com/office/word/2018/wordml" xmlns:w16du="http://schemas.microsoft.com/office/word/2023/wordml/word16du" xmlns:w16sdtdh="http://schemas.microsoft.com/office/word/2020/wordml/sdtdatahash" xmlns:w16sdtfl="http://schemas.microsoft.com/office/word/2024/wordml/sdtformatlock" xmlns:w16se="http://schemas.microsoft.com/office/word/2015/wordml/symex" xmlns:wpg="http://schemas.microsoft.com/office/word/2010/wordprocessingGroup" xmlns:wpi="http://schemas.microsoft.com/office/word/2010/wordprocessingInk" xmlns:wne="http://schemas.microsoft.com/office/word/2006/wordml" xmlns:wps="http://schemas.microsoft.com/office/word/2010/wordprocessingShape" mc:Ignorable="w14 w15 w16se w16cid w16 w16cex w16sdtdh w16sdtfl w16du wp14">
   <w:endnote w:type="separator" w:id="-1">
     <w:p>
       <w:r>
@@ -10025,7 +9647,7 @@
 </file>
 
 <file path=word/footer1.xml><?xml version="1.0" encoding="utf-8"?>
-<w:ftr xmlns:wpc="http://schemas.microsoft.com/office/word/2010/wordprocessingCanvas" xmlns:cx="http://schemas.microsoft.com/office/drawing/2014/chartex" xmlns:cx1="http://schemas.microsoft.com/office/drawing/2015/9/8/chartex" xmlns:cx2="http://schemas.microsoft.com/office/drawing/2015/10/21/chartex" xmlns:cx3="http://schemas.microsoft.com/office/drawing/2016/5/9/chartex" xmlns:cx4="http://schemas.microsoft.com/office/drawing/2016/5/10/chartex" xmlns:cx5="http://schemas.microsoft.com/office/drawing/2016/5/11/chartex" xmlns:cx6="http://schemas.microsoft.com/office/drawing/2016/5/12/chartex" xmlns:cx7="http://schemas.microsoft.com/office/drawing/2016/5/13/chartex" xmlns:cx8="http://schemas.microsoft.com/office/drawing/2016/5/14/chartex" xmlns:mc="http://schemas.openxmlformats.org/markup-compatibility/2006" xmlns:aink="http://schemas.microsoft.com/office/drawing/2016/ink" xmlns:am3d="http://schemas.microsoft.com/office/drawing/2017/model3d" xmlns:o="urn:schemas-microsoft-com:office:office" xmlns:r="http://schemas.openxmlformats.org/officeDocument/2006/relationships" xmlns:m="http://schemas.openxmlformats.org/officeDocument/2006/math" xmlns:v="urn:schemas-microsoft-com:vml" xmlns:wp14="http://schemas.microsoft.com/office/word/2010/wordprocessingDrawing" xmlns:wp="http://schemas.openxmlformats.org/drawingml/2006/wordprocessingDrawing" xmlns:w10="urn:schemas-microsoft-com:office:word" xmlns:w="http://schemas.openxmlformats.org/wordprocessingml/2006/main" xmlns:w14="http://schemas.microsoft.com/office/word/2010/wordml" xmlns:w15="http://schemas.microsoft.com/office/word/2012/wordml" xmlns:w16cex="http://schemas.microsoft.com/office/word/2018/wordml/cex" xmlns:w16cid="http://schemas.microsoft.com/office/word/2016/wordml/cid" xmlns:w16="http://schemas.microsoft.com/office/word/2018/wordml" xmlns:w16sdtdh="http://schemas.microsoft.com/office/word/2020/wordml/sdtdatahash" xmlns:w16se="http://schemas.microsoft.com/office/word/2015/wordml/symex" xmlns:wpg="http://schemas.microsoft.com/office/word/2010/wordprocessingGroup" xmlns:wpi="http://schemas.microsoft.com/office/word/2010/wordprocessingInk" xmlns:wne="http://schemas.microsoft.com/office/word/2006/wordml" xmlns:wps="http://schemas.microsoft.com/office/word/2010/wordprocessingShape" mc:Ignorable="w14 w15 w16se w16cid w16 w16cex w16sdtdh wp14">
+<w:ftr xmlns:wpc="http://schemas.microsoft.com/office/word/2010/wordprocessingCanvas" xmlns:cx="http://schemas.microsoft.com/office/drawing/2014/chartex" xmlns:cx1="http://schemas.microsoft.com/office/drawing/2015/9/8/chartex" xmlns:cx2="http://schemas.microsoft.com/office/drawing/2015/10/21/chartex" xmlns:cx3="http://schemas.microsoft.com/office/drawing/2016/5/9/chartex" xmlns:cx4="http://schemas.microsoft.com/office/drawing/2016/5/10/chartex" xmlns:cx5="http://schemas.microsoft.com/office/drawing/2016/5/11/chartex" xmlns:cx6="http://schemas.microsoft.com/office/drawing/2016/5/12/chartex" xmlns:cx7="http://schemas.microsoft.com/office/drawing/2016/5/13/chartex" xmlns:cx8="http://schemas.microsoft.com/office/drawing/2016/5/14/chartex" xmlns:mc="http://schemas.openxmlformats.org/markup-compatibility/2006" xmlns:aink="http://schemas.microsoft.com/office/drawing/2016/ink" xmlns:am3d="http://schemas.microsoft.com/office/drawing/2017/model3d" xmlns:o="urn:schemas-microsoft-com:office:office" xmlns:oel="http://schemas.microsoft.com/office/2019/extlst" xmlns:r="http://schemas.openxmlformats.org/officeDocument/2006/relationships" xmlns:m="http://schemas.openxmlformats.org/officeDocument/2006/math" xmlns:v="urn:schemas-microsoft-com:vml" xmlns:wp14="http://schemas.microsoft.com/office/word/2010/wordprocessingDrawing" xmlns:wp="http://schemas.openxmlformats.org/drawingml/2006/wordprocessingDrawing" xmlns:w10="urn:schemas-microsoft-com:office:word" xmlns:w="http://schemas.openxmlformats.org/wordprocessingml/2006/main" xmlns:w14="http://schemas.microsoft.com/office/word/2010/wordml" xmlns:w15="http://schemas.microsoft.com/office/word/2012/wordml" xmlns:w16cex="http://schemas.microsoft.com/office/word/2018/wordml/cex" xmlns:w16cid="http://schemas.microsoft.com/office/word/2016/wordml/cid" xmlns:w16="http://schemas.microsoft.com/office/word/2018/wordml" xmlns:w16du="http://schemas.microsoft.com/office/word/2023/wordml/word16du" xmlns:w16sdtdh="http://schemas.microsoft.com/office/word/2020/wordml/sdtdatahash" xmlns:w16sdtfl="http://schemas.microsoft.com/office/word/2024/wordml/sdtformatlock" xmlns:w16se="http://schemas.microsoft.com/office/word/2015/wordml/symex" xmlns:wpg="http://schemas.microsoft.com/office/word/2010/wordprocessingGroup" xmlns:wpi="http://schemas.microsoft.com/office/word/2010/wordprocessingInk" xmlns:wne="http://schemas.microsoft.com/office/word/2006/wordml" xmlns:wps="http://schemas.microsoft.com/office/word/2010/wordprocessingShape" mc:Ignorable="w14 w15 w16se w16cid w16 w16cex w16sdtdh w16sdtfl w16du wp14">
   <w:p>
     <w:pPr>
       <w:pStyle w:val="Footer"/>
@@ -10035,7 +9657,7 @@
 </file>
 
 <file path=word/footer2.xml><?xml version="1.0" encoding="utf-8"?>
-<w:ftr xmlns:wpc="http://schemas.microsoft.com/office/word/2010/wordprocessingCanvas" xmlns:cx="http://schemas.microsoft.com/office/drawing/2014/chartex" xmlns:cx1="http://schemas.microsoft.com/office/drawing/2015/9/8/chartex" xmlns:cx2="http://schemas.microsoft.com/office/drawing/2015/10/21/chartex" xmlns:cx3="http://schemas.microsoft.com/office/drawing/2016/5/9/chartex" xmlns:cx4="http://schemas.microsoft.com/office/drawing/2016/5/10/chartex" xmlns:cx5="http://schemas.microsoft.com/office/drawing/2016/5/11/chartex" xmlns:cx6="http://schemas.microsoft.com/office/drawing/2016/5/12/chartex" xmlns:cx7="http://schemas.microsoft.com/office/drawing/2016/5/13/chartex" xmlns:cx8="http://schemas.microsoft.com/office/drawing/2016/5/14/chartex" xmlns:mc="http://schemas.openxmlformats.org/markup-compatibility/2006" xmlns:aink="http://schemas.microsoft.com/office/drawing/2016/ink" xmlns:am3d="http://schemas.microsoft.com/office/drawing/2017/model3d" xmlns:o="urn:schemas-microsoft-com:office:office" xmlns:r="http://schemas.openxmlformats.org/officeDocument/2006/relationships" xmlns:m="http://schemas.openxmlformats.org/officeDocument/2006/math" xmlns:v="urn:schemas-microsoft-com:vml" xmlns:wp14="http://schemas.microsoft.com/office/word/2010/wordprocessingDrawing" xmlns:wp="http://schemas.openxmlformats.org/drawingml/2006/wordprocessingDrawing" xmlns:w10="urn:schemas-microsoft-com:office:word" xmlns:w="http://schemas.openxmlformats.org/wordprocessingml/2006/main" xmlns:w14="http://schemas.microsoft.com/office/word/2010/wordml" xmlns:w15="http://schemas.microsoft.com/office/word/2012/wordml" xmlns:w16cex="http://schemas.microsoft.com/office/word/2018/wordml/cex" xmlns:w16cid="http://schemas.microsoft.com/office/word/2016/wordml/cid" xmlns:w16="http://schemas.microsoft.com/office/word/2018/wordml" xmlns:w16sdtdh="http://schemas.microsoft.com/office/word/2020/wordml/sdtdatahash" xmlns:w16se="http://schemas.microsoft.com/office/word/2015/wordml/symex" xmlns:wpg="http://schemas.microsoft.com/office/word/2010/wordprocessingGroup" xmlns:wpi="http://schemas.microsoft.com/office/word/2010/wordprocessingInk" xmlns:wne="http://schemas.microsoft.com/office/word/2006/wordml" xmlns:wps="http://schemas.microsoft.com/office/word/2010/wordprocessingShape" mc:Ignorable="w14 w15 w16se w16cid w16 w16cex w16sdtdh wp14">
+<w:ftr xmlns:wpc="http://schemas.microsoft.com/office/word/2010/wordprocessingCanvas" xmlns:cx="http://schemas.microsoft.com/office/drawing/2014/chartex" xmlns:cx1="http://schemas.microsoft.com/office/drawing/2015/9/8/chartex" xmlns:cx2="http://schemas.microsoft.com/office/drawing/2015/10/21/chartex" xmlns:cx3="http://schemas.microsoft.com/office/drawing/2016/5/9/chartex" xmlns:cx4="http://schemas.microsoft.com/office/drawing/2016/5/10/chartex" xmlns:cx5="http://schemas.microsoft.com/office/drawing/2016/5/11/chartex" xmlns:cx6="http://schemas.microsoft.com/office/drawing/2016/5/12/chartex" xmlns:cx7="http://schemas.microsoft.com/office/drawing/2016/5/13/chartex" xmlns:cx8="http://schemas.microsoft.com/office/drawing/2016/5/14/chartex" xmlns:mc="http://schemas.openxmlformats.org/markup-compatibility/2006" xmlns:aink="http://schemas.microsoft.com/office/drawing/2016/ink" xmlns:am3d="http://schemas.microsoft.com/office/drawing/2017/model3d" xmlns:o="urn:schemas-microsoft-com:office:office" xmlns:oel="http://schemas.microsoft.com/office/2019/extlst" xmlns:r="http://schemas.openxmlformats.org/officeDocument/2006/relationships" xmlns:m="http://schemas.openxmlformats.org/officeDocument/2006/math" xmlns:v="urn:schemas-microsoft-com:vml" xmlns:wp14="http://schemas.microsoft.com/office/word/2010/wordprocessingDrawing" xmlns:wp="http://schemas.openxmlformats.org/drawingml/2006/wordprocessingDrawing" xmlns:w10="urn:schemas-microsoft-com:office:word" xmlns:w="http://schemas.openxmlformats.org/wordprocessingml/2006/main" xmlns:w14="http://schemas.microsoft.com/office/word/2010/wordml" xmlns:w15="http://schemas.microsoft.com/office/word/2012/wordml" xmlns:w16cex="http://schemas.microsoft.com/office/word/2018/wordml/cex" xmlns:w16cid="http://schemas.microsoft.com/office/word/2016/wordml/cid" xmlns:w16="http://schemas.microsoft.com/office/word/2018/wordml" xmlns:w16du="http://schemas.microsoft.com/office/word/2023/wordml/word16du" xmlns:w16sdtdh="http://schemas.microsoft.com/office/word/2020/wordml/sdtdatahash" xmlns:w16sdtfl="http://schemas.microsoft.com/office/word/2024/wordml/sdtformatlock" xmlns:w16se="http://schemas.microsoft.com/office/word/2015/wordml/symex" xmlns:wpg="http://schemas.microsoft.com/office/word/2010/wordprocessingGroup" xmlns:wpi="http://schemas.microsoft.com/office/word/2010/wordprocessingInk" xmlns:wne="http://schemas.microsoft.com/office/word/2006/wordml" xmlns:wps="http://schemas.microsoft.com/office/word/2010/wordprocessingShape" mc:Ignorable="w14 w15 w16se w16cid w16 w16cex w16sdtdh w16sdtfl w16du wp14">
   <w:p>
     <w:pPr>
       <w:pBdr>
@@ -10117,7 +9739,7 @@
 </file>
 
 <file path=word/footer3.xml><?xml version="1.0" encoding="utf-8"?>
-<w:ftr xmlns:wpc="http://schemas.microsoft.com/office/word/2010/wordprocessingCanvas" xmlns:cx="http://schemas.microsoft.com/office/drawing/2014/chartex" xmlns:cx1="http://schemas.microsoft.com/office/drawing/2015/9/8/chartex" xmlns:cx2="http://schemas.microsoft.com/office/drawing/2015/10/21/chartex" xmlns:cx3="http://schemas.microsoft.com/office/drawing/2016/5/9/chartex" xmlns:cx4="http://schemas.microsoft.com/office/drawing/2016/5/10/chartex" xmlns:cx5="http://schemas.microsoft.com/office/drawing/2016/5/11/chartex" xmlns:cx6="http://schemas.microsoft.com/office/drawing/2016/5/12/chartex" xmlns:cx7="http://schemas.microsoft.com/office/drawing/2016/5/13/chartex" xmlns:cx8="http://schemas.microsoft.com/office/drawing/2016/5/14/chartex" xmlns:mc="http://schemas.openxmlformats.org/markup-compatibility/2006" xmlns:aink="http://schemas.microsoft.com/office/drawing/2016/ink" xmlns:am3d="http://schemas.microsoft.com/office/drawing/2017/model3d" xmlns:o="urn:schemas-microsoft-com:office:office" xmlns:r="http://schemas.openxmlformats.org/officeDocument/2006/relationships" xmlns:m="http://schemas.openxmlformats.org/officeDocument/2006/math" xmlns:v="urn:schemas-microsoft-com:vml" xmlns:wp14="http://schemas.microsoft.com/office/word/2010/wordprocessingDrawing" xmlns:wp="http://schemas.openxmlformats.org/drawingml/2006/wordprocessingDrawing" xmlns:w10="urn:schemas-microsoft-com:office:word" xmlns:w="http://schemas.openxmlformats.org/wordprocessingml/2006/main" xmlns:w14="http://schemas.microsoft.com/office/word/2010/wordml" xmlns:w15="http://schemas.microsoft.com/office/word/2012/wordml" xmlns:w16cex="http://schemas.microsoft.com/office/word/2018/wordml/cex" xmlns:w16cid="http://schemas.microsoft.com/office/word/2016/wordml/cid" xmlns:w16="http://schemas.microsoft.com/office/word/2018/wordml" xmlns:w16sdtdh="http://schemas.microsoft.com/office/word/2020/wordml/sdtdatahash" xmlns:w16se="http://schemas.microsoft.com/office/word/2015/wordml/symex" xmlns:wpg="http://schemas.microsoft.com/office/word/2010/wordprocessingGroup" xmlns:wpi="http://schemas.microsoft.com/office/word/2010/wordprocessingInk" xmlns:wne="http://schemas.microsoft.com/office/word/2006/wordml" xmlns:wps="http://schemas.microsoft.com/office/word/2010/wordprocessingShape" mc:Ignorable="w14 w15 w16se w16cid w16 w16cex w16sdtdh wp14">
+<w:ftr xmlns:wpc="http://schemas.microsoft.com/office/word/2010/wordprocessingCanvas" xmlns:cx="http://schemas.microsoft.com/office/drawing/2014/chartex" xmlns:cx1="http://schemas.microsoft.com/office/drawing/2015/9/8/chartex" xmlns:cx2="http://schemas.microsoft.com/office/drawing/2015/10/21/chartex" xmlns:cx3="http://schemas.microsoft.com/office/drawing/2016/5/9/chartex" xmlns:cx4="http://schemas.microsoft.com/office/drawing/2016/5/10/chartex" xmlns:cx5="http://schemas.microsoft.com/office/drawing/2016/5/11/chartex" xmlns:cx6="http://schemas.microsoft.com/office/drawing/2016/5/12/chartex" xmlns:cx7="http://schemas.microsoft.com/office/drawing/2016/5/13/chartex" xmlns:cx8="http://schemas.microsoft.com/office/drawing/2016/5/14/chartex" xmlns:mc="http://schemas.openxmlformats.org/markup-compatibility/2006" xmlns:aink="http://schemas.microsoft.com/office/drawing/2016/ink" xmlns:am3d="http://schemas.microsoft.com/office/drawing/2017/model3d" xmlns:o="urn:schemas-microsoft-com:office:office" xmlns:oel="http://schemas.microsoft.com/office/2019/extlst" xmlns:r="http://schemas.openxmlformats.org/officeDocument/2006/relationships" xmlns:m="http://schemas.openxmlformats.org/officeDocument/2006/math" xmlns:v="urn:schemas-microsoft-com:vml" xmlns:wp14="http://schemas.microsoft.com/office/word/2010/wordprocessingDrawing" xmlns:wp="http://schemas.openxmlformats.org/drawingml/2006/wordprocessingDrawing" xmlns:w10="urn:schemas-microsoft-com:office:word" xmlns:w="http://schemas.openxmlformats.org/wordprocessingml/2006/main" xmlns:w14="http://schemas.microsoft.com/office/word/2010/wordml" xmlns:w15="http://schemas.microsoft.com/office/word/2012/wordml" xmlns:w16cex="http://schemas.microsoft.com/office/word/2018/wordml/cex" xmlns:w16cid="http://schemas.microsoft.com/office/word/2016/wordml/cid" xmlns:w16="http://schemas.microsoft.com/office/word/2018/wordml" xmlns:w16du="http://schemas.microsoft.com/office/word/2023/wordml/word16du" xmlns:w16sdtdh="http://schemas.microsoft.com/office/word/2020/wordml/sdtdatahash" xmlns:w16sdtfl="http://schemas.microsoft.com/office/word/2024/wordml/sdtformatlock" xmlns:w16se="http://schemas.microsoft.com/office/word/2015/wordml/symex" xmlns:wpg="http://schemas.microsoft.com/office/word/2010/wordprocessingGroup" xmlns:wpi="http://schemas.microsoft.com/office/word/2010/wordprocessingInk" xmlns:wne="http://schemas.microsoft.com/office/word/2006/wordml" xmlns:wps="http://schemas.microsoft.com/office/word/2010/wordprocessingShape" mc:Ignorable="w14 w15 w16se w16cid w16 w16cex w16sdtdh w16sdtfl w16du wp14">
   <w:p>
     <w:pPr>
       <w:pStyle w:val="Footer"/>
@@ -10127,7 +9749,7 @@
 </file>
 
 <file path=word/footnotes.xml><?xml version="1.0" encoding="utf-8"?>
-<w:footnotes xmlns:wpc="http://schemas.microsoft.com/office/word/2010/wordprocessingCanvas" xmlns:cx="http://schemas.microsoft.com/office/drawing/2014/chartex" xmlns:cx1="http://schemas.microsoft.com/office/drawing/2015/9/8/chartex" xmlns:cx2="http://schemas.microsoft.com/office/drawing/2015/10/21/chartex" xmlns:cx3="http://schemas.microsoft.com/office/drawing/2016/5/9/chartex" xmlns:cx4="http://schemas.microsoft.com/office/drawing/2016/5/10/chartex" xmlns:cx5="http://schemas.microsoft.com/office/drawing/2016/5/11/chartex" xmlns:cx6="http://schemas.microsoft.com/office/drawing/2016/5/12/chartex" xmlns:cx7="http://schemas.microsoft.com/office/drawing/2016/5/13/chartex" xmlns:cx8="http://schemas.microsoft.com/office/drawing/2016/5/14/chartex" xmlns:mc="http://schemas.openxmlformats.org/markup-compatibility/2006" xmlns:aink="http://schemas.microsoft.com/office/drawing/2016/ink" xmlns:am3d="http://schemas.microsoft.com/office/drawing/2017/model3d" xmlns:o="urn:schemas-microsoft-com:office:office" xmlns:r="http://schemas.openxmlformats.org/officeDocument/2006/relationships" xmlns:m="http://schemas.openxmlformats.org/officeDocument/2006/math" xmlns:v="urn:schemas-microsoft-com:vml" xmlns:wp14="http://schemas.microsoft.com/office/word/2010/wordprocessingDrawing" xmlns:wp="http://schemas.openxmlformats.org/drawingml/2006/wordprocessingDrawing" xmlns:w10="urn:schemas-microsoft-com:office:word" xmlns:w="http://schemas.openxmlformats.org/wordprocessingml/2006/main" xmlns:w14="http://schemas.microsoft.com/office/word/2010/wordml" xmlns:w15="http://schemas.microsoft.com/office/word/2012/wordml" xmlns:w16cex="http://schemas.microsoft.com/office/word/2018/wordml/cex" xmlns:w16cid="http://schemas.microsoft.com/office/word/2016/wordml/cid" xmlns:w16="http://schemas.microsoft.com/office/word/2018/wordml" xmlns:w16sdtdh="http://schemas.microsoft.com/office/word/2020/wordml/sdtdatahash" xmlns:w16se="http://schemas.microsoft.com/office/word/2015/wordml/symex" xmlns:wpg="http://schemas.microsoft.com/office/word/2010/wordprocessingGroup" xmlns:wpi="http://schemas.microsoft.com/office/word/2010/wordprocessingInk" xmlns:wne="http://schemas.microsoft.com/office/word/2006/wordml" xmlns:wps="http://schemas.microsoft.com/office/word/2010/wordprocessingShape" mc:Ignorable="w14 w15 w16se w16cid w16 w16cex w16sdtdh wp14">
+<w:footnotes xmlns:wpc="http://schemas.microsoft.com/office/word/2010/wordprocessingCanvas" xmlns:cx="http://schemas.microsoft.com/office/drawing/2014/chartex" xmlns:cx1="http://schemas.microsoft.com/office/drawing/2015/9/8/chartex" xmlns:cx2="http://schemas.microsoft.com/office/drawing/2015/10/21/chartex" xmlns:cx3="http://schemas.microsoft.com/office/drawing/2016/5/9/chartex" xmlns:cx4="http://schemas.microsoft.com/office/drawing/2016/5/10/chartex" xmlns:cx5="http://schemas.microsoft.com/office/drawing/2016/5/11/chartex" xmlns:cx6="http://schemas.microsoft.com/office/drawing/2016/5/12/chartex" xmlns:cx7="http://schemas.microsoft.com/office/drawing/2016/5/13/chartex" xmlns:cx8="http://schemas.microsoft.com/office/drawing/2016/5/14/chartex" xmlns:mc="http://schemas.openxmlformats.org/markup-compatibility/2006" xmlns:aink="http://schemas.microsoft.com/office/drawing/2016/ink" xmlns:am3d="http://schemas.microsoft.com/office/drawing/2017/model3d" xmlns:o="urn:schemas-microsoft-com:office:office" xmlns:oel="http://schemas.microsoft.com/office/2019/extlst" xmlns:r="http://schemas.openxmlformats.org/officeDocument/2006/relationships" xmlns:m="http://schemas.openxmlformats.org/officeDocument/2006/math" xmlns:v="urn:schemas-microsoft-com:vml" xmlns:wp14="http://schemas.microsoft.com/office/word/2010/wordprocessingDrawing" xmlns:wp="http://schemas.openxmlformats.org/drawingml/2006/wordprocessingDrawing" xmlns:w10="urn:schemas-microsoft-com:office:word" xmlns:w="http://schemas.openxmlformats.org/wordprocessingml/2006/main" xmlns:w14="http://schemas.microsoft.com/office/word/2010/wordml" xmlns:w15="http://schemas.microsoft.com/office/word/2012/wordml" xmlns:w16cex="http://schemas.microsoft.com/office/word/2018/wordml/cex" xmlns:w16cid="http://schemas.microsoft.com/office/word/2016/wordml/cid" xmlns:w16="http://schemas.microsoft.com/office/word/2018/wordml" xmlns:w16du="http://schemas.microsoft.com/office/word/2023/wordml/word16du" xmlns:w16sdtdh="http://schemas.microsoft.com/office/word/2020/wordml/sdtdatahash" xmlns:w16sdtfl="http://schemas.microsoft.com/office/word/2024/wordml/sdtformatlock" xmlns:w16se="http://schemas.microsoft.com/office/word/2015/wordml/symex" xmlns:wpg="http://schemas.microsoft.com/office/word/2010/wordprocessingGroup" xmlns:wpi="http://schemas.microsoft.com/office/word/2010/wordprocessingInk" xmlns:wne="http://schemas.microsoft.com/office/word/2006/wordml" xmlns:wps="http://schemas.microsoft.com/office/word/2010/wordprocessingShape" mc:Ignorable="w14 w15 w16se w16cid w16 w16cex w16sdtdh w16sdtfl w16du wp14">
   <w:footnote w:type="separator" w:id="-1">
     <w:p>
       <w:r>
@@ -10146,7 +9768,7 @@
 </file>
 
 <file path=word/header1.xml><?xml version="1.0" encoding="utf-8"?>
-<w:hdr xmlns:wpc="http://schemas.microsoft.com/office/word/2010/wordprocessingCanvas" xmlns:cx="http://schemas.microsoft.com/office/drawing/2014/chartex" xmlns:cx1="http://schemas.microsoft.com/office/drawing/2015/9/8/chartex" xmlns:cx2="http://schemas.microsoft.com/office/drawing/2015/10/21/chartex" xmlns:cx3="http://schemas.microsoft.com/office/drawing/2016/5/9/chartex" xmlns:cx4="http://schemas.microsoft.com/office/drawing/2016/5/10/chartex" xmlns:cx5="http://schemas.microsoft.com/office/drawing/2016/5/11/chartex" xmlns:cx6="http://schemas.microsoft.com/office/drawing/2016/5/12/chartex" xmlns:cx7="http://schemas.microsoft.com/office/drawing/2016/5/13/chartex" xmlns:cx8="http://schemas.microsoft.com/office/drawing/2016/5/14/chartex" xmlns:mc="http://schemas.openxmlformats.org/markup-compatibility/2006" xmlns:aink="http://schemas.microsoft.com/office/drawing/2016/ink" xmlns:am3d="http://schemas.microsoft.com/office/drawing/2017/model3d" xmlns:o="urn:schemas-microsoft-com:office:office" xmlns:r="http://schemas.openxmlformats.org/officeDocument/2006/relationships" xmlns:m="http://schemas.openxmlformats.org/officeDocument/2006/math" xmlns:v="urn:schemas-microsoft-com:vml" xmlns:wp14="http://schemas.microsoft.com/office/word/2010/wordprocessingDrawing" xmlns:wp="http://schemas.openxmlformats.org/drawingml/2006/wordprocessingDrawing" xmlns:w10="urn:schemas-microsoft-com:office:word" xmlns:w="http://schemas.openxmlformats.org/wordprocessingml/2006/main" xmlns:w14="http://schemas.microsoft.com/office/word/2010/wordml" xmlns:w15="http://schemas.microsoft.com/office/word/2012/wordml" xmlns:w16cex="http://schemas.microsoft.com/office/word/2018/wordml/cex" xmlns:w16cid="http://schemas.microsoft.com/office/word/2016/wordml/cid" xmlns:w16="http://schemas.microsoft.com/office/word/2018/wordml" xmlns:w16sdtdh="http://schemas.microsoft.com/office/word/2020/wordml/sdtdatahash" xmlns:w16se="http://schemas.microsoft.com/office/word/2015/wordml/symex" xmlns:wpg="http://schemas.microsoft.com/office/word/2010/wordprocessingGroup" xmlns:wpi="http://schemas.microsoft.com/office/word/2010/wordprocessingInk" xmlns:wne="http://schemas.microsoft.com/office/word/2006/wordml" xmlns:wps="http://schemas.microsoft.com/office/word/2010/wordprocessingShape" mc:Ignorable="w14 w15 w16se w16cid w16 w16cex w16sdtdh wp14">
+<w:hdr xmlns:wpc="http://schemas.microsoft.com/office/word/2010/wordprocessingCanvas" xmlns:cx="http://schemas.microsoft.com/office/drawing/2014/chartex" xmlns:cx1="http://schemas.microsoft.com/office/drawing/2015/9/8/chartex" xmlns:cx2="http://schemas.microsoft.com/office/drawing/2015/10/21/chartex" xmlns:cx3="http://schemas.microsoft.com/office/drawing/2016/5/9/chartex" xmlns:cx4="http://schemas.microsoft.com/office/drawing/2016/5/10/chartex" xmlns:cx5="http://schemas.microsoft.com/office/drawing/2016/5/11/chartex" xmlns:cx6="http://schemas.microsoft.com/office/drawing/2016/5/12/chartex" xmlns:cx7="http://schemas.microsoft.com/office/drawing/2016/5/13/chartex" xmlns:cx8="http://schemas.microsoft.com/office/drawing/2016/5/14/chartex" xmlns:mc="http://schemas.openxmlformats.org/markup-compatibility/2006" xmlns:aink="http://schemas.microsoft.com/office/drawing/2016/ink" xmlns:am3d="http://schemas.microsoft.com/office/drawing/2017/model3d" xmlns:o="urn:schemas-microsoft-com:office:office" xmlns:oel="http://schemas.microsoft.com/office/2019/extlst" xmlns:r="http://schemas.openxmlformats.org/officeDocument/2006/relationships" xmlns:m="http://schemas.openxmlformats.org/officeDocument/2006/math" xmlns:v="urn:schemas-microsoft-com:vml" xmlns:wp14="http://schemas.microsoft.com/office/word/2010/wordprocessingDrawing" xmlns:wp="http://schemas.openxmlformats.org/drawingml/2006/wordprocessingDrawing" xmlns:w10="urn:schemas-microsoft-com:office:word" xmlns:w="http://schemas.openxmlformats.org/wordprocessingml/2006/main" xmlns:w14="http://schemas.microsoft.com/office/word/2010/wordml" xmlns:w15="http://schemas.microsoft.com/office/word/2012/wordml" xmlns:w16cex="http://schemas.microsoft.com/office/word/2018/wordml/cex" xmlns:w16cid="http://schemas.microsoft.com/office/word/2016/wordml/cid" xmlns:w16="http://schemas.microsoft.com/office/word/2018/wordml" xmlns:w16du="http://schemas.microsoft.com/office/word/2023/wordml/word16du" xmlns:w16sdtdh="http://schemas.microsoft.com/office/word/2020/wordml/sdtdatahash" xmlns:w16sdtfl="http://schemas.microsoft.com/office/word/2024/wordml/sdtformatlock" xmlns:w16se="http://schemas.microsoft.com/office/word/2015/wordml/symex" xmlns:wpg="http://schemas.microsoft.com/office/word/2010/wordprocessingGroup" xmlns:wpi="http://schemas.microsoft.com/office/word/2010/wordprocessingInk" xmlns:wne="http://schemas.microsoft.com/office/word/2006/wordml" xmlns:wps="http://schemas.microsoft.com/office/word/2010/wordprocessingShape" mc:Ignorable="w14 w15 w16se w16cid w16 w16cex w16sdtdh w16sdtfl w16du wp14">
   <w:p>
     <w:pPr>
       <w:pStyle w:val="Header"/>
@@ -10156,7 +9778,7 @@
 </file>
 
 <file path=word/header2.xml><?xml version="1.0" encoding="utf-8"?>
-<w:hdr xmlns:wpc="http://schemas.microsoft.com/office/word/2010/wordprocessingCanvas" xmlns:cx="http://schemas.microsoft.com/office/drawing/2014/chartex" xmlns:cx1="http://schemas.microsoft.com/office/drawing/2015/9/8/chartex" xmlns:cx2="http://schemas.microsoft.com/office/drawing/2015/10/21/chartex" xmlns:cx3="http://schemas.microsoft.com/office/drawing/2016/5/9/chartex" xmlns:cx4="http://schemas.microsoft.com/office/drawing/2016/5/10/chartex" xmlns:cx5="http://schemas.microsoft.com/office/drawing/2016/5/11/chartex" xmlns:cx6="http://schemas.microsoft.com/office/drawing/2016/5/12/chartex" xmlns:cx7="http://schemas.microsoft.com/office/drawing/2016/5/13/chartex" xmlns:cx8="http://schemas.microsoft.com/office/drawing/2016/5/14/chartex" xmlns:mc="http://schemas.openxmlformats.org/markup-compatibility/2006" xmlns:aink="http://schemas.microsoft.com/office/drawing/2016/ink" xmlns:am3d="http://schemas.microsoft.com/office/drawing/2017/model3d" xmlns:o="urn:schemas-microsoft-com:office:office" xmlns:r="http://schemas.openxmlformats.org/officeDocument/2006/relationships" xmlns:m="http://schemas.openxmlformats.org/officeDocument/2006/math" xmlns:v="urn:schemas-microsoft-com:vml" xmlns:wp14="http://schemas.microsoft.com/office/word/2010/wordprocessingDrawing" xmlns:wp="http://schemas.openxmlformats.org/drawingml/2006/wordprocessingDrawing" xmlns:w10="urn:schemas-microsoft-com:office:word" xmlns:w="http://schemas.openxmlformats.org/wordprocessingml/2006/main" xmlns:w14="http://schemas.microsoft.com/office/word/2010/wordml" xmlns:w15="http://schemas.microsoft.com/office/word/2012/wordml" xmlns:w16cex="http://schemas.microsoft.com/office/word/2018/wordml/cex" xmlns:w16cid="http://schemas.microsoft.com/office/word/2016/wordml/cid" xmlns:w16="http://schemas.microsoft.com/office/word/2018/wordml" xmlns:w16sdtdh="http://schemas.microsoft.com/office/word/2020/wordml/sdtdatahash" xmlns:w16se="http://schemas.microsoft.com/office/word/2015/wordml/symex" xmlns:wpg="http://schemas.microsoft.com/office/word/2010/wordprocessingGroup" xmlns:wpi="http://schemas.microsoft.com/office/word/2010/wordprocessingInk" xmlns:wne="http://schemas.microsoft.com/office/word/2006/wordml" xmlns:wps="http://schemas.microsoft.com/office/word/2010/wordprocessingShape" mc:Ignorable="w14 w15 w16se w16cid w16 w16cex w16sdtdh wp14">
+<w:hdr xmlns:wpc="http://schemas.microsoft.com/office/word/2010/wordprocessingCanvas" xmlns:cx="http://schemas.microsoft.com/office/drawing/2014/chartex" xmlns:cx1="http://schemas.microsoft.com/office/drawing/2015/9/8/chartex" xmlns:cx2="http://schemas.microsoft.com/office/drawing/2015/10/21/chartex" xmlns:cx3="http://schemas.microsoft.com/office/drawing/2016/5/9/chartex" xmlns:cx4="http://schemas.microsoft.com/office/drawing/2016/5/10/chartex" xmlns:cx5="http://schemas.microsoft.com/office/drawing/2016/5/11/chartex" xmlns:cx6="http://schemas.microsoft.com/office/drawing/2016/5/12/chartex" xmlns:cx7="http://schemas.microsoft.com/office/drawing/2016/5/13/chartex" xmlns:cx8="http://schemas.microsoft.com/office/drawing/2016/5/14/chartex" xmlns:mc="http://schemas.openxmlformats.org/markup-compatibility/2006" xmlns:aink="http://schemas.microsoft.com/office/drawing/2016/ink" xmlns:am3d="http://schemas.microsoft.com/office/drawing/2017/model3d" xmlns:o="urn:schemas-microsoft-com:office:office" xmlns:oel="http://schemas.microsoft.com/office/2019/extlst" xmlns:r="http://schemas.openxmlformats.org/officeDocument/2006/relationships" xmlns:m="http://schemas.openxmlformats.org/officeDocument/2006/math" xmlns:v="urn:schemas-microsoft-com:vml" xmlns:wp14="http://schemas.microsoft.com/office/word/2010/wordprocessingDrawing" xmlns:wp="http://schemas.openxmlformats.org/drawingml/2006/wordprocessingDrawing" xmlns:w10="urn:schemas-microsoft-com:office:word" xmlns:w="http://schemas.openxmlformats.org/wordprocessingml/2006/main" xmlns:w14="http://schemas.microsoft.com/office/word/2010/wordml" xmlns:w15="http://schemas.microsoft.com/office/word/2012/wordml" xmlns:w16cex="http://schemas.microsoft.com/office/word/2018/wordml/cex" xmlns:w16cid="http://schemas.microsoft.com/office/word/2016/wordml/cid" xmlns:w16="http://schemas.microsoft.com/office/word/2018/wordml" xmlns:w16du="http://schemas.microsoft.com/office/word/2023/wordml/word16du" xmlns:w16sdtdh="http://schemas.microsoft.com/office/word/2020/wordml/sdtdatahash" xmlns:w16sdtfl="http://schemas.microsoft.com/office/word/2024/wordml/sdtformatlock" xmlns:w16se="http://schemas.microsoft.com/office/word/2015/wordml/symex" xmlns:wpg="http://schemas.microsoft.com/office/word/2010/wordprocessingGroup" xmlns:wpi="http://schemas.microsoft.com/office/word/2010/wordprocessingInk" xmlns:wne="http://schemas.microsoft.com/office/word/2006/wordml" xmlns:wps="http://schemas.microsoft.com/office/word/2010/wordprocessingShape" mc:Ignorable="w14 w15 w16se w16cid w16 w16cex w16sdtdh w16sdtfl w16du wp14">
   <w:p>
     <w:pPr>
       <w:pBdr>
@@ -10199,7 +9821,7 @@
 </file>
 
 <file path=word/header3.xml><?xml version="1.0" encoding="utf-8"?>
-<w:hdr xmlns:wpc="http://schemas.microsoft.com/office/word/2010/wordprocessingCanvas" xmlns:cx="http://schemas.microsoft.com/office/drawing/2014/chartex" xmlns:cx1="http://schemas.microsoft.com/office/drawing/2015/9/8/chartex" xmlns:cx2="http://schemas.microsoft.com/office/drawing/2015/10/21/chartex" xmlns:cx3="http://schemas.microsoft.com/office/drawing/2016/5/9/chartex" xmlns:cx4="http://schemas.microsoft.com/office/drawing/2016/5/10/chartex" xmlns:cx5="http://schemas.microsoft.com/office/drawing/2016/5/11/chartex" xmlns:cx6="http://schemas.microsoft.com/office/drawing/2016/5/12/chartex" xmlns:cx7="http://schemas.microsoft.com/office/drawing/2016/5/13/chartex" xmlns:cx8="http://schemas.microsoft.com/office/drawing/2016/5/14/chartex" xmlns:mc="http://schemas.openxmlformats.org/markup-compatibility/2006" xmlns:aink="http://schemas.microsoft.com/office/drawing/2016/ink" xmlns:am3d="http://schemas.microsoft.com/office/drawing/2017/model3d" xmlns:o="urn:schemas-microsoft-com:office:office" xmlns:r="http://schemas.openxmlformats.org/officeDocument/2006/relationships" xmlns:m="http://schemas.openxmlformats.org/officeDocument/2006/math" xmlns:v="urn:schemas-microsoft-com:vml" xmlns:wp14="http://schemas.microsoft.com/office/word/2010/wordprocessingDrawing" xmlns:wp="http://schemas.openxmlformats.org/drawingml/2006/wordprocessingDrawing" xmlns:w10="urn:schemas-microsoft-com:office:word" xmlns:w="http://schemas.openxmlformats.org/wordprocessingml/2006/main" xmlns:w14="http://schemas.microsoft.com/office/word/2010/wordml" xmlns:w15="http://schemas.microsoft.com/office/word/2012/wordml" xmlns:w16cex="http://schemas.microsoft.com/office/word/2018/wordml/cex" xmlns:w16cid="http://schemas.microsoft.com/office/word/2016/wordml/cid" xmlns:w16="http://schemas.microsoft.com/office/word/2018/wordml" xmlns:w16sdtdh="http://schemas.microsoft.com/office/word/2020/wordml/sdtdatahash" xmlns:w16se="http://schemas.microsoft.com/office/word/2015/wordml/symex" xmlns:wpg="http://schemas.microsoft.com/office/word/2010/wordprocessingGroup" xmlns:wpi="http://schemas.microsoft.com/office/word/2010/wordprocessingInk" xmlns:wne="http://schemas.microsoft.com/office/word/2006/wordml" xmlns:wps="http://schemas.microsoft.com/office/word/2010/wordprocessingShape" mc:Ignorable="w14 w15 w16se w16cid w16 w16cex w16sdtdh wp14">
+<w:hdr xmlns:wpc="http://schemas.microsoft.com/office/word/2010/wordprocessingCanvas" xmlns:cx="http://schemas.microsoft.com/office/drawing/2014/chartex" xmlns:cx1="http://schemas.microsoft.com/office/drawing/2015/9/8/chartex" xmlns:cx2="http://schemas.microsoft.com/office/drawing/2015/10/21/chartex" xmlns:cx3="http://schemas.microsoft.com/office/drawing/2016/5/9/chartex" xmlns:cx4="http://schemas.microsoft.com/office/drawing/2016/5/10/chartex" xmlns:cx5="http://schemas.microsoft.com/office/drawing/2016/5/11/chartex" xmlns:cx6="http://schemas.microsoft.com/office/drawing/2016/5/12/chartex" xmlns:cx7="http://schemas.microsoft.com/office/drawing/2016/5/13/chartex" xmlns:cx8="http://schemas.microsoft.com/office/drawing/2016/5/14/chartex" xmlns:mc="http://schemas.openxmlformats.org/markup-compatibility/2006" xmlns:aink="http://schemas.microsoft.com/office/drawing/2016/ink" xmlns:am3d="http://schemas.microsoft.com/office/drawing/2017/model3d" xmlns:o="urn:schemas-microsoft-com:office:office" xmlns:oel="http://schemas.microsoft.com/office/2019/extlst" xmlns:r="http://schemas.openxmlformats.org/officeDocument/2006/relationships" xmlns:m="http://schemas.openxmlformats.org/officeDocument/2006/math" xmlns:v="urn:schemas-microsoft-com:vml" xmlns:wp14="http://schemas.microsoft.com/office/word/2010/wordprocessingDrawing" xmlns:wp="http://schemas.openxmlformats.org/drawingml/2006/wordprocessingDrawing" xmlns:w10="urn:schemas-microsoft-com:office:word" xmlns:w="http://schemas.openxmlformats.org/wordprocessingml/2006/main" xmlns:w14="http://schemas.microsoft.com/office/word/2010/wordml" xmlns:w15="http://schemas.microsoft.com/office/word/2012/wordml" xmlns:w16cex="http://schemas.microsoft.com/office/word/2018/wordml/cex" xmlns:w16cid="http://schemas.microsoft.com/office/word/2016/wordml/cid" xmlns:w16="http://schemas.microsoft.com/office/word/2018/wordml" xmlns:w16du="http://schemas.microsoft.com/office/word/2023/wordml/word16du" xmlns:w16sdtdh="http://schemas.microsoft.com/office/word/2020/wordml/sdtdatahash" xmlns:w16sdtfl="http://schemas.microsoft.com/office/word/2024/wordml/sdtformatlock" xmlns:w16se="http://schemas.microsoft.com/office/word/2015/wordml/symex" xmlns:wpg="http://schemas.microsoft.com/office/word/2010/wordprocessingGroup" xmlns:wpi="http://schemas.microsoft.com/office/word/2010/wordprocessingInk" xmlns:wne="http://schemas.microsoft.com/office/word/2006/wordml" xmlns:wps="http://schemas.microsoft.com/office/word/2010/wordprocessingShape" mc:Ignorable="w14 w15 w16se w16cid w16 w16cex w16sdtdh w16sdtfl w16du wp14">
   <w:p>
     <w:pPr>
       <w:pStyle w:val="Header"/>
@@ -10209,7 +9831,7 @@
 </file>
 
 <file path=word/numbering.xml><?xml version="1.0" encoding="utf-8"?>
-<w:numbering xmlns:wpc="http://schemas.microsoft.com/office/word/2010/wordprocessingCanvas" xmlns:cx="http://schemas.microsoft.com/office/drawing/2014/chartex" xmlns:cx1="http://schemas.microsoft.com/office/drawing/2015/9/8/chartex" xmlns:cx2="http://schemas.microsoft.com/office/drawing/2015/10/21/chartex" xmlns:cx3="http://schemas.microsoft.com/office/drawing/2016/5/9/chartex" xmlns:cx4="http://schemas.microsoft.com/office/drawing/2016/5/10/chartex" xmlns:cx5="http://schemas.microsoft.com/office/drawing/2016/5/11/chartex" xmlns:cx6="http://schemas.microsoft.com/office/drawing/2016/5/12/chartex" xmlns:cx7="http://schemas.microsoft.com/office/drawing/2016/5/13/chartex" xmlns:cx8="http://schemas.microsoft.com/office/drawing/2016/5/14/chartex" xmlns:mc="http://schemas.openxmlformats.org/markup-compatibility/2006" xmlns:aink="http://schemas.microsoft.com/office/drawing/2016/ink" xmlns:am3d="http://schemas.microsoft.com/office/drawing/2017/model3d" xmlns:o="urn:schemas-microsoft-com:office:office" xmlns:r="http://schemas.openxmlformats.org/officeDocument/2006/relationships" xmlns:m="http://schemas.openxmlformats.org/officeDocument/2006/math" xmlns:v="urn:schemas-microsoft-com:vml" xmlns:wp14="http://schemas.microsoft.com/office/word/2010/wordprocessingDrawing" xmlns:wp="http://schemas.openxmlformats.org/drawingml/2006/wordprocessingDrawing" xmlns:w10="urn:schemas-microsoft-com:office:word" xmlns:w="http://schemas.openxmlformats.org/wordprocessingml/2006/main" xmlns:w14="http://schemas.microsoft.com/office/word/2010/wordml" xmlns:w15="http://schemas.microsoft.com/office/word/2012/wordml" xmlns:w16cex="http://schemas.microsoft.com/office/word/2018/wordml/cex" xmlns:w16cid="http://schemas.microsoft.com/office/word/2016/wordml/cid" xmlns:w16="http://schemas.microsoft.com/office/word/2018/wordml" xmlns:w16sdtdh="http://schemas.microsoft.com/office/word/2020/wordml/sdtdatahash" xmlns:w16se="http://schemas.microsoft.com/office/word/2015/wordml/symex" xmlns:wpg="http://schemas.microsoft.com/office/word/2010/wordprocessingGroup" xmlns:wpi="http://schemas.microsoft.com/office/word/2010/wordprocessingInk" xmlns:wne="http://schemas.microsoft.com/office/word/2006/wordml" xmlns:wps="http://schemas.microsoft.com/office/word/2010/wordprocessingShape" mc:Ignorable="w14 w15 w16se w16cid w16 w16cex w16sdtdh wp14">
+<w:numbering xmlns:wpc="http://schemas.microsoft.com/office/word/2010/wordprocessingCanvas" xmlns:cx="http://schemas.microsoft.com/office/drawing/2014/chartex" xmlns:cx1="http://schemas.microsoft.com/office/drawing/2015/9/8/chartex" xmlns:cx2="http://schemas.microsoft.com/office/drawing/2015/10/21/chartex" xmlns:cx3="http://schemas.microsoft.com/office/drawing/2016/5/9/chartex" xmlns:cx4="http://schemas.microsoft.com/office/drawing/2016/5/10/chartex" xmlns:cx5="http://schemas.microsoft.com/office/drawing/2016/5/11/chartex" xmlns:cx6="http://schemas.microsoft.com/office/drawing/2016/5/12/chartex" xmlns:cx7="http://schemas.microsoft.com/office/drawing/2016/5/13/chartex" xmlns:cx8="http://schemas.microsoft.com/office/drawing/2016/5/14/chartex" xmlns:mc="http://schemas.openxmlformats.org/markup-compatibility/2006" xmlns:aink="http://schemas.microsoft.com/office/drawing/2016/ink" xmlns:am3d="http://schemas.microsoft.com/office/drawing/2017/model3d" xmlns:o="urn:schemas-microsoft-com:office:office" xmlns:oel="http://schemas.microsoft.com/office/2019/extlst" xmlns:r="http://schemas.openxmlformats.org/officeDocument/2006/relationships" xmlns:m="http://schemas.openxmlformats.org/officeDocument/2006/math" xmlns:v="urn:schemas-microsoft-com:vml" xmlns:wp14="http://schemas.microsoft.com/office/word/2010/wordprocessingDrawing" xmlns:wp="http://schemas.openxmlformats.org/drawingml/2006/wordprocessingDrawing" xmlns:w10="urn:schemas-microsoft-com:office:word" xmlns:w="http://schemas.openxmlformats.org/wordprocessingml/2006/main" xmlns:w14="http://schemas.microsoft.com/office/word/2010/wordml" xmlns:w15="http://schemas.microsoft.com/office/word/2012/wordml" xmlns:w16cex="http://schemas.microsoft.com/office/word/2018/wordml/cex" xmlns:w16cid="http://schemas.microsoft.com/office/word/2016/wordml/cid" xmlns:w16="http://schemas.microsoft.com/office/word/2018/wordml" xmlns:w16du="http://schemas.microsoft.com/office/word/2023/wordml/word16du" xmlns:w16sdtdh="http://schemas.microsoft.com/office/word/2020/wordml/sdtdatahash" xmlns:w16sdtfl="http://schemas.microsoft.com/office/word/2024/wordml/sdtformatlock" xmlns:w16se="http://schemas.microsoft.com/office/word/2015/wordml/symex" xmlns:wpg="http://schemas.microsoft.com/office/word/2010/wordprocessingGroup" xmlns:wpi="http://schemas.microsoft.com/office/word/2010/wordprocessingInk" xmlns:wne="http://schemas.microsoft.com/office/word/2006/wordml" xmlns:wps="http://schemas.microsoft.com/office/word/2010/wordprocessingShape" mc:Ignorable="w14 w15 w16se w16cid w16 w16cex w16sdtdh w16sdtfl w16du wp14">
   <w:abstractNum w:abstractNumId="0" w15:restartNumberingAfterBreak="0">
     <w:nsid w:val="19B85A84"/>
     <w:multiLevelType w:val="hybridMultilevel"/>
@@ -10520,41 +10142,41 @@
       <w:lvlJc w:val="left"/>
     </w:lvl>
   </w:abstractNum>
-  <w:num w:numId="1">
+  <w:num w:numId="1" w16cid:durableId="2043239236">
     <w:abstractNumId w:val="2"/>
     <w:lvlOverride w:ilvl="0">
       <w:startOverride w:val="1"/>
     </w:lvlOverride>
   </w:num>
-  <w:num w:numId="2">
+  <w:num w:numId="2" w16cid:durableId="1601333297">
     <w:abstractNumId w:val="0"/>
     <w:lvlOverride w:ilvl="0">
       <w:startOverride w:val="1"/>
     </w:lvlOverride>
   </w:num>
-  <w:num w:numId="3">
+  <w:num w:numId="3" w16cid:durableId="1341392686">
     <w:abstractNumId w:val="1"/>
     <w:lvlOverride w:ilvl="0">
       <w:startOverride w:val="1"/>
     </w:lvlOverride>
   </w:num>
-  <w:num w:numId="4">
+  <w:num w:numId="4" w16cid:durableId="491414224">
     <w:abstractNumId w:val="0"/>
   </w:num>
-  <w:num w:numId="5">
+  <w:num w:numId="5" w16cid:durableId="746148974">
     <w:abstractNumId w:val="4"/>
   </w:num>
-  <w:num w:numId="6">
+  <w:num w:numId="6" w16cid:durableId="378938623">
     <w:abstractNumId w:val="1"/>
   </w:num>
-  <w:num w:numId="7">
+  <w:num w:numId="7" w16cid:durableId="566456231">
     <w:abstractNumId w:val="3"/>
   </w:num>
 </w:numbering>
 </file>
 
 <file path=word/styles.xml><?xml version="1.0" encoding="utf-8"?>
-<w:styles xmlns:mc="http://schemas.openxmlformats.org/markup-compatibility/2006" xmlns:r="http://schemas.openxmlformats.org/officeDocument/2006/relationships" xmlns:w="http://schemas.openxmlformats.org/wordprocessingml/2006/main" xmlns:w14="http://schemas.microsoft.com/office/word/2010/wordml" xmlns:w15="http://schemas.microsoft.com/office/word/2012/wordml" xmlns:w16cex="http://schemas.microsoft.com/office/word/2018/wordml/cex" xmlns:w16cid="http://schemas.microsoft.com/office/word/2016/wordml/cid" xmlns:w16="http://schemas.microsoft.com/office/word/2018/wordml" xmlns:w16sdtdh="http://schemas.microsoft.com/office/word/2020/wordml/sdtdatahash" xmlns:w16se="http://schemas.microsoft.com/office/word/2015/wordml/symex" mc:Ignorable="w14 w15 w16se w16cid w16 w16cex w16sdtdh">
+<w:styles xmlns:mc="http://schemas.openxmlformats.org/markup-compatibility/2006" xmlns:r="http://schemas.openxmlformats.org/officeDocument/2006/relationships" xmlns:w="http://schemas.openxmlformats.org/wordprocessingml/2006/main" xmlns:w14="http://schemas.microsoft.com/office/word/2010/wordml" xmlns:w15="http://schemas.microsoft.com/office/word/2012/wordml" xmlns:w16cex="http://schemas.microsoft.com/office/word/2018/wordml/cex" xmlns:w16cid="http://schemas.microsoft.com/office/word/2016/wordml/cid" xmlns:w16="http://schemas.microsoft.com/office/word/2018/wordml" xmlns:w16du="http://schemas.microsoft.com/office/word/2023/wordml/word16du" xmlns:w16sdtdh="http://schemas.microsoft.com/office/word/2020/wordml/sdtdatahash" xmlns:w16sdtfl="http://schemas.microsoft.com/office/word/2024/wordml/sdtformatlock" xmlns:w16se="http://schemas.microsoft.com/office/word/2015/wordml/symex" mc:Ignorable="w14 w15 w16se w16cid w16 w16cex w16sdtdh w16sdtfl w16du">
   <w:docDefaults>
     <w:rPrDefault>
       <w:rPr>
@@ -11033,7 +10655,6 @@
   <w:style w:type="character" w:default="1" w:styleId="DefaultParagraphFont">
     <w:name w:val="Default Paragraph Font"/>
     <w:uiPriority w:val="1"/>
-    <w:semiHidden/>
     <w:unhideWhenUsed/>
   </w:style>
   <w:style w:type="table" w:default="1" w:styleId="TableNormal">

</xml_diff>